<commit_message>
Add thesis approval and acknowledgment sections, update table of contents, and enhance document generation scripts
- Introduced "審定書" (Approval Letter) and "誌謝" (Acknowledgment) sections in the thesis draft.
- Updated the table of contents to reflect new sections and their respective page numbers.
- Modified `build_thesis_docx.py` to include new sections and ensure proper formatting in the generated DOCX file.
- Enhanced `build_thesis_pdf.py` to support raw LaTeX content for PDF generation.
</commit_message>
<xml_diff>
--- a/docs/papers/thesis/thesis_draft_zh.docx
+++ b/docs/papers/thesis/thesis_draft_zh.docx
@@ -98,6 +98,160 @@
         <w:rPr>
           <w:b/>
         </w:rPr>
+        <w:t xml:space="preserve">審定書</w:t>
+      </w:r>
+    </w:p>
+    <w:p>
+      <w:pPr>
+        <w:spacing w:before="0" w:after="0" w:line="360" w:lineRule="auto"/>
+      </w:pPr>
+      <w:r>
+        <w:t xml:space="preserve">國立彰化師範大學資訊工程學系碩士班</w:t>
+      </w:r>
+    </w:p>
+    <w:p>
+      <w:pPr>
+        <w:spacing w:before="0" w:after="0" w:line="360" w:lineRule="auto"/>
+      </w:pPr>
+      <w:r>
+        <w:t xml:space="preserve">碩士論文審定書</w:t>
+      </w:r>
+    </w:p>
+    <w:p>
+      <w:pPr>
+        <w:spacing w:before="0" w:after="0" w:line="360" w:lineRule="auto"/>
+      </w:pPr>
+      <w:r>
+        <w:t xml:space="preserve">單房間非連網家電環境影響學習之稀疏感測空間數位孪生原型</w:t>
+      </w:r>
+    </w:p>
+    <w:p>
+      <w:pPr>
+        <w:spacing w:before="0" w:after="0" w:line="360" w:lineRule="auto"/>
+      </w:pPr>
+      <w:r>
+        <w:t xml:space="preserve">研究生：林易佑</w:t>
+      </w:r>
+    </w:p>
+    <w:p>
+      <w:pPr>
+        <w:spacing w:before="0" w:after="0" w:line="360" w:lineRule="auto"/>
+      </w:pPr>
+      <w:r>
+        <w:t xml:space="preserve">本論文業經審查及口試合格，特此證明。</w:t>
+      </w:r>
+    </w:p>
+    <w:p>
+      <w:pPr>
+        <w:spacing w:before="0" w:after="0" w:line="360" w:lineRule="auto"/>
+      </w:pPr>
+      <w:r>
+        <w:t xml:space="preserve">論文考試委員會召集人：</w:t>
+      </w:r>
+    </w:p>
+    <w:p>
+      <w:pPr>
+        <w:spacing w:before="0" w:after="0" w:line="360" w:lineRule="auto"/>
+      </w:pPr>
+      <w:r>
+        <w:t xml:space="preserve">委員：</w:t>
+      </w:r>
+    </w:p>
+    <w:p>
+      <w:pPr>
+        <w:spacing w:before="0" w:after="0" w:line="360" w:lineRule="auto"/>
+      </w:pPr>
+      <w:r>
+        <w:t xml:space="preserve">委員：</w:t>
+      </w:r>
+    </w:p>
+    <w:p>
+      <w:pPr>
+        <w:spacing w:before="0" w:after="0" w:line="360" w:lineRule="auto"/>
+      </w:pPr>
+      <w:r>
+        <w:t xml:space="preserve">指導教授：易欖霸 博士</w:t>
+      </w:r>
+    </w:p>
+    <w:p>
+      <w:pPr>
+        <w:spacing w:before="0" w:after="0" w:line="360" w:lineRule="auto"/>
+      </w:pPr>
+      <w:r>
+        <w:t xml:space="preserve">所長：</w:t>
+      </w:r>
+    </w:p>
+    <w:p>
+      <w:pPr>
+        <w:spacing w:before="0" w:after="0" w:line="360" w:lineRule="auto"/>
+      </w:pPr>
+      <w:r>
+        <w:t xml:space="preserve">中華民國 115 年 月</w:t>
+      </w:r>
+    </w:p>
+    <w:p>
+      <w:r>
+        <w:br w:type="page"/>
+      </w:r>
+    </w:p>
+    <w:p>
+      <w:pPr>
+        <w:pStyle w:val="Heading1"/>
+        <w:spacing w:before="0" w:after="0" w:line="360" w:lineRule="auto"/>
+      </w:pPr>
+      <w:r>
+        <w:rPr>
+          <w:b/>
+        </w:rPr>
+        <w:t xml:space="preserve">誌謝</w:t>
+      </w:r>
+    </w:p>
+    <w:p>
+      <w:pPr>
+        <w:spacing w:before="0" w:after="0" w:line="360" w:lineRule="auto"/>
+      </w:pPr>
+      <w:r>
+        <w:t xml:space="preserve">本研究能夠完成，首先感謝指導教授易欖霸博士在研究方向、方法與寫作上的您考與支持，以及歷位口試委員的指正與建議。感謝學業上對我的幫助與歷位師長提供的學習環境。也感謝家人的支持與包容。</w:t>
+      </w:r>
+    </w:p>
+    <w:p>
+      <w:pPr>
+        <w:spacing w:before="0" w:after="0" w:line="360" w:lineRule="auto"/>
+      </w:pPr>
+      <w:r>
+        <w:t xml:space="preserve">林易佑 謹誌於</w:t>
+      </w:r>
+    </w:p>
+    <w:p>
+      <w:pPr>
+        <w:spacing w:before="0" w:after="0" w:line="360" w:lineRule="auto"/>
+      </w:pPr>
+      <w:r>
+        <w:t xml:space="preserve">國立彰化師範大學資訊工程學系（所）</w:t>
+      </w:r>
+    </w:p>
+    <w:p>
+      <w:pPr>
+        <w:spacing w:before="0" w:after="0" w:line="360" w:lineRule="auto"/>
+      </w:pPr>
+      <w:r>
+        <w:t xml:space="preserve">中華民國 115 年 4 月</w:t>
+      </w:r>
+    </w:p>
+    <w:p>
+      <w:r>
+        <w:br w:type="page"/>
+      </w:r>
+    </w:p>
+    <w:p>
+      <w:pPr>
+        <w:pStyle w:val="Heading1"/>
+        <w:spacing w:before="0" w:after="0" w:line="360" w:lineRule="auto"/>
+      </w:pPr>
+      <w:r>
+        <w:rPr>
+          <w:b/>
+        </w:rPr>
         <w:t xml:space="preserve">摘要</w:t>
       </w:r>
     </w:p>
@@ -204,63 +358,577 @@
         <w:spacing w:before="0" w:after="0" w:line="360" w:lineRule="auto"/>
       </w:pPr>
       <w:r>
-        <w:t xml:space="preserve">第一章 緒論</w:t>
-      </w:r>
-    </w:p>
-    <w:p>
-      <w:pPr>
-        <w:spacing w:before="0" w:after="0" w:line="360" w:lineRule="auto"/>
-      </w:pPr>
-      <w:r>
-        <w:t xml:space="preserve">第二章 文獻探討</w:t>
-      </w:r>
-    </w:p>
-    <w:p>
-      <w:pPr>
-        <w:spacing w:before="0" w:after="0" w:line="360" w:lineRule="auto"/>
-      </w:pPr>
-      <w:r>
-        <w:t xml:space="preserve">第三章 系統架構與數學模型</w:t>
-      </w:r>
-    </w:p>
-    <w:p>
-      <w:pPr>
-        <w:spacing w:before="0" w:after="0" w:line="360" w:lineRule="auto"/>
-      </w:pPr>
-      <w:r>
-        <w:t xml:space="preserve">第四章 系統實作與服務介面</w:t>
-      </w:r>
-    </w:p>
-    <w:p>
-      <w:pPr>
-        <w:spacing w:before="0" w:after="0" w:line="360" w:lineRule="auto"/>
-      </w:pPr>
-      <w:r>
-        <w:t xml:space="preserve">第五章 模擬案例與結果分析</w:t>
-      </w:r>
-    </w:p>
-    <w:p>
-      <w:pPr>
-        <w:spacing w:before="0" w:after="0" w:line="360" w:lineRule="auto"/>
-      </w:pPr>
-      <w:r>
-        <w:t xml:space="preserve">第六章 結論與未來工作</w:t>
-      </w:r>
-    </w:p>
-    <w:p>
-      <w:pPr>
-        <w:spacing w:before="0" w:after="0" w:line="360" w:lineRule="auto"/>
-      </w:pPr>
-      <w:r>
-        <w:t xml:space="preserve">參考文獻</w:t>
-      </w:r>
-    </w:p>
-    <w:p>
-      <w:pPr>
-        <w:spacing w:before="0" w:after="0" w:line="360" w:lineRule="auto"/>
-      </w:pPr>
-      <w:r>
-        <w:t xml:space="preserve">附錄</w:t>
+        <w:t xml:space="preserve">摘要……I</w:t>
+      </w:r>
+    </w:p>
+    <w:p>
+      <w:pPr>
+        <w:spacing w:before="0" w:after="0" w:line="360" w:lineRule="auto"/>
+      </w:pPr>
+      <w:r>
+        <w:t xml:space="preserve">Abstract……II</w:t>
+      </w:r>
+    </w:p>
+    <w:p>
+      <w:pPr>
+        <w:spacing w:before="0" w:after="0" w:line="360" w:lineRule="auto"/>
+      </w:pPr>
+      <w:r>
+        <w:t xml:space="preserve">誌謝……III</w:t>
+      </w:r>
+    </w:p>
+    <w:p>
+      <w:pPr>
+        <w:spacing w:before="0" w:after="0" w:line="360" w:lineRule="auto"/>
+      </w:pPr>
+      <w:r>
+        <w:t xml:space="preserve">目錄……IV</w:t>
+      </w:r>
+    </w:p>
+    <w:p>
+      <w:pPr>
+        <w:spacing w:before="0" w:after="0" w:line="360" w:lineRule="auto"/>
+      </w:pPr>
+      <w:r>
+        <w:t xml:space="preserve">表目錄……V</w:t>
+      </w:r>
+    </w:p>
+    <w:p>
+      <w:pPr>
+        <w:spacing w:before="0" w:after="0" w:line="360" w:lineRule="auto"/>
+      </w:pPr>
+      <w:r>
+        <w:t xml:space="preserve">圖目錄……VI</w:t>
+      </w:r>
+    </w:p>
+    <w:p>
+      <w:pPr>
+        <w:spacing w:before="0" w:after="0" w:line="360" w:lineRule="auto"/>
+      </w:pPr>
+      <w:r>
+        <w:t xml:space="preserve">第一章 緒論…… 1</w:t>
+      </w:r>
+    </w:p>
+    <w:p>
+      <w:pPr>
+        <w:spacing w:before="0" w:after="0" w:line="360" w:lineRule="auto"/>
+      </w:pPr>
+      <w:r>
+        <w:t xml:space="preserve">  1.1 研究背景…… 1</w:t>
+      </w:r>
+    </w:p>
+    <w:p>
+      <w:pPr>
+        <w:spacing w:before="0" w:after="0" w:line="360" w:lineRule="auto"/>
+      </w:pPr>
+      <w:r>
+        <w:t xml:space="preserve">  1.2 研究動機…… 1</w:t>
+      </w:r>
+    </w:p>
+    <w:p>
+      <w:pPr>
+        <w:spacing w:before="0" w:after="0" w:line="360" w:lineRule="auto"/>
+      </w:pPr>
+      <w:r>
+        <w:t xml:space="preserve">  1.3 研究問題…… 2</w:t>
+      </w:r>
+    </w:p>
+    <w:p>
+      <w:pPr>
+        <w:spacing w:before="0" w:after="0" w:line="360" w:lineRule="auto"/>
+      </w:pPr>
+      <w:r>
+        <w:t xml:space="preserve">  1.4 研究範圍與限制…… 2</w:t>
+      </w:r>
+    </w:p>
+    <w:p>
+      <w:pPr>
+        <w:spacing w:before="0" w:after="0" w:line="360" w:lineRule="auto"/>
+      </w:pPr>
+      <w:r>
+        <w:t xml:space="preserve">  1.5 預期貢獻…… 2</w:t>
+      </w:r>
+    </w:p>
+    <w:p>
+      <w:pPr>
+        <w:spacing w:before="0" w:after="0" w:line="360" w:lineRule="auto"/>
+      </w:pPr>
+      <w:r>
+        <w:t xml:space="preserve">第二章 文獻探討…… 3</w:t>
+      </w:r>
+    </w:p>
+    <w:p>
+      <w:pPr>
+        <w:spacing w:before="0" w:after="0" w:line="360" w:lineRule="auto"/>
+      </w:pPr>
+      <w:r>
+        <w:t xml:space="preserve">  2.1 室內環境建模…… 3</w:t>
+      </w:r>
+    </w:p>
+    <w:p>
+      <w:pPr>
+        <w:spacing w:before="0" w:after="0" w:line="360" w:lineRule="auto"/>
+      </w:pPr>
+      <w:r>
+        <w:t xml:space="preserve">  2.2 空間插値與場估計…… 3</w:t>
+      </w:r>
+    </w:p>
+    <w:p>
+      <w:pPr>
+        <w:spacing w:before="0" w:after="0" w:line="360" w:lineRule="auto"/>
+      </w:pPr>
+      <w:r>
+        <w:t xml:space="preserve">  2.3 數位孪生與智慧建築…… 3</w:t>
+      </w:r>
+    </w:p>
+    <w:p>
+      <w:pPr>
+        <w:spacing w:before="0" w:after="0" w:line="360" w:lineRule="auto"/>
+      </w:pPr>
+      <w:r>
+        <w:t xml:space="preserve">  2.4 房間尺度室內因子實驗研究…… 4</w:t>
+      </w:r>
+    </w:p>
+    <w:p>
+      <w:pPr>
+        <w:spacing w:before="0" w:after="0" w:line="360" w:lineRule="auto"/>
+      </w:pPr>
+      <w:r>
+        <w:t xml:space="preserve">  2.5 非連網裝置影響學習…… 4</w:t>
+      </w:r>
+    </w:p>
+    <w:p>
+      <w:pPr>
+        <w:spacing w:before="0" w:after="0" w:line="360" w:lineRule="auto"/>
+      </w:pPr>
+      <w:r>
+        <w:t xml:space="preserve">  2.6 MCP 與 AI Agent Tool Interface…… 5</w:t>
+      </w:r>
+    </w:p>
+    <w:p>
+      <w:pPr>
+        <w:spacing w:before="0" w:after="0" w:line="360" w:lineRule="auto"/>
+      </w:pPr>
+      <w:r>
+        <w:t xml:space="preserve">  2.7 與相似研究之差異定位…… 5</w:t>
+      </w:r>
+    </w:p>
+    <w:p>
+      <w:pPr>
+        <w:spacing w:before="0" w:after="0" w:line="360" w:lineRule="auto"/>
+      </w:pPr>
+      <w:r>
+        <w:t xml:space="preserve">  2.8 公開資料與訓練資料適用性…… 6</w:t>
+      </w:r>
+    </w:p>
+    <w:p>
+      <w:pPr>
+        <w:spacing w:before="0" w:after="0" w:line="360" w:lineRule="auto"/>
+      </w:pPr>
+      <w:r>
+        <w:t xml:space="preserve">第三章 系統架構與數學模型…… 7</w:t>
+      </w:r>
+    </w:p>
+    <w:p>
+      <w:pPr>
+        <w:spacing w:before="0" w:after="0" w:line="360" w:lineRule="auto"/>
+      </w:pPr>
+      <w:r>
+        <w:t xml:space="preserve">  3.1 系統架構…… 7</w:t>
+      </w:r>
+    </w:p>
+    <w:p>
+      <w:pPr>
+        <w:spacing w:before="0" w:after="0" w:line="360" w:lineRule="auto"/>
+      </w:pPr>
+      <w:r>
+        <w:t xml:space="preserve">  3.2 房間、區域與感測器設定…… 7</w:t>
+      </w:r>
+    </w:p>
+    <w:p>
+      <w:pPr>
+        <w:spacing w:before="0" w:after="0" w:line="360" w:lineRule="auto"/>
+      </w:pPr>
+      <w:r>
+        <w:t xml:space="preserve">  3.3 三因子場模型…… 8</w:t>
+      </w:r>
+    </w:p>
+    <w:p>
+      <w:pPr>
+        <w:spacing w:before="0" w:after="0" w:line="360" w:lineRule="auto"/>
+      </w:pPr>
+      <w:r>
+        <w:t xml:space="preserve">  3.4 設備影響函數…… 8</w:t>
+      </w:r>
+    </w:p>
+    <w:p>
+      <w:pPr>
+        <w:spacing w:before="0" w:after="0" w:line="360" w:lineRule="auto"/>
+      </w:pPr>
+      <w:r>
+        <w:t xml:space="preserve">  3.5 感測器校正模型…… 9</w:t>
+      </w:r>
+    </w:p>
+    <w:p>
+      <w:pPr>
+        <w:spacing w:before="0" w:after="0" w:line="360" w:lineRule="auto"/>
+      </w:pPr>
+      <w:r>
+        <w:t xml:space="preserve">  3.6 非連網裝置影響學習…… 9</w:t>
+      </w:r>
+    </w:p>
+    <w:p>
+      <w:pPr>
+        <w:spacing w:before="0" w:after="0" w:line="360" w:lineRule="auto"/>
+      </w:pPr>
+      <w:r>
+        <w:t xml:space="preserve">  3.7 訓練資料組裝流程…… 9</w:t>
+      </w:r>
+    </w:p>
+    <w:p>
+      <w:pPr>
+        <w:spacing w:before="0" w:after="0" w:line="360" w:lineRule="auto"/>
+      </w:pPr>
+      <w:r>
+        <w:t xml:space="preserve">  3.8 Hybrid Residual Neural Network 延伸…… 10</w:t>
+      </w:r>
+    </w:p>
+    <w:p>
+      <w:pPr>
+        <w:spacing w:before="0" w:after="0" w:line="360" w:lineRule="auto"/>
+      </w:pPr>
+      <w:r>
+        <w:t xml:space="preserve">  3.9 控制動作排序…… 10</w:t>
+      </w:r>
+    </w:p>
+    <w:p>
+      <w:pPr>
+        <w:spacing w:before="0" w:after="0" w:line="360" w:lineRule="auto"/>
+      </w:pPr>
+      <w:r>
+        <w:t xml:space="preserve">第四章 系統實作與服務介面…… 11</w:t>
+      </w:r>
+    </w:p>
+    <w:p>
+      <w:pPr>
+        <w:spacing w:before="0" w:after="0" w:line="360" w:lineRule="auto"/>
+      </w:pPr>
+      <w:r>
+        <w:t xml:space="preserve">  4.1 Python 原型…… 11</w:t>
+      </w:r>
+    </w:p>
+    <w:p>
+      <w:pPr>
+        <w:spacing w:before="0" w:after="0" w:line="360" w:lineRule="auto"/>
+      </w:pPr>
+      <w:r>
+        <w:t xml:space="preserve">  4.2 MCP Tools…… 11</w:t>
+      </w:r>
+    </w:p>
+    <w:p>
+      <w:pPr>
+        <w:spacing w:before="0" w:after="0" w:line="360" w:lineRule="auto"/>
+      </w:pPr>
+      <w:r>
+        <w:t xml:space="preserve">  4.3 Gemma/Ollama Bridge…… 12</w:t>
+      </w:r>
+    </w:p>
+    <w:p>
+      <w:pPr>
+        <w:spacing w:before="0" w:after="0" w:line="360" w:lineRule="auto"/>
+      </w:pPr>
+      <w:r>
+        <w:t xml:space="preserve">  4.4 Web Demo…… 12</w:t>
+      </w:r>
+    </w:p>
+    <w:p>
+      <w:pPr>
+        <w:spacing w:before="0" w:after="0" w:line="360" w:lineRule="auto"/>
+      </w:pPr>
+      <w:r>
+        <w:t xml:space="preserve">第五章 模擬案例與結果分析…… 13</w:t>
+      </w:r>
+    </w:p>
+    <w:p>
+      <w:pPr>
+        <w:spacing w:before="0" w:after="0" w:line="360" w:lineRule="auto"/>
+      </w:pPr>
+      <w:r>
+        <w:t xml:space="preserve">  5.1 標準情境設定…… 13</w:t>
+      </w:r>
+    </w:p>
+    <w:p>
+      <w:pPr>
+        <w:spacing w:before="0" w:after="0" w:line="360" w:lineRule="auto"/>
+      </w:pPr>
+      <w:r>
+        <w:t xml:space="preserve">  5.2 場重建誤差…… 13</w:t>
+      </w:r>
+    </w:p>
+    <w:p>
+      <w:pPr>
+        <w:spacing w:before="0" w:after="0" w:line="360" w:lineRule="auto"/>
+      </w:pPr>
+      <w:r>
+        <w:t xml:space="preserve">  5.3 IDW Baseline 比較…… 14</w:t>
+      </w:r>
+    </w:p>
+    <w:p>
+      <w:pPr>
+        <w:spacing w:before="0" w:after="0" w:line="360" w:lineRule="auto"/>
+      </w:pPr>
+      <w:r>
+        <w:t xml:space="preserve">  5.4 非連網裝置影響學習…… 14</w:t>
+      </w:r>
+    </w:p>
+    <w:p>
+      <w:pPr>
+        <w:spacing w:before="0" w:after="0" w:line="360" w:lineRule="auto"/>
+      </w:pPr>
+      <w:r>
+        <w:t xml:space="preserve">  5.5 窗戸時段、天氣、季節矩陣與直接輸入…… 14</w:t>
+      </w:r>
+    </w:p>
+    <w:p>
+      <w:pPr>
+        <w:spacing w:before="0" w:after="0" w:line="360" w:lineRule="auto"/>
+      </w:pPr>
+      <w:r>
+        <w:t xml:space="preserve">  5.6 Hybrid Residual Neural Network 結果…… 14</w:t>
+      </w:r>
+    </w:p>
+    <w:p>
+      <w:pPr>
+        <w:spacing w:before="0" w:after="0" w:line="360" w:lineRule="auto"/>
+      </w:pPr>
+      <w:r>
+        <w:t xml:space="preserve">  5.7 公開資料集 Task-Aligned Benchmark 結果…… 15</w:t>
+      </w:r>
+    </w:p>
+    <w:p>
+      <w:pPr>
+        <w:spacing w:before="0" w:after="0" w:line="360" w:lineRule="auto"/>
+      </w:pPr>
+      <w:r>
+        <w:t xml:space="preserve">  5.8 研究過程與實作挑戰…… 18</w:t>
+      </w:r>
+    </w:p>
+    <w:p>
+      <w:pPr>
+        <w:spacing w:before="0" w:after="0" w:line="360" w:lineRule="auto"/>
+      </w:pPr>
+      <w:r>
+        <w:t xml:space="preserve">  5.9 可旋轉 3D 展示…… 18</w:t>
+      </w:r>
+    </w:p>
+    <w:p>
+      <w:pPr>
+        <w:spacing w:before="0" w:after="0" w:line="360" w:lineRule="auto"/>
+      </w:pPr>
+      <w:r>
+        <w:t xml:space="preserve">第六章 結論與未來工作…… 19</w:t>
+      </w:r>
+    </w:p>
+    <w:p>
+      <w:pPr>
+        <w:spacing w:before="0" w:after="0" w:line="360" w:lineRule="auto"/>
+      </w:pPr>
+      <w:r>
+        <w:t xml:space="preserve">  6.1 結論…… 19</w:t>
+      </w:r>
+    </w:p>
+    <w:p>
+      <w:pPr>
+        <w:spacing w:before="0" w:after="0" w:line="360" w:lineRule="auto"/>
+      </w:pPr>
+      <w:r>
+        <w:t xml:space="preserve">  6.2 研究限制…… 19</w:t>
+      </w:r>
+    </w:p>
+    <w:p>
+      <w:pPr>
+        <w:spacing w:before="0" w:after="0" w:line="360" w:lineRule="auto"/>
+      </w:pPr>
+      <w:r>
+        <w:t xml:space="preserve">  6.3 未來工作…… 19</w:t>
+      </w:r>
+    </w:p>
+    <w:p>
+      <w:pPr>
+        <w:spacing w:before="0" w:after="0" w:line="360" w:lineRule="auto"/>
+      </w:pPr>
+      <w:r>
+        <w:t xml:space="preserve">參考文獻…… 20</w:t>
+      </w:r>
+    </w:p>
+    <w:p>
+      <w:pPr>
+        <w:spacing w:before="0" w:after="0" w:line="360" w:lineRule="auto"/>
+      </w:pPr>
+      <w:r>
+        <w:t xml:space="preserve">附錄…… 22</w:t>
+      </w:r>
+    </w:p>
+    <w:p>
+      <w:r>
+        <w:br w:type="page"/>
+      </w:r>
+    </w:p>
+    <w:p>
+      <w:pPr>
+        <w:pStyle w:val="Heading1"/>
+        <w:spacing w:before="0" w:after="0" w:line="360" w:lineRule="auto"/>
+      </w:pPr>
+      <w:r>
+        <w:rPr>
+          <w:b/>
+        </w:rPr>
+        <w:t xml:space="preserve">表目錄</w:t>
+      </w:r>
+    </w:p>
+    <w:p>
+      <w:pPr>
+        <w:spacing w:before="0" w:after="0" w:line="360" w:lineRule="auto"/>
+      </w:pPr>
+      <w:r>
+        <w:t xml:space="preserve">表 2-1 相似研究差異比較…… 5</w:t>
+      </w:r>
+    </w:p>
+    <w:p>
+      <w:pPr>
+        <w:spacing w:before="0" w:after="0" w:line="360" w:lineRule="auto"/>
+      </w:pPr>
+      <w:r>
+        <w:t xml:space="preserve">表 2-2 公開資料集概覽與適用性…… 6</w:t>
+      </w:r>
+    </w:p>
+    <w:p>
+      <w:pPr>
+        <w:spacing w:before="0" w:after="0" w:line="360" w:lineRule="auto"/>
+      </w:pPr>
+      <w:r>
+        <w:t xml:space="preserve">表 2-3 Task-aligned benchmark 設計…… 6</w:t>
+      </w:r>
+    </w:p>
+    <w:p>
+      <w:pPr>
+        <w:spacing w:before="0" w:after="0" w:line="360" w:lineRule="auto"/>
+      </w:pPr>
+      <w:r>
+        <w:t xml:space="preserve">表 3-1 房間與感測器設定…… 7</w:t>
+      </w:r>
+    </w:p>
+    <w:p>
+      <w:pPr>
+        <w:spacing w:before="0" w:after="0" w:line="360" w:lineRule="auto"/>
+      </w:pPr>
+      <w:r>
+        <w:t xml:space="preserve">表 3-2 訓練資料表格說明…… 9</w:t>
+      </w:r>
+    </w:p>
+    <w:p>
+      <w:pPr>
+        <w:spacing w:before="0" w:after="0" w:line="360" w:lineRule="auto"/>
+      </w:pPr>
+      <w:r>
+        <w:t xml:space="preserve">表 4-1 核心模組一覽…… 11</w:t>
+      </w:r>
+    </w:p>
+    <w:p>
+      <w:pPr>
+        <w:spacing w:before="0" w:after="0" w:line="360" w:lineRule="auto"/>
+      </w:pPr>
+      <w:r>
+        <w:t xml:space="preserve">表 5-1 標準情境結果摘要…… 13</w:t>
+      </w:r>
+    </w:p>
+    <w:p>
+      <w:pPr>
+        <w:spacing w:before="0" w:after="0" w:line="360" w:lineRule="auto"/>
+      </w:pPr>
+      <w:r>
+        <w:t xml:space="preserve">表 5-2 窗戸矩陣情境節選…… 14</w:t>
+      </w:r>
+    </w:p>
+    <w:p>
+      <w:pPr>
+        <w:spacing w:before="0" w:after="0" w:line="360" w:lineRule="auto"/>
+      </w:pPr>
+      <w:r>
+        <w:t xml:space="preserve">表 5-3 Benchmark 層級設計…… 15</w:t>
+      </w:r>
+    </w:p>
+    <w:p>
+      <w:pPr>
+        <w:spacing w:before="0" w:after="0" w:line="360" w:lineRule="auto"/>
+      </w:pPr>
+      <w:r>
+        <w:t xml:space="preserve">表 5-4 SML2010 Benchmark 結果…… 15</w:t>
+      </w:r>
+    </w:p>
+    <w:p>
+      <w:pPr>
+        <w:spacing w:before="0" w:after="0" w:line="360" w:lineRule="auto"/>
+      </w:pPr>
+      <w:r>
+        <w:t xml:space="preserve">表 5-5 CU-BEMS Benchmark 結果…… 17</w:t>
+      </w:r>
+    </w:p>
+    <w:p>
+      <w:r>
+        <w:br w:type="page"/>
+      </w:r>
+    </w:p>
+    <w:p>
+      <w:pPr>
+        <w:pStyle w:val="Heading1"/>
+        <w:spacing w:before="0" w:after="0" w:line="360" w:lineRule="auto"/>
+      </w:pPr>
+      <w:r>
+        <w:rPr>
+          <w:b/>
+        </w:rPr>
+        <w:t xml:space="preserve">圖目錄</w:t>
+      </w:r>
+    </w:p>
+    <w:p>
+      <w:pPr>
+        <w:spacing w:before="0" w:after="0" w:line="360" w:lineRule="auto"/>
+      </w:pPr>
+      <w:r>
+        <w:t xml:space="preserve">圖 3-1 系統整體分層架構…… 7</w:t>
+      </w:r>
+    </w:p>
+    <w:p>
+      <w:pPr>
+        <w:spacing w:before="0" w:after="0" w:line="360" w:lineRule="auto"/>
+      </w:pPr>
+      <w:r>
+        <w:t xml:space="preserve">圖 3-2 主要執行資料流…… 7</w:t>
+      </w:r>
+    </w:p>
+    <w:p>
+      <w:pPr>
+        <w:spacing w:before="0" w:after="0" w:line="360" w:lineRule="auto"/>
+      </w:pPr>
+      <w:r>
+        <w:t xml:space="preserve">圖 3-3 房間感測器與目標區域配置…… 8</w:t>
+      </w:r>
+    </w:p>
+    <w:p>
+      <w:pPr>
+        <w:spacing w:before="0" w:after="0" w:line="360" w:lineRule="auto"/>
+      </w:pPr>
+      <w:r>
+        <w:t xml:space="preserve">圖 3-4 感測器校正與影響學習流程…… 9</w:t>
+      </w:r>
+    </w:p>
+    <w:p>
+      <w:pPr>
+        <w:spacing w:before="0" w:after="0" w:line="360" w:lineRule="auto"/>
+      </w:pPr>
+      <w:r>
+        <w:t xml:space="preserve">圖 5-1 驗證與實驗流程…… 13</w:t>
       </w:r>
     </w:p>
     <w:p>
@@ -409,7 +1077,7 @@
         <w:spacing w:before="0" w:after="0" w:line="360" w:lineRule="auto"/>
       </w:pPr>
       <w:r>
-        <w:t xml:space="preserve">• RQ3：學習後的裝置影響模型是否能提升對三個環境變數的控制決策，例如選擇開冷氣、開窗或開燈？</w:t>
+        <w:t xml:space="preserve">• RQ3：學習後的裝置影響模型，是否能依三因子偏差輸出候選控制動作排序，例如選擇開冷氣、開窗或開燈？</w:t>
       </w:r>
     </w:p>
     <w:p>
@@ -1420,14 +2088,6 @@
       </w:pPr>
       <w:r>
         <w:t xml:space="preserve">因此，本研究目前採取的資料策略是：以可控制的模擬情境作為主要訓練與驗證來源，以公開資料集作為外部合理性檢查與未來真實資料接軌的準備。具體而言，若要替本研究的 hybrid residual neural network 增加真實資料，現階段最有價值的是 CU-BEMS、SML2010 與住宅 IEQ 類資料；若要補強舒適度控制目標的依據，則 ASHRAE Global Thermal Comfort Database II 比較適合作為外部參考。</w:t>
-      </w:r>
-    </w:p>
-    <w:p>
-      <w:pPr>
-        <w:spacing w:before="0" w:after="0" w:line="360" w:lineRule="auto"/>
-      </w:pPr>
-      <w:r>
-        <w:t xml:space="preserve">若希望讓不同方法在同一資料集上進行對比，較可行的作法不是要求所有方法都重建完整單房間 3D 空間場，而是採用 shared-task benchmark，也就是在相同資料集上只比較共同可觀測、共同可輸出的子任務。換言之，比較的單位應從「整個系統是否完全同構」改為「在同一份資料上，哪些輸入、哪些輸出、哪些評估指標是所有方法都能公平處理的」。在此原則下，本研究模型可以退化為 dataset-compatible mode：當資料集只有 zone-level 序列時，就比較區域平均值預測；當資料集只有兩個室內量測點時，就比較點位響應；當資料集缺少裝置狀態時，則只比較 background dynamics 或 comfort scoring，而不宣稱完成完整場重建。</w:t>
       </w:r>
     </w:p>
     <w:p>
@@ -3007,7 +3667,7 @@
         <w:spacing w:before="0" w:after="0" w:line="360" w:lineRule="auto"/>
       </w:pPr>
       <w:r>
-        <w:t xml:space="preserve">本研究將座標、時間、室內外環境條件、主模型估計值、設備 activation、設備 power 與 influence envelope 作為輸入特徵，分別為溫度、濕度與照度訓練三個小型殘差網路。若啟用頻域去噪，temperature 與 humidity 會先將 R_v* 沿短時間軌跡做 Fourier low-pass denoising，再送入 MLP 訓練；illuminance 則保留原始 residual target。此設計的目的在於保留主模型可解釋性，同時以資料驅動方式修正其剩餘誤差。</w:t>
+        <w:t xml:space="preserve">本研究將座標、時間、室內外環境條件、主模型估計值、設備 activation、設備 power 與 influence envelope 作為輸入特徵，分別為溫度、濕度與照度訓練三個小型殘差網路。若啟用頻域去噪，temperature 與 humidity 會先將 $R_v^*$ 沿短時間軌跡做 Fourier low-pass denoising，再送入 MLP 訓練；illuminance 則保留原始 residual target。此設計的目的在於保留主模型可解釋性，同時以資料驅動方式修正其剩餘誤差。</w:t>
       </w:r>
     </w:p>
     <w:p>
@@ -4422,15 +5082,15 @@
         <w:spacing w:before="0" w:after="0" w:line="360" w:lineRule="auto"/>
       </w:pPr>
       <w:r>
-        <w:t xml:space="preserve">在目前預設的 held-out 測試設定下，hybrid residual neural network 以 6 個情境作為訓練資料，並以 `light_only` 與 `all_active` 作為測試情境。若對 temperature 與 humidity residual trace 啟用 Fourier low-pass denoising，並保留 illuminance 原始 residual，則 hybrid residual correction 套用於主模型輸出後，field MAE 可由 temperature `0.0474`、humidity `0.1764`、illuminance `2.3295`，分別降至 `0.0026`、`0.0040` 與 `0.1752`。對應改善比例約為溫度 `94.51%`、濕度 `97.73%` 與照度 `92.48%`。</w:t>
-      </w:r>
-    </w:p>
-    <w:p>
-      <w:pPr>
-        <w:spacing w:before="0" w:after="0" w:line="360" w:lineRule="auto"/>
-      </w:pPr>
-      <w:r>
-        <w:t xml:space="preserve">若與加入反射近似前的 direct-only 照度路徑相比，held-out illuminance 的主模型 MAE 由 `2.3727` 降至 `2.3295`，而 hybrid 後的 illuminance MAE 由 `0.2357` 進一步降至 `0.1752`。這表示較乾淨的 base optical approximation 可先降低結構性照度偏差，再讓 residual network 更集中地學習剩餘誤差；而頻域低通則較適合作為慢變 thermal / humidity residual 的前處理，而非對所有環境因子一體適用。不過此結果仍建立於模擬資料與既定情境分割下，未來仍需以真實量測資料重新訓練與驗證。</w:t>
+        <w:t xml:space="preserve">在目前預設的 held-out 測試設定下，hybrid residual neural network 以 6 個情境作為訓練資料，並以 light\_only 與 all\_active 作為測試情境（與 5.2 節的 8 組全集平均為不同子集）。若對 temperature 與 humidity residual trace 啟用 Fourier low-pass denoising，並保留 illuminance 原始 residual，則 hybrid residual correction 套用於主模型輸出後，field MAE 可由 temperature 0.0474、humidity 0.1764、illuminance 2.3295，分別降至 0.0026、0.0040 與 0.1752。對應改善比例約為溫度 94.51%、濕度 97.73% 與照度 92.48%。</w:t>
+      </w:r>
+    </w:p>
+    <w:p>
+      <w:pPr>
+        <w:spacing w:before="0" w:after="0" w:line="360" w:lineRule="auto"/>
+      </w:pPr>
+      <w:r>
+        <w:t xml:space="preserve">若與加入反射近似前的 direct-only 照度路徑相比，held-out illuminance 的主模型 MAE 由 2.3727 降至 2.3295，而 hybrid 後的 illuminance MAE 由 0.2357 進一步降至 0.1752。這表示較乾淨的 base optical approximation 可先降低結構性照度偏差，再讓 residual network 更集中地學習剩餘誤差；而頻域低通則較適合作為慢變 thermal / humidity residual 的前處理，而非對所有環境因子一體適用。不過此結果仍建立於模擬資料與既定情境分割下，未來仍需以真實量測資料重新訓練與驗證。</w:t>
       </w:r>
     </w:p>
     <w:p>

</xml_diff>

<commit_message>
Refactor system architecture diagrams and thesis draft with enhanced clarity and additional figures
- Updated system architecture diagrams in `system_architecture_diagrams_zh.md` for improved flow and readability, including adjustments to node spacing and layout.
- Added new figures to the thesis draft in `thesis_draft_zh.md`, illustrating temperature and illuminance fields under various scenarios, enhancing visual representation of results.
- Revised table of contents in `build_thesis_docx.py` to reflect new figures and updated table entries, ensuring accurate navigation and referencing.
- Improved descriptions and context for figures and tables to provide clearer insights into the experimental results and methodologies.
</commit_message>
<xml_diff>
--- a/docs/papers/thesis/thesis_draft_zh.docx
+++ b/docs/papers/thesis/thesis_draft_zh.docx
@@ -929,6 +929,54 @@
       </w:pPr>
       <w:r>
         <w:t xml:space="preserve">圖 5-1 驗證與實驗流程…… 13</w:t>
+      </w:r>
+    </w:p>
+    <w:p>
+      <w:pPr>
+        <w:spacing w:before="0" w:after="0" w:line="360" w:lineRule="auto"/>
+      </w:pPr>
+      <w:r>
+        <w:t xml:space="preserve">圖 5-2 三裝置同時作用溫度場 3D 點雲（all_active）…… 13</w:t>
+      </w:r>
+    </w:p>
+    <w:p>
+      <w:pPr>
+        <w:spacing w:before="0" w:after="0" w:line="360" w:lineRule="auto"/>
+      </w:pPr>
+      <w:r>
+        <w:t xml:space="preserve">圖 5-3 僅冷氣作用溫度場 3D 點雲（ac_only）…… 14</w:t>
+      </w:r>
+    </w:p>
+    <w:p>
+      <w:pPr>
+        <w:spacing w:before="0" w:after="0" w:line="360" w:lineRule="auto"/>
+      </w:pPr>
+      <w:r>
+        <w:t xml:space="preserve">圖 5-4 僅燈具作用照度場 3D 點雲（light_only）…… 14</w:t>
+      </w:r>
+    </w:p>
+    <w:p>
+      <w:pPr>
+        <w:spacing w:before="0" w:after="0" w:line="360" w:lineRule="auto"/>
+      </w:pPr>
+      <w:r>
+        <w:t xml:space="preserve">圖 5-5 三裝置全開溫度場 3D 點雲（5.9 節）…… 18</w:t>
+      </w:r>
+    </w:p>
+    <w:p>
+      <w:pPr>
+        <w:spacing w:before="0" w:after="0" w:line="360" w:lineRule="auto"/>
+      </w:pPr>
+      <w:r>
+        <w:t xml:space="preserve">圖 5-6 僅開窗溫度場 3D 點雲（window_only）…… 18</w:t>
+      </w:r>
+    </w:p>
+    <w:p>
+      <w:pPr>
+        <w:spacing w:before="0" w:after="0" w:line="360" w:lineRule="auto"/>
+      </w:pPr>
+      <w:r>
+        <w:t xml:space="preserve">圖 5-7 僅燈具照度場 3D 點雲（light_only，5.9 節）…… 18</w:t>
       </w:r>
     </w:p>
     <w:p>
@@ -2624,7 +2672,7 @@
       <w:r>
         <w:drawing>
           <wp:inline distT="0" distB="0" distL="0" distR="0">
-            <wp:extent cx="5303520" cy="5303520"/>
+            <wp:extent cx="5943600" cy="5943600"/>
             <wp:docPr id="2" name="圖 3-2 主要執行資料流。此圖對應一次 scenario 評估如何從輸入設定、場估計、校正、到 dashboard 與 MCP 輸出。"/>
             <wp:cNvGraphicFramePr>
               <a:graphicFrameLocks noChangeAspect="1"/>
@@ -2645,7 +2693,7 @@
                   <pic:spPr>
                     <a:xfrm>
                       <a:off x="0" y="0"/>
-                      <a:ext cx="5303520" cy="5303520"/>
+                      <a:ext cx="5943600" cy="5943600"/>
                     </a:xfrm>
                     <a:prstGeom prst="rect">
                       <a:avLst/>
@@ -2910,7 +2958,7 @@
       <w:r>
         <w:drawing>
           <wp:inline distT="0" distB="0" distL="0" distR="0">
-            <wp:extent cx="5303520" cy="5303520"/>
+            <wp:extent cx="5943600" cy="5943600"/>
             <wp:docPr id="3" name="圖 3-3 房間感測器與目標區域配置。8 顆角落感測器、3 個主要區域與 3 個核心裝置共同構成單房間數位孿生的標準拓樸。"/>
             <wp:cNvGraphicFramePr>
               <a:graphicFrameLocks noChangeAspect="1"/>
@@ -2931,7 +2979,7 @@
                   <pic:spPr>
                     <a:xfrm>
                       <a:off x="0" y="0"/>
-                      <a:ext cx="5303520" cy="5303520"/>
+                      <a:ext cx="5943600" cy="5943600"/>
                     </a:xfrm>
                     <a:prstGeom prst="rect">
                       <a:avLst/>
@@ -4704,6 +4752,162 @@
     </w:p>
     <w:p>
       <w:pPr>
+        <w:jc w:val="center"/>
+        <w:spacing w:after="120" w:line="360" w:lineRule="auto"/>
+      </w:pPr>
+      <w:r>
+        <w:drawing>
+          <wp:inline distT="0" distB="0" distL="0" distR="0">
+            <wp:extent cx="5303520" cy="5303520"/>
+            <wp:docPr id="6" name="圖 5-2 三裝置同時作用（all\_active）之溫度場 3D 點雲視觀圖。每點為一個 16×12×6 網格樣本，顏色由藍綠（低溫）至橙紅（高溫）映射溫度分布。冷氣區域明顯偏藍，靠窗與靠燈區域則居溫度中高端。"/>
+            <wp:cNvGraphicFramePr>
+              <a:graphicFrameLocks noChangeAspect="1"/>
+            </wp:cNvGraphicFramePr>
+            <a:graphic>
+              <a:graphicData uri="http://schemas.openxmlformats.org/drawingml/2006/picture">
+                <pic:pic>
+                  <pic:nvPicPr>
+                    <pic:cNvPr id="6" name="圖 5-2 三裝置同時作用（all\_active）之溫度場 3D 點雲視觀圖。每點為一個 16×12×6 網格樣本，顏色由藍綠（低溫）至橙紅（高溫）映射溫度分布。冷氣區域明顯偏藍，靠窗與靠燈區域則居溫度中高端。"/>
+                    <pic:cNvPicPr/>
+                  </pic:nvPicPr>
+                  <pic:blipFill>
+                    <a:blip r:embed="rId6"/>
+                    <a:stretch>
+                      <a:fillRect/>
+                    </a:stretch>
+                  </pic:blipFill>
+                  <pic:spPr>
+                    <a:xfrm>
+                      <a:off x="0" y="0"/>
+                      <a:ext cx="5303520" cy="5303520"/>
+                    </a:xfrm>
+                    <a:prstGeom prst="rect">
+                      <a:avLst/>
+                    </a:prstGeom>
+                  </pic:spPr>
+                </pic:pic>
+              </a:graphicData>
+            </a:graphic>
+          </wp:inline>
+        </w:drawing>
+      </w:r>
+    </w:p>
+    <w:p>
+      <w:pPr>
+        <w:jc w:val="center"/>
+        <w:ind w:firstLine="0"/>
+        <w:spacing w:before="0" w:after="0" w:line="360" w:lineRule="auto"/>
+      </w:pPr>
+      <w:r>
+        <w:t xml:space="preserve">圖 5-2 三裝置同時作用（all\_active）之溫度場 3D 點雲視觀圖。每點為一個 16×12×6 網格樣本，顏色由藍綠（低溫）至橙紅（高溫）映射溫度分布。冷氣區域明顯偏藍，靠窗與靠燈區域則居溫度中高端。</w:t>
+      </w:r>
+    </w:p>
+    <w:p>
+      <w:pPr>
+        <w:jc w:val="center"/>
+        <w:spacing w:after="120" w:line="360" w:lineRule="auto"/>
+      </w:pPr>
+      <w:r>
+        <w:drawing>
+          <wp:inline distT="0" distB="0" distL="0" distR="0">
+            <wp:extent cx="5303520" cy="5303520"/>
+            <wp:docPr id="7" name="圖 5-3 僅冷氣作用（ac\_only）之溫度場 3D 點雲視觀圖。冷氣氣流影響區域（後牆靠所側）溫度明顯下降，距冷氣較遠的靠窗區域溫度相對較高，展示 bulk + local field 模型對全室平均與局部梯度的同時建模能力。"/>
+            <wp:cNvGraphicFramePr>
+              <a:graphicFrameLocks noChangeAspect="1"/>
+            </wp:cNvGraphicFramePr>
+            <a:graphic>
+              <a:graphicData uri="http://schemas.openxmlformats.org/drawingml/2006/picture">
+                <pic:pic>
+                  <pic:nvPicPr>
+                    <pic:cNvPr id="7" name="圖 5-3 僅冷氣作用（ac\_only）之溫度場 3D 點雲視觀圖。冷氣氣流影響區域（後牆靠所側）溫度明顯下降，距冷氣較遠的靠窗區域溫度相對較高，展示 bulk + local field 模型對全室平均與局部梯度的同時建模能力。"/>
+                    <pic:cNvPicPr/>
+                  </pic:nvPicPr>
+                  <pic:blipFill>
+                    <a:blip r:embed="rId7"/>
+                    <a:stretch>
+                      <a:fillRect/>
+                    </a:stretch>
+                  </pic:blipFill>
+                  <pic:spPr>
+                    <a:xfrm>
+                      <a:off x="0" y="0"/>
+                      <a:ext cx="5303520" cy="5303520"/>
+                    </a:xfrm>
+                    <a:prstGeom prst="rect">
+                      <a:avLst/>
+                    </a:prstGeom>
+                  </pic:spPr>
+                </pic:pic>
+              </a:graphicData>
+            </a:graphic>
+          </wp:inline>
+        </w:drawing>
+      </w:r>
+    </w:p>
+    <w:p>
+      <w:pPr>
+        <w:jc w:val="center"/>
+        <w:ind w:firstLine="0"/>
+        <w:spacing w:before="0" w:after="0" w:line="360" w:lineRule="auto"/>
+      </w:pPr>
+      <w:r>
+        <w:t xml:space="preserve">圖 5-3 僅冷氣作用（ac\_only）之溫度場 3D 點雲視觀圖。冷氣氣流影響區域（後牆靠所側）溫度明顯下降，距冷氣較遠的靠窗區域溫度相對較高，展示 bulk + local field 模型對全室平均與局部梯度的同時建模能力。</w:t>
+      </w:r>
+    </w:p>
+    <w:p>
+      <w:pPr>
+        <w:jc w:val="center"/>
+        <w:spacing w:after="120" w:line="360" w:lineRule="auto"/>
+      </w:pPr>
+      <w:r>
+        <w:drawing>
+          <wp:inline distT="0" distB="0" distL="0" distR="0">
+            <wp:extent cx="5303520" cy="5303520"/>
+            <wp:docPr id="8" name="圖 5-4 僅燈具作用（light\_only）之照度場 3D 點雲視觀圖。燈具正下方的測點照度最高（黃橙色），底層四角與遠端則由間接反射賦予少量回填亮度，顏色實現正確的照度衰減樣態。"/>
+            <wp:cNvGraphicFramePr>
+              <a:graphicFrameLocks noChangeAspect="1"/>
+            </wp:cNvGraphicFramePr>
+            <a:graphic>
+              <a:graphicData uri="http://schemas.openxmlformats.org/drawingml/2006/picture">
+                <pic:pic>
+                  <pic:nvPicPr>
+                    <pic:cNvPr id="8" name="圖 5-4 僅燈具作用（light\_only）之照度場 3D 點雲視觀圖。燈具正下方的測點照度最高（黃橙色），底層四角與遠端則由間接反射賦予少量回填亮度，顏色實現正確的照度衰減樣態。"/>
+                    <pic:cNvPicPr/>
+                  </pic:nvPicPr>
+                  <pic:blipFill>
+                    <a:blip r:embed="rId8"/>
+                    <a:stretch>
+                      <a:fillRect/>
+                    </a:stretch>
+                  </pic:blipFill>
+                  <pic:spPr>
+                    <a:xfrm>
+                      <a:off x="0" y="0"/>
+                      <a:ext cx="5303520" cy="5303520"/>
+                    </a:xfrm>
+                    <a:prstGeom prst="rect">
+                      <a:avLst/>
+                    </a:prstGeom>
+                  </pic:spPr>
+                </pic:pic>
+              </a:graphicData>
+            </a:graphic>
+          </wp:inline>
+        </w:drawing>
+      </w:r>
+    </w:p>
+    <w:p>
+      <w:pPr>
+        <w:jc w:val="center"/>
+        <w:ind w:firstLine="0"/>
+        <w:spacing w:before="0" w:after="0" w:line="360" w:lineRule="auto"/>
+      </w:pPr>
+      <w:r>
+        <w:t xml:space="preserve">圖 5-4 僅燈具作用（light\_only）之照度場 3D 點雲視觀圖。燈具正下方的測點照度最高（黃橙色），底層四角與遠端則由間接反射賦予少量回填亮度，顏色實現正確的照度衰減樣態。</w:t>
+      </w:r>
+    </w:p>
+    <w:p>
+      <w:pPr>
         <w:pStyle w:val="Heading2"/>
         <w:spacing w:before="0" w:after="0" w:line="360" w:lineRule="auto"/>
       </w:pPr>
@@ -9699,7 +9903,163 @@
         <w:spacing w:before="0" w:after="0" w:line="360" w:lineRule="auto"/>
       </w:pPr>
       <w:r>
-        <w:t xml:space="preserve">Web demo 提供可旋轉 3D 預覽，使使用者可直接觀察三因子點雲、房間框線與設備幾何位置。冷氣以牆面橫條表示，窗戶以牆面矩形表示，照明以點狀標記表示。此展示有助於口試或公開展示時說明模型如何從設備位置與環境場估計區域影響。</w:t>
+        <w:t xml:space="preserve">Web demo 提供可旋轉 3D 預覽，使使用者可直接觀察三因子點雲、房間框線與設備幾何位置。冷氣以牆面橫條表示，窗戶以牆面矩形表示，照明以點狀標記表示。圖 5-5 至 5-7 為靜態輸出之三因子場 3D 點雲，展示三種代表情境：三裝置全開、單獨窗戶、單獨燈具。此展示有助於口試或公開展示時說明模型如何從設備位置與環境場估計區域影響。</w:t>
+      </w:r>
+    </w:p>
+    <w:p>
+      <w:pPr>
+        <w:jc w:val="center"/>
+        <w:spacing w:after="120" w:line="360" w:lineRule="auto"/>
+      </w:pPr>
+      <w:r>
+        <w:drawing>
+          <wp:inline distT="0" distB="0" distL="0" distR="0">
+            <wp:extent cx="5303520" cy="5303520"/>
+            <wp:docPr id="9" name="圖 5-5 三裝置同時作用（all\_active）溫度場 3D 點雲。顏色由藍綠至橙紅對映 26.02–27.16 °C 範圍；設備位置用帶邊框的標記表示。"/>
+            <wp:cNvGraphicFramePr>
+              <a:graphicFrameLocks noChangeAspect="1"/>
+            </wp:cNvGraphicFramePr>
+            <a:graphic>
+              <a:graphicData uri="http://schemas.openxmlformats.org/drawingml/2006/picture">
+                <pic:pic>
+                  <pic:nvPicPr>
+                    <pic:cNvPr id="9" name="圖 5-5 三裝置同時作用（all\_active）溫度場 3D 點雲。顏色由藍綠至橙紅對映 26.02–27.16 °C 範圍；設備位置用帶邊框的標記表示。"/>
+                    <pic:cNvPicPr/>
+                  </pic:nvPicPr>
+                  <pic:blipFill>
+                    <a:blip r:embed="rId9"/>
+                    <a:stretch>
+                      <a:fillRect/>
+                    </a:stretch>
+                  </pic:blipFill>
+                  <pic:spPr>
+                    <a:xfrm>
+                      <a:off x="0" y="0"/>
+                      <a:ext cx="5303520" cy="5303520"/>
+                    </a:xfrm>
+                    <a:prstGeom prst="rect">
+                      <a:avLst/>
+                    </a:prstGeom>
+                  </pic:spPr>
+                </pic:pic>
+              </a:graphicData>
+            </a:graphic>
+          </wp:inline>
+        </w:drawing>
+      </w:r>
+    </w:p>
+    <w:p>
+      <w:pPr>
+        <w:jc w:val="center"/>
+        <w:ind w:firstLine="0"/>
+        <w:spacing w:before="0" w:after="0" w:line="360" w:lineRule="auto"/>
+      </w:pPr>
+      <w:r>
+        <w:t xml:space="preserve">圖 5-5 三裝置同時作用（all\_active）溫度場 3D 點雲。顏色由藍綠至橙紅對映 26.02–27.16 °C 範圍；設備位置用帶邊框的標記表示。</w:t>
+      </w:r>
+    </w:p>
+    <w:p>
+      <w:pPr>
+        <w:jc w:val="center"/>
+        <w:spacing w:after="120" w:line="360" w:lineRule="auto"/>
+      </w:pPr>
+      <w:r>
+        <w:drawing>
+          <wp:inline distT="0" distB="0" distL="0" distR="0">
+            <wp:extent cx="5303520" cy="5303520"/>
+            <wp:docPr id="10" name="圖 5-6 僅開窗（window\_only）溫度場 3D 點雲。靠窗區域溫度最高，造成區域溫度梯度。可與 all\_active 情境對比，觀察冷氣相抑後的溫度減診效果。"/>
+            <wp:cNvGraphicFramePr>
+              <a:graphicFrameLocks noChangeAspect="1"/>
+            </wp:cNvGraphicFramePr>
+            <a:graphic>
+              <a:graphicData uri="http://schemas.openxmlformats.org/drawingml/2006/picture">
+                <pic:pic>
+                  <pic:nvPicPr>
+                    <pic:cNvPr id="10" name="圖 5-6 僅開窗（window\_only）溫度場 3D 點雲。靠窗區域溫度最高，造成區域溫度梯度。可與 all\_active 情境對比，觀察冷氣相抑後的溫度減診效果。"/>
+                    <pic:cNvPicPr/>
+                  </pic:nvPicPr>
+                  <pic:blipFill>
+                    <a:blip r:embed="rId10"/>
+                    <a:stretch>
+                      <a:fillRect/>
+                    </a:stretch>
+                  </pic:blipFill>
+                  <pic:spPr>
+                    <a:xfrm>
+                      <a:off x="0" y="0"/>
+                      <a:ext cx="5303520" cy="5303520"/>
+                    </a:xfrm>
+                    <a:prstGeom prst="rect">
+                      <a:avLst/>
+                    </a:prstGeom>
+                  </pic:spPr>
+                </pic:pic>
+              </a:graphicData>
+            </a:graphic>
+          </wp:inline>
+        </w:drawing>
+      </w:r>
+    </w:p>
+    <w:p>
+      <w:pPr>
+        <w:jc w:val="center"/>
+        <w:ind w:firstLine="0"/>
+        <w:spacing w:before="0" w:after="0" w:line="360" w:lineRule="auto"/>
+      </w:pPr>
+      <w:r>
+        <w:t xml:space="preserve">圖 5-6 僅開窗（window\_only）溫度場 3D 點雲。靠窗區域溫度最高，造成區域溫度梯度。可與 all\_active 情境對比，觀察冷氣相抑後的溫度減診效果。</w:t>
+      </w:r>
+    </w:p>
+    <w:p>
+      <w:pPr>
+        <w:jc w:val="center"/>
+        <w:spacing w:after="120" w:line="360" w:lineRule="auto"/>
+      </w:pPr>
+      <w:r>
+        <w:drawing>
+          <wp:inline distT="0" distB="0" distL="0" distR="0">
+            <wp:extent cx="5303520" cy="5303520"/>
+            <wp:docPr id="11" name="圖 5-7 僅燈具作用（light\_only）照度場 3D 點雲。燈具正下方照度最高，遠端補有單的 single-bounce diffuse 回填；此情境也是 5.6 節 held-out 測試集之一。"/>
+            <wp:cNvGraphicFramePr>
+              <a:graphicFrameLocks noChangeAspect="1"/>
+            </wp:cNvGraphicFramePr>
+            <a:graphic>
+              <a:graphicData uri="http://schemas.openxmlformats.org/drawingml/2006/picture">
+                <pic:pic>
+                  <pic:nvPicPr>
+                    <pic:cNvPr id="11" name="圖 5-7 僅燈具作用（light\_only）照度場 3D 點雲。燈具正下方照度最高，遠端補有單的 single-bounce diffuse 回填；此情境也是 5.6 節 held-out 測試集之一。"/>
+                    <pic:cNvPicPr/>
+                  </pic:nvPicPr>
+                  <pic:blipFill>
+                    <a:blip r:embed="rId11"/>
+                    <a:stretch>
+                      <a:fillRect/>
+                    </a:stretch>
+                  </pic:blipFill>
+                  <pic:spPr>
+                    <a:xfrm>
+                      <a:off x="0" y="0"/>
+                      <a:ext cx="5303520" cy="5303520"/>
+                    </a:xfrm>
+                    <a:prstGeom prst="rect">
+                      <a:avLst/>
+                    </a:prstGeom>
+                  </pic:spPr>
+                </pic:pic>
+              </a:graphicData>
+            </a:graphic>
+          </wp:inline>
+        </w:drawing>
+      </w:r>
+    </w:p>
+    <w:p>
+      <w:pPr>
+        <w:jc w:val="center"/>
+        <w:ind w:firstLine="0"/>
+        <w:spacing w:before="0" w:after="0" w:line="360" w:lineRule="auto"/>
+      </w:pPr>
+      <w:r>
+        <w:t xml:space="preserve">圖 5-7 僅燈具作用（light\_only）照度場 3D 點雲。燈具正下方照度最高，遠端補有單的 single-bounce diffuse 回填；此情境也是 5.6 節 held-out 測試集之一。</w:t>
       </w:r>
     </w:p>
     <w:p>

</xml_diff>

<commit_message>
Refactor thesis document generation scripts
- Updated `build_thesis_docx.py` to enhance content clarity and structure, including improved paragraph descriptions and keyword listings.
- Adjusted `build_thesis_pdf.py` to modify column width for better layout.
- Revised `build_thesis_pptx.py` to refine presentation content, ensuring clarity in validation processes and results, and improved bullet point organization for better readability.
</commit_message>
<xml_diff>
--- a/docs/papers/thesis/thesis_draft_zh.docx
+++ b/docs/papers/thesis/thesis_draft_zh.docx
@@ -284,7 +284,7 @@
         <w:spacing w:before="0" w:after="0" w:line="360" w:lineRule="auto"/>
       </w:pPr>
       <w:r>
-        <w:t xml:space="preserve">除空間場估計外，本研究亦建立裝置啟用前後感測資料之影響學習流程，透過最小平方法估計非連網裝置的環境影響係數，並根據目標區域的舒適度偏差輸出候選控制動作排序。為補足 direct source + obstruction 對照度間接回填亮度的低估，本研究另在 illuminance 路徑加入 lightweight single-bounce diffuse reflection 近似，以地板、天花板、牆面與啟用中的家具表面作為次級反射面。為提升系統可存取性，本研究另提供本地服務介面，其中包含 MCP server 與 web demo，作為同一套模型能力的工具化存取層。評估方面，本研究以 8 組標準情境、48 組窗戶矩陣、IDW baseline 比較、synthetic ablation、hybrid residual leave-one-scenario-out 測試，以及 7 天真實臥室快照比較驗證方法可行性；其中 base model 在標準情境下之平均 MAE 分別為溫度 0.0474、濕度 0.1765 與照度 2.0835，明顯低於 IDW baseline 的 0.1723、0.4633 與 75.0516。加入 Fourier low-pass denoising 的 hybrid residual correction 在預設 6/2 held-out split 中可將 field MAE 降至溫度 0.0023、濕度 0.0041 與照度 0.1675；8-fold leave-one-scenario-out 平均則為 0.0017、0.0055 與 0.1581。真實臥室快照驗證中，校正後 pillow 位置 MAE 由 0.8967°C、4.1286% 與 358.6392 lux 降至 0.1676°C、0.3939% 與 21.3753 lux。推薦動作目前定位為基於校正模型的反事實模擬排序；若要驗證其實際因果改善效果，需進一步執行 before/after 介入實驗。</w:t>
+        <w:t xml:space="preserve">除空間場估計外，本研究亦建立裝置啟用前後感測資料之影響學習流程，透過最小平方法估計非連網裝置的環境影響係數，並根據目標區域的舒適度偏差輸出候選控制動作排序。為補足 direct source + obstruction 對照度間接回填亮度的低估，本研究另在 illuminance 路徑加入 lightweight single-bounce diffuse reflection 近似，以地板、天花板、牆面與啟用中的家具表面作為次級反射面。為提升系統可存取性，本研究另提供本地服務介面，其中包含 MCP server 與 web demo，作為同一套模型能力的工具化存取層。評估方面，本研究採分層證據設計：以 8 組標準情境、48 組窗戶矩陣、IDW baseline 比較、synthetic ablation 與 hybrid residual leave-one-scenario-out 測試支持受控條件下的完整場重建主張；以公開資料集 task-aligned benchmark 檢查外部資料相容子任務；以 7 天真實臥室快照檢查稀疏感測校正對未參與校正點位的改善。其中 base model 在標準情境下之平均 MAE 分別為溫度 0.0474、濕度 0.1765 與照度 2.0835，明顯低於 IDW baseline 的 0.1723、0.4633 與 75.0516。加入 Fourier low-pass denoising 的 hybrid residual correction 在預設 6/2 held-out split 中可將 field MAE 降至溫度 0.0023、濕度 0.0041 與照度 0.1675；8-fold leave-one-scenario-out 平均則為 0.0017、0.0055 與 0.1581。真實臥室快照驗證中，校正後 pillow 位置 MAE 由 0.8967°C、4.1286% 與 358.6392 lux 降至 0.1676°C、0.3939% 與 21.3753 lux。推薦動作目前定位為基於校正模型的反事實模擬排序；若要驗證其實際因果改善效果，需進一步執行 before/after 介入實驗。</w:t>
       </w:r>
     </w:p>
     <w:p>
@@ -333,7 +333,7 @@
         <w:spacing w:before="0" w:after="0" w:line="360" w:lineRule="auto"/>
       </w:pPr>
       <w:r>
-        <w:t xml:space="preserve">The prototype is implemented in Python and exposed through a local service layer, including an MCP interface and a rotatable web demo, enabling interactive scenario queries, point-level estimation, baseline comparison, appliance-impact learning, and a 48-case window simulation matrix across time of day, weather, and season. A lightweight one-bounce diffuse reflection approximation is further added to the illuminance path so that floors, walls, ceilings, and active furniture surfaces can contribute indirect fill light without requiring full optical rendering. Across the canonical scenarios, the base model achieves average MAE of 0.0474 for temperature, 0.1765 for humidity, and 2.0835 for illuminance, compared with 0.1723, 0.4633, and 75.0516 for IDW. The hybrid residual layer with Fourier low-pass denoising on temperature and humidity residual traces further reduces default held-out field MAE to 0.0023, 0.0041, and 0.1675, while leave-one-scenario-out evaluation averages 0.0017, 0.0055, and 0.1581, respectively. A preliminary seven-day real-bedroom snapshot validation reduces pillow-point MAE from 0.8967, 4.1286, and 358.6392 to 0.1676, 0.3939, and 21.3753 for temperature, humidity, and illuminance. Action recommendations are treated as model-based counterfactual rankings; causal validation of recommendation efficacy requires a before/after intervention protocol. These results indicate that sparse corner sensing can still support an interpretable and trainable indoor twin when model structure, calibration, and learning are assigned to different layers.</w:t>
+        <w:t xml:space="preserve">The prototype is implemented in Python and exposed through a local service layer, including an MCP interface and a rotatable web demo, enabling interactive scenario queries, point-level estimation, baseline comparison, appliance-impact learning, and a 48-case window simulation matrix across time of day, weather, and season. A lightweight one-bounce diffuse reflection approximation is further added to the illuminance path so that floors, walls, ceilings, and active furniture surfaces can contribute indirect fill light without requiring full optical rendering. The evaluation separates controlled full-field evidence, public task-aligned comparisons, and real sparse-calibration checks. Across the canonical scenarios, the base model achieves average MAE of 0.0474 for temperature, 0.1765 for humidity, and 2.0835 for illuminance, compared with 0.1723, 0.4633, and 75.0516 for IDW. The hybrid residual layer with Fourier low-pass denoising on temperature and humidity residual traces further reduces default held-out field MAE to 0.0023, 0.0041, and 0.1675, while leave-one-scenario-out evaluation averages 0.0017, 0.0055, and 0.1581, respectively. A preliminary seven-day real-bedroom snapshot validation reduces pillow-point MAE from 0.8967, 4.1286, and 358.6392 to 0.1676, 0.3939, and 21.3753 for temperature, humidity, and illuminance. Action recommendations are treated as model-based counterfactual rankings; causal validation of recommendation efficacy requires a before/after intervention protocol. These results indicate that sparse corner sensing can still support an interpretable and trainable indoor twin when model structure, calibration, and learning are assigned to different layers.</w:t>
       </w:r>
     </w:p>
     <w:p>
@@ -887,15 +887,15 @@
         <w:spacing w:before="0" w:after="0" w:line="360" w:lineRule="auto"/>
       </w:pPr>
       <w:r>
-        <w:t xml:space="preserve">表 5-4 Hybrid residual robustness checks…… 15</w:t>
-      </w:r>
-    </w:p>
-    <w:p>
-      <w:pPr>
-        <w:spacing w:before="0" w:after="0" w:line="360" w:lineRule="auto"/>
-      </w:pPr>
-      <w:r>
-        <w:t xml:space="preserve">表 5-5 窗戶矩陣情境節選…… 15</w:t>
+        <w:t xml:space="preserve">表 5-4 窗戶矩陣情境節選…… 15</w:t>
+      </w:r>
+    </w:p>
+    <w:p>
+      <w:pPr>
+        <w:spacing w:before="0" w:after="0" w:line="360" w:lineRule="auto"/>
+      </w:pPr>
+      <w:r>
+        <w:t xml:space="preserve">表 5-5 Hybrid residual robustness checks…… 15</w:t>
       </w:r>
     </w:p>
     <w:p>
@@ -919,15 +919,15 @@
         <w:spacing w:before="0" w:after="0" w:line="360" w:lineRule="auto"/>
       </w:pPr>
       <w:r>
-        <w:t xml:space="preserve">表 5-7 SML2010 Benchmark 結果…… 17</w:t>
-      </w:r>
-    </w:p>
-    <w:p>
-      <w:pPr>
-        <w:spacing w:before="0" w:after="0" w:line="360" w:lineRule="auto"/>
-      </w:pPr>
-      <w:r>
-        <w:t xml:space="preserve">表 5-8 CU-BEMS Benchmark 結果…… 18</w:t>
+        <w:t xml:space="preserve">表 5-8 SML2010 Benchmark 結果…… 17</w:t>
+      </w:r>
+    </w:p>
+    <w:p>
+      <w:pPr>
+        <w:spacing w:before="0" w:after="0" w:line="360" w:lineRule="auto"/>
+      </w:pPr>
+      <w:r>
+        <w:t xml:space="preserve">表 5-9 CU-BEMS Benchmark 結果…… 18</w:t>
       </w:r>
     </w:p>
     <w:p>
@@ -1321,7 +1321,7 @@
         <w:spacing w:before="0" w:after="0" w:line="360" w:lineRule="auto"/>
       </w:pPr>
       <w:r>
-        <w:t xml:space="preserve">• 提出可對接 MCP、Web demo 與公開資料集 task-aligned benchmark 的研究原型與評估框架。</w:t>
+        <w:t xml:space="preserve">• 提出可對接 MCP、Web demo 與公開資料集 task-aligned benchmark 的研究原型與評估框架，並明確區分 synthetic full-field、real sparse calibration、public task-aligned benchmark 與 intervention validation 各自支援的主張範圍。</w:t>
       </w:r>
     </w:p>
     <w:p>
@@ -3663,7 +3663,7 @@
         <w:spacing w:before="0" w:after="0" w:line="360" w:lineRule="auto"/>
       </w:pPr>
       <w:r>
-        <w:t xml:space="preserve">\boldsymbol{\varphi}_i = [x_i,\, y_i,\, z_i,\, t_i,\, \text{indoor baseline},\, \text{outdoor conditions},\, F_{\text{temp}},\, F_{\text{hum}},\, F_{\text{illum}},\, \text{device activations},\, \text{device powers},\, \text{influence envelopes}]</w:t>
+        <w:t xml:space="preserve">\begin{aligned}\boldsymbol{\varphi}_i = [&amp;x_i,\, y_i,\, z_i,\, t_i,\, \text{indoor baseline},\, \text{outdoor conditions},\\&amp;F_{\text{temp}},\, F_{\text{hum}},\, F_{\text{illum}},\, \text{device activations},\\&amp;\text{device powers},\, \text{influence envelopes}]\end{aligned}</w:t>
       </w:r>
     </w:p>
     <w:p>
@@ -4317,6 +4317,14 @@
       </w:pPr>
       <w:r>
         <w:t xml:space="preserve">表 5-1 的最佳推薦表示在目前 comfort target 與模型估測下，哪一個候選動作具有最高預測改善量。此表用來檢查推薦模組是否能依情境輸出合理排序，但仍屬模擬與反事實評估；若要宣稱推薦動作在真實房間中有效，需依 5.8 節所述介入式驗證方法量測實際改善量。</w:t>
+      </w:r>
+    </w:p>
+    <w:p>
+      <w:pPr>
+        <w:spacing w:before="0" w:after="0" w:line="360" w:lineRule="auto"/>
+      </w:pPr>
+      <w:r>
+        <w:t xml:space="preserve">為避免將不同資料來源支持的主張混在一起，本章採用分層驗證邏輯。8 組標準情境、消融實驗與 leave-one-scenario-out hybrid residual 測試用於驗證受控條件下的完整 3D 場重建與模型元件貢獻；48 組窗戶矩陣用於檢查外部邊界條件敏感度；bedroom_01 真實快照用於檢查稀疏感測校正是否能改善未參與校正的 pillow 參考點；SML2010 與 CU-BEMS 僅作 public task-aligned benchmark，用於外部資料的相容子任務比較。換言之，synthetic benchmark 回答「完整場是否能在受控真值下重建」，真實快照回答「校正管線是否能吸收真實觀測並改善保留點」，公開資料集回答「模型在相容任務上的外部定位」，推薦介入實驗才回答「建議動作是否真的造成舒適度改善」。</w:t>
       </w:r>
     </w:p>
     <w:p>
@@ -6446,6 +6454,14 @@
         <w:t xml:space="preserve">除列舉矩陣外，系統亦支援窗戶 direct input 模式。使用者可直接提供外部溫度、外部濕度、外部日照照度、開窗比例，以及可選的室內基準溫濕度。此模式適合接入即時天氣資料、手動量測資料或使用者指定條件，不必先將外部條件離散化為季節、天氣與時段分類。</w:t>
       </w:r>
     </w:p>
+    <w:p>
+      <w:pPr>
+        <w:spacing w:before="0" w:after="0" w:line="360" w:lineRule="auto"/>
+      </w:pPr>
+      <w:r>
+        <w:t xml:space="preserve">表 5-4 列出窗戶矩陣中的三個代表情境。</w:t>
+      </w:r>
+    </w:p>
     <w:tbl>
       <w:tblPr>
         <w:tblBorders>
@@ -6774,7 +6790,7 @@
         <w:spacing w:before="0" w:after="0" w:line="360" w:lineRule="auto"/>
       </w:pPr>
       <w:r>
-        <w:t xml:space="preserve">表 5-4 彙整預設切分、no-Fourier 對照與 LOO cross-validation。圖 5-5 則將 IDW、base model 與 LOO hybrid 的平均 field MAE 以 log-scale 顯示，避免照度量級過大而掩蓋溫度與濕度差異。</w:t>
+        <w:t xml:space="preserve">表 5-5 彙整預設切分、no-Fourier 對照與 LOO cross-validation。圖 5-5 則將 IDW、base model 與 LOO hybrid 的平均 field MAE 以 log-scale 顯示，避免照度量級過大而掩蓋溫度與濕度差異。</w:t>
       </w:r>
     </w:p>
     <w:tbl>
@@ -7606,7 +7622,7 @@
         <w:spacing w:before="0" w:after="0" w:line="360" w:lineRule="auto"/>
       </w:pPr>
       <w:r>
-        <w:t xml:space="preserve">此資料仍屬小型初步驗證：它提供真實 sparse observations 與單一 pillow reference point，但沒有完整 dense spatial ground truth。因此，本研究仍以 synthetic benchmark 報告 full-field MAE，以真實臥室快照驗證 calibration pipeline 的實用性，兩者分別回答不同層級的問題。</w:t>
+        <w:t xml:space="preserve">此資料仍屬小型初步驗證：它提供真實 sparse observations 與單一 pillow reference point，但沒有完整 dense spatial ground truth。因此，本研究仍以 synthetic benchmark 報告 full-field MAE，以真實臥室快照驗證 calibration pipeline 的實用性，兩者分別回答不同層級的問題。此限制也意味著 hybrid residual 在標準情境 family 內的漂亮降幅，應被解讀為結構性殘差可學習性的證據，而不是對任意房間、任意家具配置或任意天氣序列的無條件泛化保證。</w:t>
       </w:r>
     </w:p>
     <w:p>
@@ -7937,7 +7953,7 @@
         <w:spacing w:before="0" w:after="0" w:line="360" w:lineRule="auto"/>
       </w:pPr>
       <w:r>
-        <w:t xml:space="preserve">表 5-7 列出 SML2010 benchmark 各任務三項指標的完整對比。</w:t>
+        <w:t xml:space="preserve">表 5-8 列出 SML2010 benchmark 各任務三項指標的完整對比。</w:t>
       </w:r>
     </w:p>
     <w:tbl>
@@ -10582,7 +10598,7 @@
         <w:spacing w:before="0" w:after="0" w:line="360" w:lineRule="auto"/>
       </w:pPr>
       <w:r>
-        <w:t xml:space="preserve">表 5-8 列出 CU-BEMS benchmark 各任務三項指標的完整對比。</w:t>
+        <w:t xml:space="preserve">表 5-9 列出 CU-BEMS benchmark 各任務三項指標的完整對比。</w:t>
       </w:r>
     </w:p>
     <w:tbl>
@@ -12735,7 +12751,7 @@
         <w:spacing w:before="0" w:after="0" w:line="360" w:lineRule="auto"/>
       </w:pPr>
       <w:r>
-        <w:t xml:space="preserve">另一項結論是，公開資料集並非不能使用，而是必須依資料本身支援的任務層級進行比較。對完整 3D 場重建，本研究目前仍以 canonical synthetic benchmark 作為主要依據；對 zone-level 響應、兩點時序響應與舒適度評分，則可分別利用相容的公開資料建立 task-aligned benchmark。此作法比直接宣稱所有資料集都能完整驗證本研究系統更嚴謹。</w:t>
+        <w:t xml:space="preserve">另一項結論是，公開資料集並非不能使用，而是必須依資料本身支援的任務層級進行比較。對完整 3D 場重建，本研究目前仍以 canonical synthetic benchmark 作為主要依據；對 zone-level 響應、兩點時序響應與舒適度評分，則可分別利用相容的公開資料建立 task-aligned benchmark。此作法比直接宣稱所有資料集都能完整驗證本研究系統更嚴謹，也使本研究在投稿 IEEE Digital Twin 類場域時，能清楚說明模型、資料與互動工具各自提供的證據層級。</w:t>
       </w:r>
     </w:p>
     <w:p>
@@ -12773,6 +12789,15 @@
       </w:pPr>
       <w:r>
         <w:t xml:space="preserve">• 目前已加入小型真實臥室快照驗證，但仍缺乏長期連續部署資料與 dense spatial ground truth。</w:t>
+      </w:r>
+    </w:p>
+    <w:p>
+      <w:pPr>
+        <w:ind w:left="720" w:hanging="360" w:firstLine="0"/>
+        <w:spacing w:before="0" w:after="0" w:line="360" w:lineRule="auto"/>
+      </w:pPr>
+      <w:r>
+        <w:t xml:space="preserve">• Hybrid residual 的 leave-one-scenario-out 結果證明標準情境 family 內的殘差可學習，但尚未證明可直接泛化到任意房間幾何、家具配置或使用者行為。</w:t>
       </w:r>
     </w:p>
     <w:p>

</xml_diff>

<commit_message>
Add subsections for temperature, humidity, and illuminance models in thesis draft
- Updated the thesis draft in both PDF and LaTeX formats to include new subsections (3.3.1 to 3.3.4) detailing the shared symbols, temperature model, humidity model, and illuminance model.
- Modified the Markdown version of the thesis to reflect these changes in the table of contents and content structure.
- Adjusted the script for building the thesis document to ensure the new sections are included in the generated output.
</commit_message>
<xml_diff>
--- a/docs/papers/thesis/thesis_draft_zh.docx
+++ b/docs/papers/thesis/thesis_draft_zh.docx
@@ -575,6 +575,38 @@
       </w:pPr>
       <w:r>
         <w:t xml:space="preserve">  3.3 三因子場模型…… 8</w:t>
+      </w:r>
+    </w:p>
+    <w:p>
+      <w:pPr>
+        <w:spacing w:before="0" w:after="0" w:line="360" w:lineRule="auto"/>
+      </w:pPr>
+      <w:r>
+        <w:t xml:space="preserve">    3.3.1 共用符號與 Indoor Baseline…… 8</w:t>
+      </w:r>
+    </w:p>
+    <w:p>
+      <w:pPr>
+        <w:spacing w:before="0" w:after="0" w:line="360" w:lineRule="auto"/>
+      </w:pPr>
+      <w:r>
+        <w:t xml:space="preserve">    3.3.2 溫度場模型…… 8</w:t>
+      </w:r>
+    </w:p>
+    <w:p>
+      <w:pPr>
+        <w:spacing w:before="0" w:after="0" w:line="360" w:lineRule="auto"/>
+      </w:pPr>
+      <w:r>
+        <w:t xml:space="preserve">    3.3.3 濕度場模型…… 8</w:t>
+      </w:r>
+    </w:p>
+    <w:p>
+      <w:pPr>
+        <w:spacing w:before="0" w:after="0" w:line="360" w:lineRule="auto"/>
+      </w:pPr>
+      <w:r>
+        <w:t xml:space="preserve">    3.3.4 照度場模型…… 9</w:t>
       </w:r>
     </w:p>
     <w:p>
@@ -3188,6 +3220,18 @@
     </w:p>
     <w:p>
       <w:pPr>
+        <w:pStyle w:val="Heading3"/>
+        <w:spacing w:before="0" w:after="0" w:line="360" w:lineRule="auto"/>
+      </w:pPr>
+      <w:r>
+        <w:rPr>
+          <w:b/>
+        </w:rPr>
+        <w:t xml:space="preserve">3.3.1 共用符號與 Indoor Baseline</w:t>
+      </w:r>
+    </w:p>
+    <w:p>
+      <w:pPr>
         <w:spacing w:before="0" w:after="0" w:line="360" w:lineRule="auto"/>
       </w:pPr>
       <w:r>
@@ -3500,6 +3544,18 @@
     </w:tbl>
     <w:p>
       <w:pPr>
+        <w:pStyle w:val="Heading3"/>
+        <w:spacing w:before="0" w:after="0" w:line="360" w:lineRule="auto"/>
+      </w:pPr>
+      <w:r>
+        <w:rPr>
+          <w:b/>
+        </w:rPr>
+        <w:t xml:space="preserve">3.3.2 溫度場模型</w:t>
+      </w:r>
+    </w:p>
+    <w:p>
+      <w:pPr>
         <w:spacing w:before="0" w:after="0" w:line="360" w:lineRule="auto"/>
       </w:pPr>
       <w:r>
@@ -3574,6 +3630,18 @@
     </w:p>
     <w:p>
       <w:pPr>
+        <w:pStyle w:val="Heading3"/>
+        <w:spacing w:before="0" w:after="0" w:line="360" w:lineRule="auto"/>
+      </w:pPr>
+      <w:r>
+        <w:rPr>
+          <w:b/>
+        </w:rPr>
+        <w:t xml:space="preserve">3.3.3 濕度場模型</w:t>
+      </w:r>
+    </w:p>
+    <w:p>
+      <w:pPr>
         <w:spacing w:before="0" w:after="0" w:line="360" w:lineRule="auto"/>
       </w:pPr>
       <w:r>
@@ -3606,6 +3674,18 @@
       </w:pPr>
       <w:r>
         <w:t xml:space="preserve">其中 $H_0$ 為室內基準相對濕度，$H_{\mathrm{out}}$ 為室外相對濕度，$d_H$ 為除濕需求量。冷氣項為負值，表示除濕；窗戶項由 $(H_{\mathrm{out}}-H_0)$ 決定正負，表示外氣較濕時提高室內濕度，外氣較乾時降低室內濕度。此處並未主張完整求解水氣質量守恆或 psychrometric model，而是使用控制導向的低階近似，再交由角落感測器 residual 校正吸收模型偏差。</w:t>
+      </w:r>
+    </w:p>
+    <w:p>
+      <w:pPr>
+        <w:pStyle w:val="Heading3"/>
+        <w:spacing w:before="0" w:after="0" w:line="360" w:lineRule="auto"/>
+      </w:pPr>
+      <w:r>
+        <w:rPr>
+          <w:b/>
+        </w:rPr>
+        <w:t xml:space="preserve">3.3.4 照度場模型</w:t>
       </w:r>
     </w:p>
     <w:p>

</xml_diff>

<commit_message>
Enhance formula handling and presentation structure in thesis PPTX
- Expanded the criteria for identifying formula lines in the presentation.
- Introduced a comprehensive walkthrough for formulas, detailing their purpose, symbols, and limitations.
- Updated the presentation slides to reflect changes in mathematical model descriptions, emphasizing variable-specific nominal models.
- Adjusted font sizes and spacing for improved readability in slides.
- Added new sections to the outline for better clarity on formula explanations and their implications.
</commit_message>
<xml_diff>
--- a/docs/papers/thesis/thesis_draft_zh.docx
+++ b/docs/papers/thesis/thesis_draft_zh.docx
@@ -663,6 +663,14 @@
       </w:pPr>
       <w:r>
         <w:t xml:space="preserve">  3.9 控制動作排序…… 10</w:t>
+      </w:r>
+    </w:p>
+    <w:p>
+      <w:pPr>
+        <w:spacing w:before="0" w:after="0" w:line="360" w:lineRule="auto"/>
+      </w:pPr>
+      <w:r>
+        <w:t xml:space="preserve">  3.10 方法選擇理由與限制…… 10</w:t>
       </w:r>
     </w:p>
     <w:p>
@@ -4558,6 +4566,814 @@
       </w:pPr>
       <w:r>
         <w:t xml:space="preserve">comfort penalty 對每個因子使用目標值與容許範圍計算：若預測值落在容許範圍內，該因子 penalty 為 0；若超出容許範圍，則以超出量除以容許範圍後乘上對應權重。此設計避免微小偏差被過度懲罰，也使不同量綱的溫度、濕度與照度可被加總。需要注意的是，這裡的推薦排序屬於 model-based counterfactual simulation，並不等同於已完成實際控制驗證。</w:t>
+      </w:r>
+    </w:p>
+    <w:p>
+      <w:pPr>
+        <w:pStyle w:val="Heading2"/>
+        <w:spacing w:before="0" w:after="0" w:line="360" w:lineRule="auto"/>
+      </w:pPr>
+      <w:r>
+        <w:rPr>
+          <w:b/>
+        </w:rPr>
+        <w:t xml:space="preserve">3.10 方法選擇理由與限制</w:t>
+      </w:r>
+    </w:p>
+    <w:p>
+      <w:pPr>
+        <w:spacing w:before="0" w:after="0" w:line="360" w:lineRule="auto"/>
+      </w:pPr>
+      <w:r>
+        <w:t xml:space="preserve">為避免方法堆疊流於任意組合，本研究將每一個方法都對應到明確的研究需求。整體選擇邏輯是：先用可解釋的變數專屬 nominal model 描述室內溫度、濕度與照度的主要趨勢，再用稀疏感測器的 residual correction 修正房間現況，最後才以資料驅動模型處理主模型無法完整描述的剩餘誤差。表 3-5 整理各方法的使用原因、解決問題與限制。</w:t>
+      </w:r>
+    </w:p>
+    <w:tbl>
+      <w:tblPr>
+        <w:tblBorders>
+          <w:top w:val="single" w:sz="6" w:space="0" w:color="999999"/>
+          <w:left w:val="single" w:sz="6" w:space="0" w:color="999999"/>
+          <w:bottom w:val="single" w:sz="6" w:space="0" w:color="999999"/>
+          <w:right w:val="single" w:sz="6" w:space="0" w:color="999999"/>
+          <w:insideH w:val="single" w:sz="6" w:space="0" w:color="999999"/>
+          <w:insideV w:val="single" w:sz="6" w:space="0" w:color="999999"/>
+        </w:tblBorders>
+      </w:tblPr>
+      <w:tr>
+        <w:tc>
+          <w:tcPr>
+            <w:tcW w:w="2200" w:type="dxa"/>
+          </w:tcPr>
+          <w:p>
+            <w:pPr>
+              <w:spacing w:before="0" w:after="0" w:line="360" w:lineRule="auto"/>
+            </w:pPr>
+            <w:r>
+              <w:rPr>
+                <w:b/>
+              </w:rPr>
+              <w:t xml:space="preserve">方法</w:t>
+            </w:r>
+          </w:p>
+        </w:tc>
+        <w:tc>
+          <w:tcPr>
+            <w:tcW w:w="2200" w:type="dxa"/>
+          </w:tcPr>
+          <w:p>
+            <w:pPr>
+              <w:spacing w:before="0" w:after="0" w:line="360" w:lineRule="auto"/>
+            </w:pPr>
+            <w:r>
+              <w:rPr>
+                <w:b/>
+              </w:rPr>
+              <w:t xml:space="preserve">使用原因</w:t>
+            </w:r>
+          </w:p>
+        </w:tc>
+        <w:tc>
+          <w:tcPr>
+            <w:tcW w:w="2200" w:type="dxa"/>
+          </w:tcPr>
+          <w:p>
+            <w:pPr>
+              <w:spacing w:before="0" w:after="0" w:line="360" w:lineRule="auto"/>
+            </w:pPr>
+            <w:r>
+              <w:rPr>
+                <w:b/>
+              </w:rPr>
+              <w:t xml:space="preserve">解決的問題</w:t>
+            </w:r>
+          </w:p>
+        </w:tc>
+        <w:tc>
+          <w:tcPr>
+            <w:tcW w:w="2200" w:type="dxa"/>
+          </w:tcPr>
+          <w:p>
+            <w:pPr>
+              <w:spacing w:before="0" w:after="0" w:line="360" w:lineRule="auto"/>
+            </w:pPr>
+            <w:r>
+              <w:rPr>
+                <w:b/>
+              </w:rPr>
+              <w:t xml:space="preserve">限制或注意事項</w:t>
+            </w:r>
+          </w:p>
+        </w:tc>
+      </w:tr>
+      <w:tr>
+        <w:tc>
+          <w:tcPr>
+            <w:tcW w:w="2200" w:type="dxa"/>
+          </w:tcPr>
+          <w:p>
+            <w:pPr>
+              <w:spacing w:before="0" w:after="0" w:line="360" w:lineRule="auto"/>
+            </w:pPr>
+            <w:r>
+              <w:t xml:space="preserve">Indoor Baseline</w:t>
+            </w:r>
+          </w:p>
+        </w:tc>
+        <w:tc>
+          <w:tcPr>
+            <w:tcW w:w="2200" w:type="dxa"/>
+          </w:tcPr>
+          <w:p>
+            <w:pPr>
+              <w:spacing w:before="0" w:after="0" w:line="360" w:lineRule="auto"/>
+            </w:pPr>
+            <w:r>
+              <w:t xml:space="preserve">需要一個設備作用與感測器修正之前的室內起始狀態。</w:t>
+            </w:r>
+          </w:p>
+        </w:tc>
+        <w:tc>
+          <w:tcPr>
+            <w:tcW w:w="2200" w:type="dxa"/>
+          </w:tcPr>
+          <w:p>
+            <w:pPr>
+              <w:spacing w:before="0" w:after="0" w:line="360" w:lineRule="auto"/>
+            </w:pPr>
+            <w:r>
+              <w:t xml:space="preserve">將 T0、H0、L0 作為溫度、濕度與照度場的共同參考點，避免模型每次都從任意絕對值重新估計。</w:t>
+            </w:r>
+          </w:p>
+        </w:tc>
+        <w:tc>
+          <w:tcPr>
+            <w:tcW w:w="2200" w:type="dxa"/>
+          </w:tcPr>
+          <w:p>
+            <w:pPr>
+              <w:spacing w:before="0" w:after="0" w:line="360" w:lineRule="auto"/>
+            </w:pPr>
+            <w:r>
+              <w:t xml:space="preserve">若 baseline 來自預設值或使用者輸入而非實測前置資料，後續估計會帶有基準偏差；因此它不是比較方法中的 IDW 或 persistence baseline。</w:t>
+            </w:r>
+          </w:p>
+        </w:tc>
+      </w:tr>
+      <w:tr>
+        <w:tc>
+          <w:tcPr>
+            <w:tcW w:w="2200" w:type="dxa"/>
+          </w:tcPr>
+          <w:p>
+            <w:pPr>
+              <w:spacing w:before="0" w:after="0" w:line="360" w:lineRule="auto"/>
+            </w:pPr>
+            <w:r>
+              <w:t xml:space="preserve">變數專屬 nominal model</w:t>
+            </w:r>
+          </w:p>
+        </w:tc>
+        <w:tc>
+          <w:tcPr>
+            <w:tcW w:w="2200" w:type="dxa"/>
+          </w:tcPr>
+          <w:p>
+            <w:pPr>
+              <w:spacing w:before="0" w:after="0" w:line="360" w:lineRule="auto"/>
+            </w:pPr>
+            <w:r>
+              <w:t xml:space="preserve">溫度、濕度與照度的物理特性不同，不能用同一組 bulk/local 公式硬套三個變數。</w:t>
+            </w:r>
+          </w:p>
+        </w:tc>
+        <w:tc>
+          <w:tcPr>
+            <w:tcW w:w="2200" w:type="dxa"/>
+          </w:tcPr>
+          <w:p>
+            <w:pPr>
+              <w:spacing w:before="0" w:after="0" w:line="360" w:lineRule="auto"/>
+            </w:pPr>
+            <w:r>
+              <w:t xml:space="preserve">讓溫度處理熱交換與垂直梯度，濕度處理除濕與外氣交換，照度處理直射、環境光與反射。</w:t>
+            </w:r>
+          </w:p>
+        </w:tc>
+        <w:tc>
+          <w:tcPr>
+            <w:tcW w:w="2200" w:type="dxa"/>
+          </w:tcPr>
+          <w:p>
+            <w:pPr>
+              <w:spacing w:before="0" w:after="0" w:line="360" w:lineRule="auto"/>
+            </w:pPr>
+            <w:r>
+              <w:t xml:space="preserve">此模型是 reduced-order approximation，不等同於 CFD、完整濕空氣熱力模型或光線追跡。</w:t>
+            </w:r>
+          </w:p>
+        </w:tc>
+      </w:tr>
+      <w:tr>
+        <w:tc>
+          <w:tcPr>
+            <w:tcW w:w="2200" w:type="dxa"/>
+          </w:tcPr>
+          <w:p>
+            <w:pPr>
+              <w:spacing w:before="0" w:after="0" w:line="360" w:lineRule="auto"/>
+            </w:pPr>
+            <w:r>
+              <w:t xml:space="preserve">Dynamic activation</w:t>
+            </w:r>
+          </w:p>
+        </w:tc>
+        <w:tc>
+          <w:tcPr>
+            <w:tcW w:w="2200" w:type="dxa"/>
+          </w:tcPr>
+          <w:p>
+            <w:pPr>
+              <w:spacing w:before="0" w:after="0" w:line="360" w:lineRule="auto"/>
+            </w:pPr>
+            <w:r>
+              <w:t xml:space="preserve">冷氣、開窗與照明的影響不會在動作發生瞬間完全達到穩態。</w:t>
+            </w:r>
+          </w:p>
+        </w:tc>
+        <w:tc>
+          <w:tcPr>
+            <w:tcW w:w="2200" w:type="dxa"/>
+          </w:tcPr>
+          <w:p>
+            <w:pPr>
+              <w:spacing w:before="0" w:after="0" w:line="360" w:lineRule="auto"/>
+            </w:pPr>
+            <w:r>
+              <w:t xml:space="preserve">用 Aj(t)=aj(1-exp(-t/tauj)) 表示設備影響隨時間漸進，使 before/after 與短時間模擬更合理。</w:t>
+            </w:r>
+          </w:p>
+        </w:tc>
+        <w:tc>
+          <w:tcPr>
+            <w:tcW w:w="2200" w:type="dxa"/>
+          </w:tcPr>
+          <w:p>
+            <w:pPr>
+              <w:spacing w:before="0" w:after="0" w:line="360" w:lineRule="auto"/>
+            </w:pPr>
+            <w:r>
+              <w:t xml:space="preserve">需要指定或校正時間常數 tauj；若設備實際響應高度非線性，單一時間常數只能近似主要趨勢。</w:t>
+            </w:r>
+          </w:p>
+        </w:tc>
+      </w:tr>
+      <w:tr>
+        <w:tc>
+          <w:tcPr>
+            <w:tcW w:w="2200" w:type="dxa"/>
+          </w:tcPr>
+          <w:p>
+            <w:pPr>
+              <w:spacing w:before="0" w:after="0" w:line="360" w:lineRule="auto"/>
+            </w:pPr>
+            <w:r>
+              <w:t xml:space="preserve">Influence envelope</w:t>
+            </w:r>
+          </w:p>
+        </w:tc>
+        <w:tc>
+          <w:tcPr>
+            <w:tcW w:w="2200" w:type="dxa"/>
+          </w:tcPr>
+          <w:p>
+            <w:pPr>
+              <w:spacing w:before="0" w:after="0" w:line="360" w:lineRule="auto"/>
+            </w:pPr>
+            <w:r>
+              <w:t xml:space="preserve">設備效果會隨距離、方向與遮蔽而衰減，需要比全室均勻假設更細的空間描述。</w:t>
+            </w:r>
+          </w:p>
+        </w:tc>
+        <w:tc>
+          <w:tcPr>
+            <w:tcW w:w="2200" w:type="dxa"/>
+          </w:tcPr>
+          <w:p>
+            <w:pPr>
+              <w:spacing w:before="0" w:after="0" w:line="360" w:lineRule="auto"/>
+            </w:pPr>
+            <w:r>
+              <w:t xml:space="preserve">以距離衰減、方向投影與遮蔽係數描述局部作用範圍，讓冷氣出風口、窗邊與燈具附近可呈現不同影響強度。</w:t>
+            </w:r>
+          </w:p>
+        </w:tc>
+        <w:tc>
+          <w:tcPr>
+            <w:tcW w:w="2200" w:type="dxa"/>
+          </w:tcPr>
+          <w:p>
+            <w:pPr>
+              <w:spacing w:before="0" w:after="0" w:line="360" w:lineRule="auto"/>
+            </w:pPr>
+            <w:r>
+              <w:t xml:space="preserve">無法解析亂流、微尺度陰影與複雜反射；其目的在於提供可計算且可校正的低階空間先驗。</w:t>
+            </w:r>
+          </w:p>
+        </w:tc>
+      </w:tr>
+      <w:tr>
+        <w:tc>
+          <w:tcPr>
+            <w:tcW w:w="2200" w:type="dxa"/>
+          </w:tcPr>
+          <w:p>
+            <w:pPr>
+              <w:spacing w:before="0" w:after="0" w:line="360" w:lineRule="auto"/>
+            </w:pPr>
+            <w:r>
+              <w:t xml:space="preserve">Active-device power calibration</w:t>
+            </w:r>
+          </w:p>
+        </w:tc>
+        <w:tc>
+          <w:tcPr>
+            <w:tcW w:w="2200" w:type="dxa"/>
+          </w:tcPr>
+          <w:p>
+            <w:pPr>
+              <w:spacing w:before="0" w:after="0" w:line="360" w:lineRule="auto"/>
+            </w:pPr>
+            <w:r>
+              <w:t xml:space="preserve">設備預設功率與實際房間反應可能不同，需要由感測器 residual 回推修正。</w:t>
+            </w:r>
+          </w:p>
+        </w:tc>
+        <w:tc>
+          <w:tcPr>
+            <w:tcW w:w="2200" w:type="dxa"/>
+          </w:tcPr>
+          <w:p>
+            <w:pPr>
+              <w:spacing w:before="0" w:after="0" w:line="360" w:lineRule="auto"/>
+            </w:pPr>
+            <w:r>
+              <w:t xml:space="preserve">用已知啟動設備的觀測誤差調整效果強度，降低模型參數與實際場之間的落差。</w:t>
+            </w:r>
+          </w:p>
+        </w:tc>
+        <w:tc>
+          <w:tcPr>
+            <w:tcW w:w="2200" w:type="dxa"/>
+          </w:tcPr>
+          <w:p>
+            <w:pPr>
+              <w:spacing w:before="0" w:after="0" w:line="360" w:lineRule="auto"/>
+            </w:pPr>
+            <w:r>
+              <w:t xml:space="preserve">若多個設備同時啟動且影響高度共線，校正可能病態；因此需要配合事件紀錄與感測器位置檢查。</w:t>
+            </w:r>
+          </w:p>
+        </w:tc>
+      </w:tr>
+      <w:tr>
+        <w:tc>
+          <w:tcPr>
+            <w:tcW w:w="2200" w:type="dxa"/>
+          </w:tcPr>
+          <w:p>
+            <w:pPr>
+              <w:spacing w:before="0" w:after="0" w:line="360" w:lineRule="auto"/>
+            </w:pPr>
+            <w:r>
+              <w:t xml:space="preserve">Trilinear residual correction</w:t>
+            </w:r>
+          </w:p>
+        </w:tc>
+        <w:tc>
+          <w:tcPr>
+            <w:tcW w:w="2200" w:type="dxa"/>
+          </w:tcPr>
+          <w:p>
+            <w:pPr>
+              <w:spacing w:before="0" w:after="0" w:line="360" w:lineRule="auto"/>
+            </w:pPr>
+            <w:r>
+              <w:t xml:space="preserve">只有 8 個採集點時，不能聲稱完整知道全場，但可以在低階平滑假設下推估角點包圍盒內的 residual。</w:t>
+            </w:r>
+          </w:p>
+        </w:tc>
+        <w:tc>
+          <w:tcPr>
+            <w:tcW w:w="2200" w:type="dxa"/>
+          </w:tcPr>
+          <w:p>
+            <w:pPr>
+              <w:spacing w:before="0" w:after="0" w:line="360" w:lineRule="auto"/>
+            </w:pPr>
+            <w:r>
+              <w:t xml:space="preserve">用 8 點角點 residual 建立三線性修正場，使模型在感測器位置貼合觀測值，並可給出低階場的誤差界線。</w:t>
+            </w:r>
+          </w:p>
+        </w:tc>
+        <w:tc>
+          <w:tcPr>
+            <w:tcW w:w="2200" w:type="dxa"/>
+          </w:tcPr>
+          <w:p>
+            <w:pPr>
+              <w:spacing w:before="0" w:after="0" w:line="360" w:lineRule="auto"/>
+            </w:pPr>
+            <w:r>
+              <w:t xml:space="preserve">它不能證明高頻局部尖峰被重建；因此本文僅主張接近主要空間趨勢，而非完全等同真實連續場。</w:t>
+            </w:r>
+          </w:p>
+        </w:tc>
+      </w:tr>
+      <w:tr>
+        <w:tc>
+          <w:tcPr>
+            <w:tcW w:w="2200" w:type="dxa"/>
+          </w:tcPr>
+          <w:p>
+            <w:pPr>
+              <w:spacing w:before="0" w:after="0" w:line="360" w:lineRule="auto"/>
+            </w:pPr>
+            <w:r>
+              <w:t xml:space="preserve">Least-squares impact learning</w:t>
+            </w:r>
+          </w:p>
+        </w:tc>
+        <w:tc>
+          <w:tcPr>
+            <w:tcW w:w="2200" w:type="dxa"/>
+          </w:tcPr>
+          <w:p>
+            <w:pPr>
+              <w:spacing w:before="0" w:after="0" w:line="360" w:lineRule="auto"/>
+            </w:pPr>
+            <w:r>
+              <w:t xml:space="preserve">非連網裝置沒有 API 回報狀態，只能從事件前後的感測變化學習其影響。</w:t>
+            </w:r>
+          </w:p>
+        </w:tc>
+        <w:tc>
+          <w:tcPr>
+            <w:tcW w:w="2200" w:type="dxa"/>
+          </w:tcPr>
+          <w:p>
+            <w:pPr>
+              <w:spacing w:before="0" w:after="0" w:line="360" w:lineRule="auto"/>
+            </w:pPr>
+            <w:r>
+              <w:t xml:space="preserve">以 before/after delta 建立線性觀測方程，估計未知裝置對溫度、濕度與照度的方向與大小。</w:t>
+            </w:r>
+          </w:p>
+        </w:tc>
+        <w:tc>
+          <w:tcPr>
+            <w:tcW w:w="2200" w:type="dxa"/>
+          </w:tcPr>
+          <w:p>
+            <w:pPr>
+              <w:spacing w:before="0" w:after="0" w:line="360" w:lineRule="auto"/>
+            </w:pPr>
+            <w:r>
+              <w:t xml:space="preserve">需要事件可分離且雜訊受控；若多個未知動作重疊，學到的是混合效果而非單一裝置效果。</w:t>
+            </w:r>
+          </w:p>
+        </w:tc>
+      </w:tr>
+      <w:tr>
+        <w:tc>
+          <w:tcPr>
+            <w:tcW w:w="2200" w:type="dxa"/>
+          </w:tcPr>
+          <w:p>
+            <w:pPr>
+              <w:spacing w:before="0" w:after="0" w:line="360" w:lineRule="auto"/>
+            </w:pPr>
+            <w:r>
+              <w:t xml:space="preserve">One-bounce diffuse reflection</w:t>
+            </w:r>
+          </w:p>
+        </w:tc>
+        <w:tc>
+          <w:tcPr>
+            <w:tcW w:w="2200" w:type="dxa"/>
+          </w:tcPr>
+          <w:p>
+            <w:pPr>
+              <w:spacing w:before="0" w:after="0" w:line="360" w:lineRule="auto"/>
+            </w:pPr>
+            <w:r>
+              <w:t xml:space="preserve">照度若只看直射光，會低估牆面與家具反射造成的間接照明。</w:t>
+            </w:r>
+          </w:p>
+        </w:tc>
+        <w:tc>
+          <w:tcPr>
+            <w:tcW w:w="2200" w:type="dxa"/>
+          </w:tcPr>
+          <w:p>
+            <w:pPr>
+              <w:spacing w:before="0" w:after="0" w:line="360" w:lineRule="auto"/>
+            </w:pPr>
+            <w:r>
+              <w:t xml:space="preserve">用一次漫反射近似補上間接光，使窗戶與燈具之外的區域不會被估得過暗。</w:t>
+            </w:r>
+          </w:p>
+        </w:tc>
+        <w:tc>
+          <w:tcPr>
+            <w:tcW w:w="2200" w:type="dxa"/>
+          </w:tcPr>
+          <w:p>
+            <w:pPr>
+              <w:spacing w:before="0" w:after="0" w:line="360" w:lineRule="auto"/>
+            </w:pPr>
+            <w:r>
+              <w:t xml:space="preserve">此方法不是完整 radiosity 或 ray tracing；反射率與遮蔽幾何仍需以簡化參數表示。</w:t>
+            </w:r>
+          </w:p>
+        </w:tc>
+      </w:tr>
+      <w:tr>
+        <w:tc>
+          <w:tcPr>
+            <w:tcW w:w="2200" w:type="dxa"/>
+          </w:tcPr>
+          <w:p>
+            <w:pPr>
+              <w:spacing w:before="0" w:after="0" w:line="360" w:lineRule="auto"/>
+            </w:pPr>
+            <w:r>
+              <w:t xml:space="preserve">Hybrid residual neural network</w:t>
+            </w:r>
+          </w:p>
+        </w:tc>
+        <w:tc>
+          <w:tcPr>
+            <w:tcW w:w="2200" w:type="dxa"/>
+          </w:tcPr>
+          <w:p>
+            <w:pPr>
+              <w:spacing w:before="0" w:after="0" w:line="360" w:lineRule="auto"/>
+            </w:pPr>
+            <w:r>
+              <w:t xml:space="preserve">可解釋主模型仍可能留下系統性殘差，需要資料驅動方式補償。</w:t>
+            </w:r>
+          </w:p>
+        </w:tc>
+        <w:tc>
+          <w:tcPr>
+            <w:tcW w:w="2200" w:type="dxa"/>
+          </w:tcPr>
+          <w:p>
+            <w:pPr>
+              <w:spacing w:before="0" w:after="0" w:line="360" w:lineRule="auto"/>
+            </w:pPr>
+            <w:r>
+              <w:t xml:space="preserve">讓小型 MLP 學習 truth field 與主模型估計值之差，在保留主模型結構的同時改善殘差。</w:t>
+            </w:r>
+          </w:p>
+        </w:tc>
+        <w:tc>
+          <w:tcPr>
+            <w:tcW w:w="2200" w:type="dxa"/>
+          </w:tcPr>
+          <w:p>
+            <w:pPr>
+              <w:spacing w:before="0" w:after="0" w:line="360" w:lineRule="auto"/>
+            </w:pPr>
+            <w:r>
+              <w:t xml:space="preserve">需要獨立驗證資料避免過擬合；它是第二層修正器，不是用黑盒模型取代物理先驗。</w:t>
+            </w:r>
+          </w:p>
+        </w:tc>
+      </w:tr>
+      <w:tr>
+        <w:tc>
+          <w:tcPr>
+            <w:tcW w:w="2200" w:type="dxa"/>
+          </w:tcPr>
+          <w:p>
+            <w:pPr>
+              <w:spacing w:before="0" w:after="0" w:line="360" w:lineRule="auto"/>
+            </w:pPr>
+            <w:r>
+              <w:t xml:space="preserve">Fourier low-pass denoising</w:t>
+            </w:r>
+          </w:p>
+        </w:tc>
+        <w:tc>
+          <w:tcPr>
+            <w:tcW w:w="2200" w:type="dxa"/>
+          </w:tcPr>
+          <w:p>
+            <w:pPr>
+              <w:spacing w:before="0" w:after="0" w:line="360" w:lineRule="auto"/>
+            </w:pPr>
+            <w:r>
+              <w:t xml:space="preserve">溫度與濕度 residual 常含短時感測雜訊，直接訓練會使模型學到高頻擾動。</w:t>
+            </w:r>
+          </w:p>
+        </w:tc>
+        <w:tc>
+          <w:tcPr>
+            <w:tcW w:w="2200" w:type="dxa"/>
+          </w:tcPr>
+          <w:p>
+            <w:pPr>
+              <w:spacing w:before="0" w:after="0" w:line="360" w:lineRule="auto"/>
+            </w:pPr>
+            <w:r>
+              <w:t xml:space="preserve">在頻域抑制高頻成分並保留低頻趨勢，讓 residual target 更接近可重現的環境變化。</w:t>
+            </w:r>
+          </w:p>
+        </w:tc>
+        <w:tc>
+          <w:tcPr>
+            <w:tcW w:w="2200" w:type="dxa"/>
+          </w:tcPr>
+          <w:p>
+            <w:pPr>
+              <w:spacing w:before="0" w:after="0" w:line="360" w:lineRule="auto"/>
+            </w:pPr>
+            <w:r>
+              <w:t xml:space="preserve">本文不將它套用於照度 residual，因為照明變化本身可能具有快速且有意義的跳變。</w:t>
+            </w:r>
+          </w:p>
+        </w:tc>
+      </w:tr>
+      <w:tr>
+        <w:tc>
+          <w:tcPr>
+            <w:tcW w:w="2200" w:type="dxa"/>
+          </w:tcPr>
+          <w:p>
+            <w:pPr>
+              <w:spacing w:before="0" w:after="0" w:line="360" w:lineRule="auto"/>
+            </w:pPr>
+            <w:r>
+              <w:t xml:space="preserve">IDW baseline</w:t>
+            </w:r>
+          </w:p>
+        </w:tc>
+        <w:tc>
+          <w:tcPr>
+            <w:tcW w:w="2200" w:type="dxa"/>
+          </w:tcPr>
+          <w:p>
+            <w:pPr>
+              <w:spacing w:before="0" w:after="0" w:line="360" w:lineRule="auto"/>
+            </w:pPr>
+            <w:r>
+              <w:t xml:space="preserve">需要一個簡單、無設備物理先驗的比較對象，才能量化本研究模型的附加價值。</w:t>
+            </w:r>
+          </w:p>
+        </w:tc>
+        <w:tc>
+          <w:tcPr>
+            <w:tcW w:w="2200" w:type="dxa"/>
+          </w:tcPr>
+          <w:p>
+            <w:pPr>
+              <w:spacing w:before="0" w:after="0" w:line="360" w:lineRule="auto"/>
+            </w:pPr>
+            <w:r>
+              <w:t xml:space="preserve">用距離加權插值作為傳統稀疏感測場估計基準，對照 device-aware model 的改善幅度。</w:t>
+            </w:r>
+          </w:p>
+        </w:tc>
+        <w:tc>
+          <w:tcPr>
+            <w:tcW w:w="2200" w:type="dxa"/>
+          </w:tcPr>
+          <w:p>
+            <w:pPr>
+              <w:spacing w:before="0" w:after="0" w:line="360" w:lineRule="auto"/>
+            </w:pPr>
+            <w:r>
+              <w:t xml:space="preserve">IDW 不理解設備狀態、方向、時間響應或遮蔽；它是比較 baseline，不是本文主模型。</w:t>
+            </w:r>
+          </w:p>
+        </w:tc>
+      </w:tr>
+      <w:tr>
+        <w:tc>
+          <w:tcPr>
+            <w:tcW w:w="2200" w:type="dxa"/>
+          </w:tcPr>
+          <w:p>
+            <w:pPr>
+              <w:spacing w:before="0" w:after="0" w:line="360" w:lineRule="auto"/>
+            </w:pPr>
+            <w:r>
+              <w:t xml:space="preserve">公開資料集 task-aligned benchmark</w:t>
+            </w:r>
+          </w:p>
+        </w:tc>
+        <w:tc>
+          <w:tcPr>
+            <w:tcW w:w="2200" w:type="dxa"/>
+          </w:tcPr>
+          <w:p>
+            <w:pPr>
+              <w:spacing w:before="0" w:after="0" w:line="360" w:lineRule="auto"/>
+            </w:pPr>
+            <w:r>
+              <w:t xml:space="preserve">本研究資料規模有限，需要用公開資料補強方法在外部資料上的可比較性。</w:t>
+            </w:r>
+          </w:p>
+        </w:tc>
+        <w:tc>
+          <w:tcPr>
+            <w:tcW w:w="2200" w:type="dxa"/>
+          </w:tcPr>
+          <w:p>
+            <w:pPr>
+              <w:spacing w:before="0" w:after="0" w:line="360" w:lineRule="auto"/>
+            </w:pPr>
+            <w:r>
+              <w:t xml:space="preserve">將公開資料切成與本研究相近的預測或重建任務，檢查模型相對於 baseline 的表現。</w:t>
+            </w:r>
+          </w:p>
+        </w:tc>
+        <w:tc>
+          <w:tcPr>
+            <w:tcW w:w="2200" w:type="dxa"/>
+          </w:tcPr>
+          <w:p>
+            <w:pPr>
+              <w:spacing w:before="0" w:after="0" w:line="360" w:lineRule="auto"/>
+            </w:pPr>
+            <w:r>
+              <w:t xml:space="preserve">公開資料通常缺少本研究的 3D 座標、8 點拓樸與裝置事件，因此只能支持任務層級比較，不能直接證明完整三維場重建。</w:t>
+            </w:r>
+          </w:p>
+        </w:tc>
+      </w:tr>
+      <w:tr>
+        <w:tc>
+          <w:tcPr>
+            <w:tcW w:w="2200" w:type="dxa"/>
+          </w:tcPr>
+          <w:p>
+            <w:pPr>
+              <w:spacing w:before="0" w:after="0" w:line="360" w:lineRule="auto"/>
+            </w:pPr>
+            <w:r>
+              <w:t xml:space="preserve">Web demo 與 MCP 介面</w:t>
+            </w:r>
+          </w:p>
+        </w:tc>
+        <w:tc>
+          <w:tcPr>
+            <w:tcW w:w="2200" w:type="dxa"/>
+          </w:tcPr>
+          <w:p>
+            <w:pPr>
+              <w:spacing w:before="0" w:after="0" w:line="360" w:lineRule="auto"/>
+            </w:pPr>
+            <w:r>
+              <w:t xml:space="preserve">研究成果需要可展示、可查詢，也需要讓教授或使用者能看到模型輸入與輸出如何連動。</w:t>
+            </w:r>
+          </w:p>
+        </w:tc>
+        <w:tc>
+          <w:tcPr>
+            <w:tcW w:w="2200" w:type="dxa"/>
+          </w:tcPr>
+          <w:p>
+            <w:pPr>
+              <w:spacing w:before="0" w:after="0" w:line="360" w:lineRule="auto"/>
+            </w:pPr>
+            <w:r>
+              <w:t xml:space="preserve">提供 3D 場視覺化、名詞解釋、公開資料比較與 tool-based 查詢，協助驗證展示與口試說明。</w:t>
+            </w:r>
+          </w:p>
+        </w:tc>
+        <w:tc>
+          <w:tcPr>
+            <w:tcW w:w="2200" w:type="dxa"/>
+          </w:tcPr>
+          <w:p>
+            <w:pPr>
+              <w:spacing w:before="0" w:after="0" w:line="360" w:lineRule="auto"/>
+            </w:pPr>
+            <w:r>
+              <w:t xml:space="preserve">它是服務與展示層，不是主要科學貢獻；論文主張仍需回到模型、實驗與誤差分析。</w:t>
+            </w:r>
+          </w:p>
+        </w:tc>
+      </w:tr>
+    </w:tbl>
+    <w:p>
+      <w:pPr>
+        <w:spacing w:before="0" w:after="0" w:line="360" w:lineRule="auto"/>
+      </w:pPr>
+      <w:r>
+        <w:t xml:space="preserve">因此，若被問到「為什麼不用單純插值」或「為什麼不用同一公式描述三個因子」，本研究的回答是：單純插值缺少設備與時間響應資訊，而單一公式會忽略溫度、濕度與照度的物理差異。本研究採用分層方法，是為了在可解釋性、稀疏感測可行性、展示互動性與資料驅動修正之間取得平衡。</w:t>
       </w:r>
     </w:p>
     <w:p>

</xml_diff>

<commit_message>
Refactor thesis presentation scripts and add data preparation and verification tools
- Updated `build_thesis_pptx.py` to enhance presentation content with clearer experiment labels and results.
- Introduced `prepare_experiment_data.py` for downloading and normalizing public datasets, ensuring data availability for thesis verification.
- Created `run_all_thesis_experiments.py` to streamline the execution of all thesis-related experiments, including data preparation and result verification.
- Added `verify_thesis_results.py` to validate thesis results against computed evidence, generating comprehensive reports in JSON and Markdown formats.
</commit_message>
<xml_diff>
--- a/docs/papers/thesis/thesis_draft_zh.docx
+++ b/docs/papers/thesis/thesis_draft_zh.docx
@@ -734,63 +734,63 @@
         <w:spacing w:before="0" w:after="0" w:line="360" w:lineRule="auto"/>
       </w:pPr>
       <w:r>
-        <w:t xml:space="preserve">  5.2 場重建誤差…… 13</w:t>
-      </w:r>
-    </w:p>
-    <w:p>
-      <w:pPr>
-        <w:spacing w:before="0" w:after="0" w:line="360" w:lineRule="auto"/>
-      </w:pPr>
-      <w:r>
-        <w:t xml:space="preserve">  5.3 IDW Baseline 比較…… 14</w:t>
-      </w:r>
-    </w:p>
-    <w:p>
-      <w:pPr>
-        <w:spacing w:before="0" w:after="0" w:line="360" w:lineRule="auto"/>
-      </w:pPr>
-      <w:r>
-        <w:t xml:space="preserve">  5.4 消融分析與可重現性補強…… 14</w:t>
-      </w:r>
-    </w:p>
-    <w:p>
-      <w:pPr>
-        <w:spacing w:before="0" w:after="0" w:line="360" w:lineRule="auto"/>
-      </w:pPr>
-      <w:r>
-        <w:t xml:space="preserve">  5.5 非連網裝置影響學習…… 14</w:t>
-      </w:r>
-    </w:p>
-    <w:p>
-      <w:pPr>
-        <w:spacing w:before="0" w:after="0" w:line="360" w:lineRule="auto"/>
-      </w:pPr>
-      <w:r>
-        <w:t xml:space="preserve">  5.6 窗戶時段、天氣、季節矩陣與直接輸入…… 14</w:t>
-      </w:r>
-    </w:p>
-    <w:p>
-      <w:pPr>
-        <w:spacing w:before="0" w:after="0" w:line="360" w:lineRule="auto"/>
-      </w:pPr>
-      <w:r>
-        <w:t xml:space="preserve">  5.7 Hybrid Residual Neural Network 結果…… 15</w:t>
-      </w:r>
-    </w:p>
-    <w:p>
-      <w:pPr>
-        <w:spacing w:before="0" w:after="0" w:line="360" w:lineRule="auto"/>
-      </w:pPr>
-      <w:r>
-        <w:t xml:space="preserve">  5.8 真實臥室快照驗證與推薦動作驗證方法…… 16</w:t>
-      </w:r>
-    </w:p>
-    <w:p>
-      <w:pPr>
-        <w:spacing w:before="0" w:after="0" w:line="360" w:lineRule="auto"/>
-      </w:pPr>
-      <w:r>
-        <w:t xml:space="preserve">  5.9 公開資料集執行流程與 Task-Aligned Benchmark 結果…… 17</w:t>
+        <w:t xml:space="preserve">  5.2 【實驗 E1】標準情境場重建誤差…… 13</w:t>
+      </w:r>
+    </w:p>
+    <w:p>
+      <w:pPr>
+        <w:spacing w:before="0" w:after="0" w:line="360" w:lineRule="auto"/>
+      </w:pPr>
+      <w:r>
+        <w:t xml:space="preserve">  5.3 【實驗 E2】IDW Baseline 比較…… 14</w:t>
+      </w:r>
+    </w:p>
+    <w:p>
+      <w:pPr>
+        <w:spacing w:before="0" w:after="0" w:line="360" w:lineRule="auto"/>
+      </w:pPr>
+      <w:r>
+        <w:t xml:space="preserve">  5.4 【實驗 E3】消融分析與可重現性補強…… 14</w:t>
+      </w:r>
+    </w:p>
+    <w:p>
+      <w:pPr>
+        <w:spacing w:before="0" w:after="0" w:line="360" w:lineRule="auto"/>
+      </w:pPr>
+      <w:r>
+        <w:t xml:space="preserve">  5.5 【實驗 E4】非連網裝置影響學習…… 14</w:t>
+      </w:r>
+    </w:p>
+    <w:p>
+      <w:pPr>
+        <w:spacing w:before="0" w:after="0" w:line="360" w:lineRule="auto"/>
+      </w:pPr>
+      <w:r>
+        <w:t xml:space="preserve">  5.6 【實驗 E5】窗戶時段、天氣、季節矩陣與直接輸入…… 14</w:t>
+      </w:r>
+    </w:p>
+    <w:p>
+      <w:pPr>
+        <w:spacing w:before="0" w:after="0" w:line="360" w:lineRule="auto"/>
+      </w:pPr>
+      <w:r>
+        <w:t xml:space="preserve">  5.7 【實驗 E6】Hybrid Residual Neural Network 結果…… 15</w:t>
+      </w:r>
+    </w:p>
+    <w:p>
+      <w:pPr>
+        <w:spacing w:before="0" w:after="0" w:line="360" w:lineRule="auto"/>
+      </w:pPr>
+      <w:r>
+        <w:t xml:space="preserve">  5.8 【實驗 E7】真實臥室快照驗證與【驗證方案 E8】推薦動作驗證方法…… 16</w:t>
+      </w:r>
+    </w:p>
+    <w:p>
+      <w:pPr>
+        <w:spacing w:before="0" w:after="0" w:line="360" w:lineRule="auto"/>
+      </w:pPr>
+      <w:r>
+        <w:t xml:space="preserve">  5.9 【實驗 E9】公開資料集執行流程與 Task-Aligned Benchmark 結果…… 17</w:t>
       </w:r>
     </w:p>
     <w:p>
@@ -806,7 +806,7 @@
         <w:spacing w:before="0" w:after="0" w:line="360" w:lineRule="auto"/>
       </w:pPr>
       <w:r>
-        <w:t xml:space="preserve">  5.11 可旋轉 3D 展示…… 19</w:t>
+        <w:t xml:space="preserve">  5.11 展示 D1：可旋轉 3D 展示（非量化實驗）…… 19</w:t>
       </w:r>
     </w:p>
     <w:p>
@@ -6088,6 +6088,852 @@
     </w:p>
     <w:p>
       <w:pPr>
+        <w:spacing w:before="0" w:after="0" w:line="360" w:lineRule="auto"/>
+      </w:pPr>
+      <w:r>
+        <w:t xml:space="preserve">實驗標記總覽。本章後續以 E1--E9 標記實驗或驗證項目。E1--E6 為 controlled simulation 或 model robustness experiment，E7 為真實臥室 sparse-calibration check，E8 是尚未完成實測的推薦介入驗證方案，E9 為 public task-aligned benchmark。Web demo、MCP 與可旋轉 3D 展示屬於服務介面與展示輔助，不列為獨立量化實驗。</w:t>
+      </w:r>
+    </w:p>
+    <w:tbl>
+      <w:tblPr>
+        <w:tblBorders>
+          <w:top w:val="single" w:sz="6" w:space="0" w:color="999999"/>
+          <w:left w:val="single" w:sz="6" w:space="0" w:color="999999"/>
+          <w:bottom w:val="single" w:sz="6" w:space="0" w:color="999999"/>
+          <w:right w:val="single" w:sz="6" w:space="0" w:color="999999"/>
+          <w:insideH w:val="single" w:sz="6" w:space="0" w:color="999999"/>
+          <w:insideV w:val="single" w:sz="6" w:space="0" w:color="999999"/>
+        </w:tblBorders>
+      </w:tblPr>
+      <w:tr>
+        <w:tc>
+          <w:tcPr>
+            <w:tcW w:w="2200" w:type="dxa"/>
+          </w:tcPr>
+          <w:p>
+            <w:pPr>
+              <w:spacing w:before="0" w:after="0" w:line="360" w:lineRule="auto"/>
+            </w:pPr>
+            <w:r>
+              <w:rPr>
+                <w:b/>
+              </w:rPr>
+              <w:t xml:space="preserve">標記</w:t>
+            </w:r>
+          </w:p>
+        </w:tc>
+        <w:tc>
+          <w:tcPr>
+            <w:tcW w:w="2200" w:type="dxa"/>
+          </w:tcPr>
+          <w:p>
+            <w:pPr>
+              <w:spacing w:before="0" w:after="0" w:line="360" w:lineRule="auto"/>
+            </w:pPr>
+            <w:r>
+              <w:rPr>
+                <w:b/>
+              </w:rPr>
+              <w:t xml:space="preserve">名稱</w:t>
+            </w:r>
+          </w:p>
+        </w:tc>
+        <w:tc>
+          <w:tcPr>
+            <w:tcW w:w="2200" w:type="dxa"/>
+          </w:tcPr>
+          <w:p>
+            <w:pPr>
+              <w:spacing w:before="0" w:after="0" w:line="360" w:lineRule="auto"/>
+            </w:pPr>
+            <w:r>
+              <w:rPr>
+                <w:b/>
+              </w:rPr>
+              <w:t xml:space="preserve">資料來源</w:t>
+            </w:r>
+          </w:p>
+        </w:tc>
+        <w:tc>
+          <w:tcPr>
+            <w:tcW w:w="2200" w:type="dxa"/>
+          </w:tcPr>
+          <w:p>
+            <w:pPr>
+              <w:spacing w:before="0" w:after="0" w:line="360" w:lineRule="auto"/>
+            </w:pPr>
+            <w:r>
+              <w:rPr>
+                <w:b/>
+              </w:rPr>
+              <w:t xml:space="preserve">主要比較或輸出</w:t>
+            </w:r>
+          </w:p>
+        </w:tc>
+        <w:tc>
+          <w:tcPr>
+            <w:tcW w:w="2200" w:type="dxa"/>
+          </w:tcPr>
+          <w:p>
+            <w:pPr>
+              <w:spacing w:before="0" w:after="0" w:line="360" w:lineRule="auto"/>
+            </w:pPr>
+            <w:r>
+              <w:rPr>
+                <w:b/>
+              </w:rPr>
+              <w:t xml:space="preserve">可支持主張</w:t>
+            </w:r>
+          </w:p>
+        </w:tc>
+        <w:tc>
+          <w:tcPr>
+            <w:tcW w:w="2200" w:type="dxa"/>
+          </w:tcPr>
+          <w:p>
+            <w:pPr>
+              <w:spacing w:before="0" w:after="0" w:line="360" w:lineRule="auto"/>
+            </w:pPr>
+            <w:r>
+              <w:rPr>
+                <w:b/>
+              </w:rPr>
+              <w:t xml:space="preserve">限制</w:t>
+            </w:r>
+          </w:p>
+        </w:tc>
+      </w:tr>
+      <w:tr>
+        <w:tc>
+          <w:tcPr>
+            <w:tcW w:w="2200" w:type="dxa"/>
+          </w:tcPr>
+          <w:p>
+            <w:pPr>
+              <w:spacing w:before="0" w:after="0" w:line="360" w:lineRule="auto"/>
+            </w:pPr>
+            <w:r>
+              <w:t xml:space="preserve">實驗 E1</w:t>
+            </w:r>
+          </w:p>
+        </w:tc>
+        <w:tc>
+          <w:tcPr>
+            <w:tcW w:w="2200" w:type="dxa"/>
+          </w:tcPr>
+          <w:p>
+            <w:pPr>
+              <w:spacing w:before="0" w:after="0" w:line="360" w:lineRule="auto"/>
+            </w:pPr>
+            <w:r>
+              <w:t xml:space="preserve">標準情境 full-field 重建</w:t>
+            </w:r>
+          </w:p>
+        </w:tc>
+        <w:tc>
+          <w:tcPr>
+            <w:tcW w:w="2200" w:type="dxa"/>
+          </w:tcPr>
+          <w:p>
+            <w:pPr>
+              <w:spacing w:before="0" w:after="0" w:line="360" w:lineRule="auto"/>
+            </w:pPr>
+            <w:r>
+              <w:t xml:space="preserve">8 組 controlled synthetic scenarios</w:t>
+            </w:r>
+          </w:p>
+        </w:tc>
+        <w:tc>
+          <w:tcPr>
+            <w:tcW w:w="2200" w:type="dxa"/>
+          </w:tcPr>
+          <w:p>
+            <w:pPr>
+              <w:spacing w:before="0" w:after="0" w:line="360" w:lineRule="auto"/>
+            </w:pPr>
+            <w:r>
+              <w:t xml:space="preserve">Base field MAE、zone MAE、sensor MAE</w:t>
+            </w:r>
+          </w:p>
+        </w:tc>
+        <w:tc>
+          <w:tcPr>
+            <w:tcW w:w="2200" w:type="dxa"/>
+          </w:tcPr>
+          <w:p>
+            <w:pPr>
+              <w:spacing w:before="0" w:after="0" w:line="360" w:lineRule="auto"/>
+            </w:pPr>
+            <w:r>
+              <w:t xml:space="preserve">受控條件下可重建完整 3D 場</w:t>
+            </w:r>
+          </w:p>
+        </w:tc>
+        <w:tc>
+          <w:tcPr>
+            <w:tcW w:w="2200" w:type="dxa"/>
+          </w:tcPr>
+          <w:p>
+            <w:pPr>
+              <w:spacing w:before="0" w:after="0" w:line="360" w:lineRule="auto"/>
+            </w:pPr>
+            <w:r>
+              <w:t xml:space="preserve">非真實 dense ground truth</w:t>
+            </w:r>
+          </w:p>
+        </w:tc>
+      </w:tr>
+      <w:tr>
+        <w:tc>
+          <w:tcPr>
+            <w:tcW w:w="2200" w:type="dxa"/>
+          </w:tcPr>
+          <w:p>
+            <w:pPr>
+              <w:spacing w:before="0" w:after="0" w:line="360" w:lineRule="auto"/>
+            </w:pPr>
+            <w:r>
+              <w:t xml:space="preserve">實驗 E2</w:t>
+            </w:r>
+          </w:p>
+        </w:tc>
+        <w:tc>
+          <w:tcPr>
+            <w:tcW w:w="2200" w:type="dxa"/>
+          </w:tcPr>
+          <w:p>
+            <w:pPr>
+              <w:spacing w:before="0" w:after="0" w:line="360" w:lineRule="auto"/>
+            </w:pPr>
+            <w:r>
+              <w:t xml:space="preserve">IDW baseline 比較</w:t>
+            </w:r>
+          </w:p>
+        </w:tc>
+        <w:tc>
+          <w:tcPr>
+            <w:tcW w:w="2200" w:type="dxa"/>
+          </w:tcPr>
+          <w:p>
+            <w:pPr>
+              <w:spacing w:before="0" w:after="0" w:line="360" w:lineRule="auto"/>
+            </w:pPr>
+            <w:r>
+              <w:t xml:space="preserve">E1 同一組情境與 8 顆角落感測器</w:t>
+            </w:r>
+          </w:p>
+        </w:tc>
+        <w:tc>
+          <w:tcPr>
+            <w:tcW w:w="2200" w:type="dxa"/>
+          </w:tcPr>
+          <w:p>
+            <w:pPr>
+              <w:spacing w:before="0" w:after="0" w:line="360" w:lineRule="auto"/>
+            </w:pPr>
+            <w:r>
+              <w:t xml:space="preserve">Base model 與 IDW field MAE</w:t>
+            </w:r>
+          </w:p>
+        </w:tc>
+        <w:tc>
+          <w:tcPr>
+            <w:tcW w:w="2200" w:type="dxa"/>
+          </w:tcPr>
+          <w:p>
+            <w:pPr>
+              <w:spacing w:before="0" w:after="0" w:line="360" w:lineRule="auto"/>
+            </w:pPr>
+            <w:r>
+              <w:t xml:space="preserve">設備先驗、校準與場模型比純空間插值更適合有設備作用情境</w:t>
+            </w:r>
+          </w:p>
+        </w:tc>
+        <w:tc>
+          <w:tcPr>
+            <w:tcW w:w="2200" w:type="dxa"/>
+          </w:tcPr>
+          <w:p>
+            <w:pPr>
+              <w:spacing w:before="0" w:after="0" w:line="360" w:lineRule="auto"/>
+            </w:pPr>
+            <w:r>
+              <w:t xml:space="preserve">IDW 只是無設備語意 baseline，不代表所有空間插值上限</w:t>
+            </w:r>
+          </w:p>
+        </w:tc>
+      </w:tr>
+      <w:tr>
+        <w:tc>
+          <w:tcPr>
+            <w:tcW w:w="2200" w:type="dxa"/>
+          </w:tcPr>
+          <w:p>
+            <w:pPr>
+              <w:spacing w:before="0" w:after="0" w:line="360" w:lineRule="auto"/>
+            </w:pPr>
+            <w:r>
+              <w:t xml:space="preserve">實驗 E3</w:t>
+            </w:r>
+          </w:p>
+        </w:tc>
+        <w:tc>
+          <w:tcPr>
+            <w:tcW w:w="2200" w:type="dxa"/>
+          </w:tcPr>
+          <w:p>
+            <w:pPr>
+              <w:spacing w:before="0" w:after="0" w:line="360" w:lineRule="auto"/>
+            </w:pPr>
+            <w:r>
+              <w:t xml:space="preserve">消融與可重現性</w:t>
+            </w:r>
+          </w:p>
+        </w:tc>
+        <w:tc>
+          <w:tcPr>
+            <w:tcW w:w="2200" w:type="dxa"/>
+          </w:tcPr>
+          <w:p>
+            <w:pPr>
+              <w:spacing w:before="0" w:after="0" w:line="360" w:lineRule="auto"/>
+            </w:pPr>
+            <w:r>
+              <w:t xml:space="preserve">E1 同一 synthetic setup</w:t>
+            </w:r>
+          </w:p>
+        </w:tc>
+        <w:tc>
+          <w:tcPr>
+            <w:tcW w:w="2200" w:type="dxa"/>
+          </w:tcPr>
+          <w:p>
+            <w:pPr>
+              <w:spacing w:before="0" w:after="0" w:line="360" w:lineRule="auto"/>
+            </w:pPr>
+            <w:r>
+              <w:t xml:space="preserve">raw、no reflection、no calibration、no trilinear、full base</w:t>
+            </w:r>
+          </w:p>
+        </w:tc>
+        <w:tc>
+          <w:tcPr>
+            <w:tcW w:w="2200" w:type="dxa"/>
+          </w:tcPr>
+          <w:p>
+            <w:pPr>
+              <w:spacing w:before="0" w:after="0" w:line="360" w:lineRule="auto"/>
+            </w:pPr>
+            <w:r>
+              <w:t xml:space="preserve">說明反射、校準與 trilinear correction 的個別貢獻與限制</w:t>
+            </w:r>
+          </w:p>
+        </w:tc>
+        <w:tc>
+          <w:tcPr>
+            <w:tcW w:w="2200" w:type="dxa"/>
+          </w:tcPr>
+          <w:p>
+            <w:pPr>
+              <w:spacing w:before="0" w:after="0" w:line="360" w:lineRule="auto"/>
+            </w:pPr>
+            <w:r>
+              <w:t xml:space="preserve">trilinear 目標是感測點一致性，不保證 dense MAE 單調下降</w:t>
+            </w:r>
+          </w:p>
+        </w:tc>
+      </w:tr>
+      <w:tr>
+        <w:tc>
+          <w:tcPr>
+            <w:tcW w:w="2200" w:type="dxa"/>
+          </w:tcPr>
+          <w:p>
+            <w:pPr>
+              <w:spacing w:before="0" w:after="0" w:line="360" w:lineRule="auto"/>
+            </w:pPr>
+            <w:r>
+              <w:t xml:space="preserve">實驗 E4</w:t>
+            </w:r>
+          </w:p>
+        </w:tc>
+        <w:tc>
+          <w:tcPr>
+            <w:tcW w:w="2200" w:type="dxa"/>
+          </w:tcPr>
+          <w:p>
+            <w:pPr>
+              <w:spacing w:before="0" w:after="0" w:line="360" w:lineRule="auto"/>
+            </w:pPr>
+            <w:r>
+              <w:t xml:space="preserve">非連網裝置影響學習</w:t>
+            </w:r>
+          </w:p>
+        </w:tc>
+        <w:tc>
+          <w:tcPr>
+            <w:tcW w:w="2200" w:type="dxa"/>
+          </w:tcPr>
+          <w:p>
+            <w:pPr>
+              <w:spacing w:before="0" w:after="0" w:line="360" w:lineRule="auto"/>
+            </w:pPr>
+            <w:r>
+              <w:t xml:space="preserve">controlled before/after synthetic observations</w:t>
+            </w:r>
+          </w:p>
+        </w:tc>
+        <w:tc>
+          <w:tcPr>
+            <w:tcW w:w="2200" w:type="dxa"/>
+          </w:tcPr>
+          <w:p>
+            <w:pPr>
+              <w:spacing w:before="0" w:after="0" w:line="360" w:lineRule="auto"/>
+            </w:pPr>
+            <w:r>
+              <w:t xml:space="preserve">learned impact coefficients、推薦排序</w:t>
+            </w:r>
+          </w:p>
+        </w:tc>
+        <w:tc>
+          <w:tcPr>
+            <w:tcW w:w="2200" w:type="dxa"/>
+          </w:tcPr>
+          <w:p>
+            <w:pPr>
+              <w:spacing w:before="0" w:after="0" w:line="360" w:lineRule="auto"/>
+            </w:pPr>
+            <w:r>
+              <w:t xml:space="preserve">可由環境變化學出裝置影響方向與相對強度</w:t>
+            </w:r>
+          </w:p>
+        </w:tc>
+        <w:tc>
+          <w:tcPr>
+            <w:tcW w:w="2200" w:type="dxa"/>
+          </w:tcPr>
+          <w:p>
+            <w:pPr>
+              <w:spacing w:before="0" w:after="0" w:line="360" w:lineRule="auto"/>
+            </w:pPr>
+            <w:r>
+              <w:t xml:space="preserve">不是實測因果控制</w:t>
+            </w:r>
+          </w:p>
+        </w:tc>
+      </w:tr>
+      <w:tr>
+        <w:tc>
+          <w:tcPr>
+            <w:tcW w:w="2200" w:type="dxa"/>
+          </w:tcPr>
+          <w:p>
+            <w:pPr>
+              <w:spacing w:before="0" w:after="0" w:line="360" w:lineRule="auto"/>
+            </w:pPr>
+            <w:r>
+              <w:t xml:space="preserve">實驗 E5</w:t>
+            </w:r>
+          </w:p>
+        </w:tc>
+        <w:tc>
+          <w:tcPr>
+            <w:tcW w:w="2200" w:type="dxa"/>
+          </w:tcPr>
+          <w:p>
+            <w:pPr>
+              <w:spacing w:before="0" w:after="0" w:line="360" w:lineRule="auto"/>
+            </w:pPr>
+            <w:r>
+              <w:t xml:space="preserve">窗戶矩陣與 direct input</w:t>
+            </w:r>
+          </w:p>
+        </w:tc>
+        <w:tc>
+          <w:tcPr>
+            <w:tcW w:w="2200" w:type="dxa"/>
+          </w:tcPr>
+          <w:p>
+            <w:pPr>
+              <w:spacing w:before="0" w:after="0" w:line="360" w:lineRule="auto"/>
+            </w:pPr>
+            <w:r>
+              <w:t xml:space="preserve">48 組 season/weather/time/window cases</w:t>
+            </w:r>
+          </w:p>
+        </w:tc>
+        <w:tc>
+          <w:tcPr>
+            <w:tcW w:w="2200" w:type="dxa"/>
+          </w:tcPr>
+          <w:p>
+            <w:pPr>
+              <w:spacing w:before="0" w:after="0" w:line="360" w:lineRule="auto"/>
+            </w:pPr>
+            <w:r>
+              <w:t xml:space="preserve">window-zone 與 center-zone estimates</w:t>
+            </w:r>
+          </w:p>
+        </w:tc>
+        <w:tc>
+          <w:tcPr>
+            <w:tcW w:w="2200" w:type="dxa"/>
+          </w:tcPr>
+          <w:p>
+            <w:pPr>
+              <w:spacing w:before="0" w:after="0" w:line="360" w:lineRule="auto"/>
+            </w:pPr>
+            <w:r>
+              <w:t xml:space="preserve">外部溫濕度、日照與開窗比例會改變估測場</w:t>
+            </w:r>
+          </w:p>
+        </w:tc>
+        <w:tc>
+          <w:tcPr>
+            <w:tcW w:w="2200" w:type="dxa"/>
+          </w:tcPr>
+          <w:p>
+            <w:pPr>
+              <w:spacing w:before="0" w:after="0" w:line="360" w:lineRule="auto"/>
+            </w:pPr>
+            <w:r>
+              <w:t xml:space="preserve">不是實際天氣部署或長期監測</w:t>
+            </w:r>
+          </w:p>
+        </w:tc>
+      </w:tr>
+      <w:tr>
+        <w:tc>
+          <w:tcPr>
+            <w:tcW w:w="2200" w:type="dxa"/>
+          </w:tcPr>
+          <w:p>
+            <w:pPr>
+              <w:spacing w:before="0" w:after="0" w:line="360" w:lineRule="auto"/>
+            </w:pPr>
+            <w:r>
+              <w:t xml:space="preserve">實驗 E6</w:t>
+            </w:r>
+          </w:p>
+        </w:tc>
+        <w:tc>
+          <w:tcPr>
+            <w:tcW w:w="2200" w:type="dxa"/>
+          </w:tcPr>
+          <w:p>
+            <w:pPr>
+              <w:spacing w:before="0" w:after="0" w:line="360" w:lineRule="auto"/>
+            </w:pPr>
+            <w:r>
+              <w:t xml:space="preserve">Hybrid residual robustness</w:t>
+            </w:r>
+          </w:p>
+        </w:tc>
+        <w:tc>
+          <w:tcPr>
+            <w:tcW w:w="2200" w:type="dxa"/>
+          </w:tcPr>
+          <w:p>
+            <w:pPr>
+              <w:spacing w:before="0" w:after="0" w:line="360" w:lineRule="auto"/>
+            </w:pPr>
+            <w:r>
+              <w:t xml:space="preserve">default split、no-Fourier、8-fold leave-one-scenario-out</w:t>
+            </w:r>
+          </w:p>
+        </w:tc>
+        <w:tc>
+          <w:tcPr>
+            <w:tcW w:w="2200" w:type="dxa"/>
+          </w:tcPr>
+          <w:p>
+            <w:pPr>
+              <w:spacing w:before="0" w:after="0" w:line="360" w:lineRule="auto"/>
+            </w:pPr>
+            <w:r>
+              <w:t xml:space="preserve">hybrid field MAE、train/test samples</w:t>
+            </w:r>
+          </w:p>
+        </w:tc>
+        <w:tc>
+          <w:tcPr>
+            <w:tcW w:w="2200" w:type="dxa"/>
+          </w:tcPr>
+          <w:p>
+            <w:pPr>
+              <w:spacing w:before="0" w:after="0" w:line="360" w:lineRule="auto"/>
+            </w:pPr>
+            <w:r>
+              <w:t xml:space="preserve">標準情境 family 內 residual 可學習，且不是只依賴單一切分</w:t>
+            </w:r>
+          </w:p>
+        </w:tc>
+        <w:tc>
+          <w:tcPr>
+            <w:tcW w:w="2200" w:type="dxa"/>
+          </w:tcPr>
+          <w:p>
+            <w:pPr>
+              <w:spacing w:before="0" w:after="0" w:line="360" w:lineRule="auto"/>
+            </w:pPr>
+            <w:r>
+              <w:t xml:space="preserve">不代表任意房間或任意家具配置泛化</w:t>
+            </w:r>
+          </w:p>
+        </w:tc>
+      </w:tr>
+      <w:tr>
+        <w:tc>
+          <w:tcPr>
+            <w:tcW w:w="2200" w:type="dxa"/>
+          </w:tcPr>
+          <w:p>
+            <w:pPr>
+              <w:spacing w:before="0" w:after="0" w:line="360" w:lineRule="auto"/>
+            </w:pPr>
+            <w:r>
+              <w:t xml:space="preserve">實驗 E7</w:t>
+            </w:r>
+          </w:p>
+        </w:tc>
+        <w:tc>
+          <w:tcPr>
+            <w:tcW w:w="2200" w:type="dxa"/>
+          </w:tcPr>
+          <w:p>
+            <w:pPr>
+              <w:spacing w:before="0" w:after="0" w:line="360" w:lineRule="auto"/>
+            </w:pPr>
+            <w:r>
+              <w:t xml:space="preserve">真實臥室快照 sparse calibration</w:t>
+            </w:r>
+          </w:p>
+        </w:tc>
+        <w:tc>
+          <w:tcPr>
+            <w:tcW w:w="2200" w:type="dxa"/>
+          </w:tcPr>
+          <w:p>
+            <w:pPr>
+              <w:spacing w:before="0" w:after="0" w:line="360" w:lineRule="auto"/>
+            </w:pPr>
+            <w:r>
+              <w:t xml:space="preserve">bedroom_01，7 天 28 snapshots</w:t>
+            </w:r>
+          </w:p>
+        </w:tc>
+        <w:tc>
+          <w:tcPr>
+            <w:tcW w:w="2200" w:type="dxa"/>
+          </w:tcPr>
+          <w:p>
+            <w:pPr>
+              <w:spacing w:before="0" w:after="0" w:line="360" w:lineRule="auto"/>
+            </w:pPr>
+            <w:r>
+              <w:t xml:space="preserve">raw vs corrected pillow MAE</w:t>
+            </w:r>
+          </w:p>
+        </w:tc>
+        <w:tc>
+          <w:tcPr>
+            <w:tcW w:w="2200" w:type="dxa"/>
+          </w:tcPr>
+          <w:p>
+            <w:pPr>
+              <w:spacing w:before="0" w:after="0" w:line="360" w:lineRule="auto"/>
+            </w:pPr>
+            <w:r>
+              <w:t xml:space="preserve">真實稀疏觀測可改善未參與校正的 pillow 參考點</w:t>
+            </w:r>
+          </w:p>
+        </w:tc>
+        <w:tc>
+          <w:tcPr>
+            <w:tcW w:w="2200" w:type="dxa"/>
+          </w:tcPr>
+          <w:p>
+            <w:pPr>
+              <w:spacing w:before="0" w:after="0" w:line="360" w:lineRule="auto"/>
+            </w:pPr>
+            <w:r>
+              <w:t xml:space="preserve">只有單一 pillow reference，沒有 dense 3D ground truth</w:t>
+            </w:r>
+          </w:p>
+        </w:tc>
+      </w:tr>
+      <w:tr>
+        <w:tc>
+          <w:tcPr>
+            <w:tcW w:w="2200" w:type="dxa"/>
+          </w:tcPr>
+          <w:p>
+            <w:pPr>
+              <w:spacing w:before="0" w:after="0" w:line="360" w:lineRule="auto"/>
+            </w:pPr>
+            <w:r>
+              <w:t xml:space="preserve">驗證方案 E8</w:t>
+            </w:r>
+          </w:p>
+        </w:tc>
+        <w:tc>
+          <w:tcPr>
+            <w:tcW w:w="2200" w:type="dxa"/>
+          </w:tcPr>
+          <w:p>
+            <w:pPr>
+              <w:spacing w:before="0" w:after="0" w:line="360" w:lineRule="auto"/>
+            </w:pPr>
+            <w:r>
+              <w:t xml:space="preserve">推薦動作 before/after 介入</w:t>
+            </w:r>
+          </w:p>
+        </w:tc>
+        <w:tc>
+          <w:tcPr>
+            <w:tcW w:w="2200" w:type="dxa"/>
+          </w:tcPr>
+          <w:p>
+            <w:pPr>
+              <w:spacing w:before="0" w:after="0" w:line="360" w:lineRule="auto"/>
+            </w:pPr>
+            <w:r>
+              <w:t xml:space="preserve">尚待實測</w:t>
+            </w:r>
+          </w:p>
+        </w:tc>
+        <w:tc>
+          <w:tcPr>
+            <w:tcW w:w="2200" w:type="dxa"/>
+          </w:tcPr>
+          <w:p>
+            <w:pPr>
+              <w:spacing w:before="0" w:after="0" w:line="360" w:lineRule="auto"/>
+            </w:pPr>
+            <w:r>
+              <w:t xml:space="preserve">actual improvement、success rate、top-1 regret</w:t>
+            </w:r>
+          </w:p>
+        </w:tc>
+        <w:tc>
+          <w:tcPr>
+            <w:tcW w:w="2200" w:type="dxa"/>
+          </w:tcPr>
+          <w:p>
+            <w:pPr>
+              <w:spacing w:before="0" w:after="0" w:line="360" w:lineRule="auto"/>
+            </w:pPr>
+            <w:r>
+              <w:t xml:space="preserve">定義未來如何驗證推薦是否真的造成改善</w:t>
+            </w:r>
+          </w:p>
+        </w:tc>
+        <w:tc>
+          <w:tcPr>
+            <w:tcW w:w="2200" w:type="dxa"/>
+          </w:tcPr>
+          <w:p>
+            <w:pPr>
+              <w:spacing w:before="0" w:after="0" w:line="360" w:lineRule="auto"/>
+            </w:pPr>
+            <w:r>
+              <w:t xml:space="preserve">目前只完成 protocol，不列為已完成結果</w:t>
+            </w:r>
+          </w:p>
+        </w:tc>
+      </w:tr>
+      <w:tr>
+        <w:tc>
+          <w:tcPr>
+            <w:tcW w:w="2200" w:type="dxa"/>
+          </w:tcPr>
+          <w:p>
+            <w:pPr>
+              <w:spacing w:before="0" w:after="0" w:line="360" w:lineRule="auto"/>
+            </w:pPr>
+            <w:r>
+              <w:t xml:space="preserve">實驗 E9</w:t>
+            </w:r>
+          </w:p>
+        </w:tc>
+        <w:tc>
+          <w:tcPr>
+            <w:tcW w:w="2200" w:type="dxa"/>
+          </w:tcPr>
+          <w:p>
+            <w:pPr>
+              <w:spacing w:before="0" w:after="0" w:line="360" w:lineRule="auto"/>
+            </w:pPr>
+            <w:r>
+              <w:t xml:space="preserve">Public task-aligned benchmark</w:t>
+            </w:r>
+          </w:p>
+        </w:tc>
+        <w:tc>
+          <w:tcPr>
+            <w:tcW w:w="2200" w:type="dxa"/>
+          </w:tcPr>
+          <w:p>
+            <w:pPr>
+              <w:spacing w:before="0" w:after="0" w:line="360" w:lineRule="auto"/>
+            </w:pPr>
+            <w:r>
+              <w:t xml:space="preserve">SML2010、CU-BEMS</w:t>
+            </w:r>
+          </w:p>
+        </w:tc>
+        <w:tc>
+          <w:tcPr>
+            <w:tcW w:w="2200" w:type="dxa"/>
+          </w:tcPr>
+          <w:p>
+            <w:pPr>
+              <w:spacing w:before="0" w:after="0" w:line="360" w:lineRule="auto"/>
+            </w:pPr>
+            <w:r>
+              <w:t xml:space="preserve">persistence、linear regression、本研究 mapped readout</w:t>
+            </w:r>
+          </w:p>
+        </w:tc>
+        <w:tc>
+          <w:tcPr>
+            <w:tcW w:w="2200" w:type="dxa"/>
+          </w:tcPr>
+          <w:p>
+            <w:pPr>
+              <w:spacing w:before="0" w:after="0" w:line="360" w:lineRule="auto"/>
+            </w:pPr>
+            <w:r>
+              <w:t xml:space="preserve">提供外部資料相容子任務上的定位與比較</w:t>
+            </w:r>
+          </w:p>
+        </w:tc>
+        <w:tc>
+          <w:tcPr>
+            <w:tcW w:w="2200" w:type="dxa"/>
+          </w:tcPr>
+          <w:p>
+            <w:pPr>
+              <w:spacing w:before="0" w:after="0" w:line="360" w:lineRule="auto"/>
+            </w:pPr>
+            <w:r>
+              <w:t xml:space="preserve">不能宣稱 full 3D field、8-corner calibration 或完整非連網裝置學習</w:t>
+            </w:r>
+          </w:p>
+        </w:tc>
+      </w:tr>
+    </w:tbl>
+    <w:p>
+      <w:pPr>
+        <w:spacing w:before="0" w:after="0" w:line="360" w:lineRule="auto"/>
+      </w:pPr>
+      <w:r>
+        <w:t xml:space="preserve">因此，本文後續提到「實驗」時，E1--E7 與 E9 代表已產生數值輸出的實驗或 benchmark；E8 僅代表推薦控制的實測 protocol；Web demo 與 MCP 則屬展示與服務介面，不直接作為量化實驗證據。</w:t>
+      </w:r>
+    </w:p>
+    <w:p>
+      <w:pPr>
         <w:jc w:val="center"/>
         <w:spacing w:after="120" w:line="360" w:lineRule="auto"/>
       </w:pPr>
@@ -6584,7 +7430,7 @@
         <w:rPr>
           <w:b/>
         </w:rPr>
-        <w:t xml:space="preserve">5.2 場重建誤差</w:t>
+        <w:t xml:space="preserve">5.2 【實驗 E1】標準情境場重建誤差</w:t>
       </w:r>
     </w:p>
     <w:p>
@@ -6786,7 +7632,7 @@
         <w:rPr>
           <w:b/>
         </w:rPr>
-        <w:t xml:space="preserve">5.3 IDW Baseline 比較</w:t>
+        <w:t xml:space="preserve">5.3 【實驗 E2】IDW Baseline 比較</w:t>
       </w:r>
     </w:p>
     <w:p>
@@ -7736,7 +8582,7 @@
         <w:rPr>
           <w:b/>
         </w:rPr>
-        <w:t xml:space="preserve">5.4 消融分析與可重現性補強</w:t>
+        <w:t xml:space="preserve">5.4 【實驗 E3】消融分析與可重現性補強</w:t>
       </w:r>
     </w:p>
     <w:p>
@@ -8174,7 +9020,7 @@
         <w:rPr>
           <w:b/>
         </w:rPr>
-        <w:t xml:space="preserve">5.5 非連網裝置影響學習</w:t>
+        <w:t xml:space="preserve">5.5 【實驗 E4】非連網裝置影響學習</w:t>
       </w:r>
     </w:p>
     <w:p>
@@ -8194,7 +9040,7 @@
         <w:rPr>
           <w:b/>
         </w:rPr>
-        <w:t xml:space="preserve">5.6 窗戶時段、天氣、季節矩陣與直接輸入</w:t>
+        <w:t xml:space="preserve">5.6 【實驗 E5】窗戶時段、天氣、季節矩陣與直接輸入</w:t>
       </w:r>
     </w:p>
     <w:p>
@@ -8525,7 +9371,7 @@
         <w:rPr>
           <w:b/>
         </w:rPr>
-        <w:t xml:space="preserve">5.7 Hybrid Residual Neural Network 結果</w:t>
+        <w:t xml:space="preserve">5.7 【實驗 E6】Hybrid Residual Neural Network 結果</w:t>
       </w:r>
     </w:p>
     <w:p>
@@ -8853,7 +9699,7 @@
         <w:rPr>
           <w:b/>
         </w:rPr>
-        <w:t xml:space="preserve">5.8 真實臥室快照驗證</w:t>
+        <w:t xml:space="preserve">5.8 【實驗 E7】真實臥室快照驗證</w:t>
       </w:r>
     </w:p>
     <w:p>
@@ -9393,7 +10239,7 @@
         <w:rPr>
           <w:b/>
         </w:rPr>
-        <w:t xml:space="preserve">5.8.1 推薦動作實際介入驗證方法</w:t>
+        <w:t xml:space="preserve">5.8.1 【驗證方案 E8】推薦動作實際介入驗證方法</w:t>
       </w:r>
     </w:p>
     <w:p>
@@ -9696,7 +10542,7 @@
         <w:rPr>
           <w:b/>
         </w:rPr>
-        <w:t xml:space="preserve">5.9 公開資料集執行流程與 Task-Aligned Benchmark 結果</w:t>
+        <w:t xml:space="preserve">5.9 【實驗 E9】公開資料集執行流程與 Task-Aligned Benchmark 結果</w:t>
       </w:r>
     </w:p>
     <w:p>
@@ -14641,7 +15487,7 @@
         <w:rPr>
           <w:b/>
         </w:rPr>
-        <w:t xml:space="preserve">5.11 可旋轉 3D 展示</w:t>
+        <w:t xml:space="preserve">5.11 展示 D1：可旋轉 3D 展示（非量化實驗）</w:t>
       </w:r>
     </w:p>
     <w:p>

</xml_diff>

<commit_message>
Refactor MCP server and Gemma bridge tools for enhanced functionality
- Updated the MCP server to include new tools: initialize_environment, rank_actions, and learn_impacts, while removing deprecated tools.
- Enhanced the initialize_environment tool to register devices and furniture with specified parameters.
- Modified the sample_point tool to accept both elapsed time and steady state inputs.
- Adjusted the learn_impacts tool to handle before and after observations for non-networked devices.
- Updated unit tests to reflect changes in tool names and functionalities, ensuring proper coverage for new features.
- Improved documentation and comments for clarity on tool usage and expected parameters.
</commit_message>
<xml_diff>
--- a/docs/papers/thesis/thesis_draft_zh.docx
+++ b/docs/papers/thesis/thesis_draft_zh.docx
@@ -341,7 +341,7 @@
         <w:spacing w:before="0" w:after="0" w:line="360" w:lineRule="auto"/>
       </w:pPr>
       <w:r>
-        <w:t xml:space="preserve">The prototype is implemented in Python and exposed through a local service layer, including an MCP interface and a rotatable web demo, enabling interactive scenario queries, point-level estimation, baseline comparison, appliance-impact learning, and a 48-case window simulation matrix across time of day, weather, and season. A lightweight one-bounce diffuse reflection approximation is further added to the illuminance path so that floors, walls, ceilings, and active furniture surfaces can contribute indirect fill light without requiring full optical rendering. The evaluation separates controlled full-field evidence, public task-aligned comparisons, and real sparse-calibration checks. Across the canonical scenarios, the base model achieves average MAE of 0.0474 for temperature, 0.1765 for humidity, and 2.0835 for illuminance, compared with 0.1723, 0.4633, and 75.0516 for IDW. The hybrid residual layer with Fourier low-pass denoising on temperature and humidity residual traces further reduces default held-out field MAE to 0.0023, 0.0041, and 0.1675, while leave-one-scenario-out evaluation averages 0.0017, 0.0055, and 0.1581, respectively. A preliminary seven-day real-bedroom snapshot validation reduces pillow-point MAE from 0.8967, 4.1286, and 358.6392 to 0.1676, 0.3939, and 21.3753 for temperature, humidity, and illuminance. Action recommendations are treated as model-based counterfactual rankings; causal validation of recommendation efficacy requires a before/after intervention protocol. These results indicate that sparse corner sensing can still support an interpretable and trainable indoor twin when model structure, calibration, and learning are assigned to different layers.</w:t>
+        <w:t xml:space="preserve">The prototype is implemented in Python and exposed through a local service layer, including a stateful MCP interface and a rotatable web demo. The MCP interface now focuses on practical runtime use: initializing the registered environment, sampling a target point after a specified elapsed time or steady-state interval, recording before/after observations for appliance-impact learning, running direct window-condition input, and ranking registered-device actions for a specified point target. A lightweight one-bounce diffuse reflection approximation is further added to the illuminance path so that floors, walls, ceilings, and active furniture surfaces can contribute indirect fill light without requiring full optical rendering. The evaluation separates controlled full-field evidence, public task-aligned comparisons, and real sparse-calibration checks. Across the canonical scenarios, the base model achieves average MAE of 0.0474 for temperature, 0.1765 for humidity, and 2.0835 for illuminance, compared with 0.1723, 0.4633, and 75.0516 for IDW. The hybrid residual layer with Fourier low-pass denoising on temperature and humidity residual traces further reduces default held-out field MAE to 0.0023, 0.0041, and 0.1675, while leave-one-scenario-out evaluation averages 0.0017, 0.0055, and 0.1581, respectively. A preliminary seven-day real-bedroom snapshot validation reduces pillow-point MAE from 0.8967, 4.1286, and 358.6392 to 0.1676, 0.3939, and 21.3753 for temperature, humidity, and illuminance. Action recommendations are treated as model-based counterfactual rankings; causal validation of recommendation efficacy requires a before/after intervention protocol. These results indicate that sparse corner sensing can still support an interpretable and trainable indoor twin when model structure, calibration, and learning are assigned to different layers.</w:t>
       </w:r>
     </w:p>
     <w:p>
@@ -874,14 +874,6 @@
       </w:r>
     </w:p>
     <w:p>
-      <w:pPr>
-        <w:spacing w:before="0" w:after="0" w:line="360" w:lineRule="auto"/>
-      </w:pPr>
-      <w:r>
-        <w:t xml:space="preserve">附錄 D 後續 IEEE 稿件資料來源原則…… 24</w:t>
-      </w:r>
-    </w:p>
-    <w:p>
       <w:r>
         <w:br w:type="page"/>
       </w:r>
@@ -1578,7 +1570,7 @@
         <w:spacing w:before="0" w:after="0" w:line="360" w:lineRule="auto"/>
       </w:pPr>
       <w:r>
-        <w:t xml:space="preserve">Model Context Protocol（MCP）提供一種標準化工具介面，使外部模型或 AI client 能以一致方式呼叫系統能力。本研究將數位孿生原型封裝為本地 MCP server，使情境查詢、場估計、動作排序、點位取樣與窗戶條件模擬等功能，可被 AI agent 直接使用。需要強調的是，MCP 在本研究中的角色屬於系統整合與工具化封裝，用以驗證數位孿生模型可被外部 AI 系統操作，而非針對 MCP 通訊協定本身提出新方法。</w:t>
+        <w:t xml:space="preserve">Model Context Protocol（MCP）提供一種標準化工具介面，使外部模型或 AI client 能以一致方式呼叫系統能力。本研究將數位孿生原型封裝為本地 MCP server，但其角色不是執行論文驗證實驗，而是提供實際互動流程：先初始化環境、設備、家具與室內 baseline，再查詢指定座標於特定時間或準穩態下的三因子估計，並可建立 before/after 裝置影響學習紀錄、直接輸入窗戶外部資料，以及針對指定座標目標排序控制候選動作。需要強調的是，MCP 在本研究中的角色屬於系統整合與工具化封裝，用以驗證數位孿生模型可被外部 AI 系統操作，而非針對 MCP 通訊協定本身提出新方法。</w:t>
       </w:r>
     </w:p>
     <w:p>
@@ -4439,7 +4431,7 @@
         <w:spacing w:before="0" w:after="0" w:line="360" w:lineRule="auto"/>
       </w:pPr>
       <w:r>
-        <w:t xml:space="preserve">在目前的實作中，hybrid residual 訓練可選擇再加入 Fourier low-pass denoising。具體作法是：先針對同一採樣點沿 elapsed time 建立一段短 residual trace，再將該 trace 做 discrete Fourier transform、套用低通遮罩，最後以 inverse transform 還原較平滑的 residual target。根據目前實驗，此做法對 temperature 幾乎不改變結果，對 humidity 有小幅改善，但若直接套用到 illuminance 則會抹去有用的快速變化，因此目前只對 temperature 與 humidity 啟用。</w:t>
+        <w:t xml:space="preserve">在目前的實作中，hybrid residual 訓練可選擇再加入 Fourier low-pass denoising。具體作法是：先針對同一採樣點沿 elapsed time 建立一段短 residual trace，再將該 trace 做 discrete Fourier transform、套用低通遮罩，最後以 inverse transform 還原較平滑的 residual target。根據目前實驗，此做法對 temperature 幾乎不改變結果，對 humidity 有小幅改善，但若直接套用到 illuminance 則會抹去有用的快速變化，因此目前只對 temperature 與 humidity 啟用。這個設計來自三個環境因子的物理特性差異：temperature 與 humidity 主要受熱容量、空氣混合、水氣交換與除濕作用影響，時間變化通常較平滑，高頻成分較可能是感測雜訊或短時擾動；illuminance 則直接受燈具開關、窗戶日照、遮蔽邊界、家具陰影與反射路徑影響，場值可能在短時間內出現物理上有意義的跳變。因此，照度 residual 的高頻部分不應被一律視為雜訊，否則會削弱模型對光源與遮蔽快速變化的學習能力。</w:t>
       </w:r>
     </w:p>
     <w:p>
@@ -4529,7 +4521,7 @@
         <w:spacing w:before="0" w:after="0" w:line="360" w:lineRule="auto"/>
       </w:pPr>
       <w:r>
-        <w:t xml:space="preserve">本研究將座標、時間、室內外環境條件、主模型估計值、設備 activation、設備 power 與 influence envelope 作為輸入特徵，分別為溫度、濕度與照度訓練三個小型殘差網路。若啟用頻域去噪，temperature 與 humidity 會先將 $R_v^*$ 沿短時間軌跡做 Fourier low-pass denoising，再送入 MLP 訓練；illuminance 則保留原始 residual target。此設計的目的在於保留主模型可解釋性，同時以資料驅動方式修正其剩餘誤差。</w:t>
+        <w:t xml:space="preserve">本研究將座標、時間、室內外環境條件、主模型估計值、設備 activation、設備 power 與 influence envelope 作為輸入特徵，分別為溫度、濕度與照度訓練三個小型殘差網路。若啟用頻域去噪，temperature 與 humidity 會先將 $R_v^*$ 沿短時間軌跡做 Fourier low-pass denoising，再送入 MLP 訓練；illuminance 則保留原始 residual target。此設計的目的在於保留主模型可解釋性，同時尊重三因子的物理差異：溫度與濕度 residual 較適合被平滑為低頻趨勢，照度 residual 則需保留由光源、日照、遮蔽與反射造成的短時結構。</w:t>
       </w:r>
     </w:p>
     <w:p>
@@ -5174,33 +5166,33 @@
               <w:spacing w:before="0" w:after="0" w:line="360" w:lineRule="auto"/>
             </w:pPr>
             <w:r>
-              <w:t xml:space="preserve">溫度與濕度 residual 常含短時感測雜訊，直接訓練會使模型學到高頻擾動。</w:t>
-            </w:r>
-          </w:p>
-        </w:tc>
-        <w:tc>
-          <w:tcPr>
-            <w:tcW w:w="2200" w:type="dxa"/>
-          </w:tcPr>
-          <w:p>
-            <w:pPr>
-              <w:spacing w:before="0" w:after="0" w:line="360" w:lineRule="auto"/>
-            </w:pPr>
-            <w:r>
-              <w:t xml:space="preserve">在頻域抑制高頻成分並保留低頻趨勢，讓 residual target 更接近可重現的環境變化。</w:t>
-            </w:r>
-          </w:p>
-        </w:tc>
-        <w:tc>
-          <w:tcPr>
-            <w:tcW w:w="2200" w:type="dxa"/>
-          </w:tcPr>
-          <w:p>
-            <w:pPr>
-              <w:spacing w:before="0" w:after="0" w:line="360" w:lineRule="auto"/>
-            </w:pPr>
-            <w:r>
-              <w:t xml:space="preserve">本文不將它套用於照度 residual，因為照明變化本身可能具有快速且有意義的跳變。</w:t>
+              <w:t xml:space="preserve">溫度與濕度受熱容量、空氣混合與水氣交換影響，時間響應相對平滑，residual 中的高頻成分較常是短時雜訊或擾動。</w:t>
+            </w:r>
+          </w:p>
+        </w:tc>
+        <w:tc>
+          <w:tcPr>
+            <w:tcW w:w="2200" w:type="dxa"/>
+          </w:tcPr>
+          <w:p>
+            <w:pPr>
+              <w:spacing w:before="0" w:after="0" w:line="360" w:lineRule="auto"/>
+            </w:pPr>
+            <w:r>
+              <w:t xml:space="preserve">在頻域抑制高頻成分並保留低頻趨勢，讓 temperature/humidity residual target 更接近可重現的環境變化。</w:t>
+            </w:r>
+          </w:p>
+        </w:tc>
+        <w:tc>
+          <w:tcPr>
+            <w:tcW w:w="2200" w:type="dxa"/>
+          </w:tcPr>
+          <w:p>
+            <w:pPr>
+              <w:spacing w:before="0" w:after="0" w:line="360" w:lineRule="auto"/>
+            </w:pPr>
+            <w:r>
+              <w:t xml:space="preserve">本文不將它套用於照度 residual，因為照度受燈具開關、日照、遮蔽、陰影與反射影響，快速變化本身可能是有物理意義的訊號。</w:t>
             </w:r>
           </w:p>
         </w:tc>
@@ -5700,7 +5692,7 @@
         <w:spacing w:before="0" w:after="0" w:line="360" w:lineRule="auto"/>
       </w:pPr>
       <w:r>
-        <w:t xml:space="preserve">本地 MCP server 提供下列 tools：</w:t>
+        <w:t xml:space="preserve">本地 MCP server 目前保留五個互動流程 tools：</w:t>
       </w:r>
     </w:p>
     <w:p>
@@ -5709,7 +5701,7 @@
         <w:spacing w:before="0" w:after="0" w:line="360" w:lineRule="auto"/>
       </w:pPr>
       <w:r>
-        <w:t xml:space="preserve">• list_scenarios：列出 8 組標準驗證情境。</w:t>
+        <w:t xml:space="preserve">• initialize_environment：初始化 MCP session 中的情境、註冊設備、家具阻擋物、外部環境與室內 baseline。</w:t>
       </w:r>
     </w:p>
     <w:p>
@@ -5718,7 +5710,7 @@
         <w:spacing w:before="0" w:after="0" w:line="360" w:lineRule="auto"/>
       </w:pPr>
       <w:r>
-        <w:t xml:space="preserve">• list_window_scenarios：列出 48 組窗戶時段/天氣/季節情境。</w:t>
+        <w:t xml:space="preserve">• sample_point：估計指定座標在特定 elapsed minutes 或 steady state 下的 temperature、humidity 與 illuminance，用於補足非感測點狀態。</w:t>
       </w:r>
     </w:p>
     <w:p>
@@ -5727,7 +5719,7 @@
         <w:spacing w:before="0" w:after="0" w:line="360" w:lineRule="auto"/>
       </w:pPr>
       <w:r>
-        <w:t xml:space="preserve">• run_scenario：執行情境並回傳重建誤差與目標區域估計。</w:t>
+        <w:t xml:space="preserve">• learn_impacts：針對某個非連網設備建立 before/after observation record；只有同時具備開啟前與開啟後的真實感測讀值時，才計算 learned impact coefficients。</w:t>
       </w:r>
     </w:p>
     <w:p>
@@ -5736,7 +5728,7 @@
         <w:spacing w:before="0" w:after="0" w:line="360" w:lineRule="auto"/>
       </w:pPr>
       <w:r>
-        <w:t xml:space="preserve">• rank_actions：依目標區域舒適度改善排序候選動作。</w:t>
+        <w:t xml:space="preserve">• run_window_direct：直接輸入外部溫度、濕度、日照與開窗比例，執行窗戶影響模擬，並可更新目前 MCP session 的外部環境。</w:t>
       </w:r>
     </w:p>
     <w:p>
@@ -5745,43 +5737,15 @@
         <w:spacing w:before="0" w:after="0" w:line="360" w:lineRule="auto"/>
       </w:pPr>
       <w:r>
-        <w:t xml:space="preserve">• sample_point：估計指定座標的 temperature、humidity 與 illuminance。</w:t>
-      </w:r>
-    </w:p>
-    <w:p>
-      <w:pPr>
-        <w:ind w:left="720" w:hanging="360" w:firstLine="0"/>
-        <w:spacing w:before="0" w:after="0" w:line="360" w:lineRule="auto"/>
-      </w:pPr>
-      <w:r>
-        <w:t xml:space="preserve">• compare_baseline：比較本研究模型與 IDW baseline。</w:t>
-      </w:r>
-    </w:p>
-    <w:p>
-      <w:pPr>
-        <w:ind w:left="720" w:hanging="360" w:firstLine="0"/>
-        <w:spacing w:before="0" w:after="0" w:line="360" w:lineRule="auto"/>
-      </w:pPr>
-      <w:r>
-        <w:t xml:space="preserve">• learn_impacts：由前後感測資料學習非連網裝置影響。</w:t>
-      </w:r>
-    </w:p>
-    <w:p>
-      <w:pPr>
-        <w:ind w:left="720" w:hanging="360" w:firstLine="0"/>
-        <w:spacing w:before="0" w:after="0" w:line="360" w:lineRule="auto"/>
-      </w:pPr>
-      <w:r>
-        <w:t xml:space="preserve">• run_window_matrix：執行全部 48 組窗戶矩陣模擬。</w:t>
-      </w:r>
-    </w:p>
-    <w:p>
-      <w:pPr>
-        <w:ind w:left="720" w:hanging="360" w:firstLine="0"/>
-        <w:spacing w:before="0" w:after="0" w:line="360" w:lineRule="auto"/>
-      </w:pPr>
-      <w:r>
-        <w:t xml:space="preserve">• run_window_direct：直接輸入外部溫度、濕度、日照與開窗比例，執行窗戶影響模擬。</w:t>
+        <w:t xml:space="preserve">• rank_actions：輸入指定座標與目標三因子值，根據目前註冊設備產生候選操作並依 comfort penalty 改善量排序。</w:t>
+      </w:r>
+    </w:p>
+    <w:p>
+      <w:pPr>
+        <w:spacing w:before="0" w:after="0" w:line="360" w:lineRule="auto"/>
+      </w:pPr>
+      <w:r>
+        <w:t xml:space="preserve">早期用於驗證或展示的 list_scenarios、run_scenario、compare_baseline 與 run_window_matrix 仍可由實驗腳本或 web demo 使用，但不再作為 MCP 對外工具。此重構使 MCP 的定位更接近實際 runtime：先註冊環境，再查點位、記錄學習資料、輸入窗戶資料與排序控制動作。</w:t>
       </w:r>
     </w:p>
     <w:p>
@@ -16813,7 +16777,7 @@
               <w:spacing w:before="0" w:after="0" w:line="360" w:lineRule="auto"/>
             </w:pPr>
             <w:r>
-              <w:t xml:space="preserve">對 temperature 與 humidity residual trace 做低通濾波，降低高頻雜訊對 residual training 的影響。</w:t>
+              <w:t xml:space="preserve">對 temperature 與 humidity residual trace 做低通濾波，降低高頻雜訊對 residual training 的影響；不套用於 illuminance，因為照度可能因光源、日照與遮蔽產生有物理意義的快速變化。</w:t>
             </w:r>
           </w:p>
         </w:tc>
@@ -17127,34 +17091,6 @@
         </w:tc>
       </w:tr>
     </w:tbl>
-    <w:p>
-      <w:pPr>
-        <w:pStyle w:val="Heading1"/>
-        <w:spacing w:before="0" w:after="0" w:line="360" w:lineRule="auto"/>
-      </w:pPr>
-      <w:r>
-        <w:rPr>
-          <w:b/>
-        </w:rPr>
-        <w:t xml:space="preserve">附錄 D：後續 IEEE 稿件資料來源原則</w:t>
-      </w:r>
-    </w:p>
-    <w:p>
-      <w:pPr>
-        <w:spacing w:before="0" w:after="0" w:line="360" w:lineRule="auto"/>
-      </w:pPr>
-      <w:r>
-        <w:t xml:space="preserve">本中文論文完整稿作為後續 IEEE 稿件的主要資料來源。未來若需撰寫或修改 IEEE paper，應先從本中文論文抽取研究問題、方法架構、實驗設定、資料集限制、評估指標、表格數字與結論，再依 IEEE 篇幅壓縮文字；不應在 IEEE 稿件中另行加入與中文論文不同的 benchmark 數字、claim boundary 或方法描述。</w:t>
-      </w:r>
-    </w:p>
-    <w:p>
-      <w:pPr>
-        <w:spacing w:before="0" w:after="0" w:line="360" w:lineRule="auto"/>
-      </w:pPr>
-      <w:r>
-        <w:t xml:space="preserve">若後續實驗新增或數字更新，應先更新中文論文與其輸出，再由中文論文同步萃取到 IEEE 稿件。對公開資料集尤其要保留本論文的限制寫法：SML2010 與 CU-BEMS 可支援 task-aligned external benchmark，但不能宣稱完整 3D field MAE、8-corner calibration 或完整非連網裝置係數學習。</w:t>
-      </w:r>
-    </w:p>
     <w:sectPr>
       <w:pgSz w:w="11906" w:h="16838"/>
       <w:pgMar w:top="1440" w:right="1440" w:bottom="1440" w:left="1440" w:header="720" w:footer="720" w:gutter="0"/>

</xml_diff>

<commit_message>
Refactor thesis draft and presentation materials for clarity and consistency
- Updated the thesis draft (zh) to improve the abstract and summary sections, enhancing the description of the sparse-sensing spatial digital twin and its evaluation methods.
- Revised the presentation outline for the 30-minute presentation to reflect changes in terminology from "scenario" to "runtime request" for better accuracy.
- Modified figures and descriptions in the thesis draft to align with the updated terminology and improve the overall flow of information.
- Adjusted the build scripts for both the thesis document and presentation to ensure the latest content is accurately reflected in the generated outputs.
</commit_message>
<xml_diff>
--- a/docs/papers/thesis/thesis_draft_zh.docx
+++ b/docs/papers/thesis/thesis_draft_zh.docx
@@ -268,31 +268,15 @@
         <w:spacing w:before="0" w:after="0" w:line="360" w:lineRule="auto"/>
       </w:pPr>
       <w:r>
-        <w:t xml:space="preserve">智慧建築與智慧居家系統需要掌握室內環境狀態，才能支援舒適度評估、能源管理與設備控制。然而，實際房間中常見的冷氣、窗戶與照明往往沒有連網能力，也無法直接回報狀態；同時，房間內通常只能布建少量感測器，難以直接量測完整空間分布。這使得一般數位孿生若同時缺乏設備遙測與高密度量測，便難以對真實房間提供可用的環境估計與控制建議。</w:t>
-      </w:r>
-    </w:p>
-    <w:p>
-      <w:pPr>
-        <w:spacing w:before="0" w:after="0" w:line="360" w:lineRule="auto"/>
-      </w:pPr>
-      <w:r>
-        <w:t xml:space="preserve">本研究以單一矩形房間為研究場域，提出一個基於有限角落感測器與連續影響場估計之三因子空間數位孿生原型。研究過程中，本研究先後比較純插值、僅局部影響場與資料驅動修正等作法，最終採用變數專屬的 reduced-order nominal model 作為主模型，分別以熱交換與熱源項描述溫度、以水氣交換與除濕項描述濕度、以光源幾何、遮蔽與單次漫反射描述照度，再以冷氣、窗戶與照明之參數化影響函數描述非連網裝置對不同區域的作用。系統固定使用 8 顆角落感測器，即天花板四角與地面四角，每個節點量測溫度、濕度與照度，並以感測器殘差進行主動設備 power scale 校準與 trilinear residual correction，以修正背景場與設備影響函數之偏差。在此基礎上，本研究再加入 hybrid residual neural network 延伸模組，以小型多層感知器學習主模型的剩餘誤差，而不直接取代原本的可解釋結構。</w:t>
-      </w:r>
-    </w:p>
-    <w:p>
-      <w:pPr>
-        <w:spacing w:before="0" w:after="0" w:line="360" w:lineRule="auto"/>
-      </w:pPr>
-      <w:r>
-        <w:t xml:space="preserve">除空間場估計外，本研究亦建立裝置啟用前後感測資料之影響學習流程，透過最小平方法估計非連網裝置的環境影響係數，並根據目標區域的舒適度偏差輸出候選控制動作排序。為補足 direct source + obstruction 對照度間接回填亮度的低估，本研究另在 illuminance 路徑加入 lightweight single-bounce diffuse reflection 近似，以地板、天花板、牆面與啟用中的家具表面作為次級反射面。為提升系統可存取性，本研究另提供本地服務介面，其中包含 MCP server 與 web demo，作為同一套模型能力的工具化存取層。評估方面，本研究採分層證據設計：以 8 組標準情境、48 組窗戶矩陣、IDW baseline 比較、synthetic ablation 與 hybrid residual leave-one-scenario-out 測試支持受控條件下的完整場重建主張；以公開資料集 task-aligned benchmark 檢查外部資料相容子任務；以 7 天真實臥室快照檢查稀疏感測校正對未參與校正點位的改善。其中 base model 在標準情境下之平均 MAE 分別為溫度 0.0474、濕度 0.1765 與照度 2.0835，明顯低於 IDW baseline 的 0.1723、0.4633 與 75.0516。加入 Fourier low-pass denoising 的 hybrid residual correction 在預設 6/2 held-out split 中可將 field MAE 降至溫度 0.0023、濕度 0.0041 與照度 0.1675；8-fold leave-one-scenario-out 平均則為 0.0017、0.0055 與 0.1581。真實臥室快照驗證中，校正後 pillow 位置 MAE 由 0.8967°C、4.1286% 與 358.6392 lux 降至 0.1676°C、0.3939% 與 21.3753 lux。推薦動作目前定位為基於校正模型的反事實模擬排序；若要驗證其實際因果改善效果，需進一步執行 before/after 介入實驗。</w:t>
-      </w:r>
-    </w:p>
-    <w:p>
-      <w:pPr>
-        <w:spacing w:before="0" w:after="0" w:line="360" w:lineRule="auto"/>
-      </w:pPr>
-      <w:r>
-        <w:t xml:space="preserve">公開資料集比較方面，本研究不是將公開資料硬解讀為完整 3D 場真值，而是把 SML2010 與 CU-BEMS 拆成公開資料本身可支援的 shared observable tasks，再以相同 chronological 70/30 split 比較 persistence、linear regression 與本研究模型映射後的 hybrid_digital_twin_readout。SML2010 共 24 個 target-horizon 任務中，本研究映射模型有 12 項取得最低 MAE，15 項勝過 linear regression，14 項勝過 persistence；其中 S3 facade event delta 在 60 分鐘 horizon 的 6 個 target 全部優於兩個 baseline。CU-BEMS 共 12 個 target-horizon 任務中，本研究映射模型有 9 項勝過 linear regression，但沒有任務勝過 persistence，顯示其優勢主要出現在具有幾何、邊界或事件結構的響應任務，而非所有高時間慣性建築時序預測任務。Web demo 也新增 Term Glossary 與 Public Dataset Comparison 區塊，使展示時可直接說明名詞、比較流程、數據來源與 claim boundary。</w:t>
+        <w:t xml:space="preserve">智慧建築與智慧居家系統需要掌握室內環境狀態，才能支援舒適度評估、能源管理與設備控制。然而，一般房間中的冷氣、窗戶與照明常不具備連網遙測能力，室內也通常只能布建少量感測器，難以直接取得完整空間分布。本研究以單一矩形房間為場域，提出以 8 顆角落感測器支援之三因子空間數位孿生原型，針對 temperature、humidity 與 illuminance 建立變數專屬的 reduced-order nominal model：溫度以熱交換與熱源項描述，濕度以水氣交換與除濕項描述，照度以光源幾何、遮蔽與 single-bounce diffuse reflection 描述。系統再結合冷氣、窗戶與照明的參數化影響函數、active-device power calibration 與 trilinear residual correction，從稀疏觀測修正空間場估計；並以 hybrid residual neural network 學習主模型剩餘誤差，而不以純黑盒模型取代可解釋結構。</w:t>
+      </w:r>
+    </w:p>
+    <w:p>
+      <w:pPr>
+        <w:spacing w:before="0" w:after="0" w:line="360" w:lineRule="auto"/>
+      </w:pPr>
+      <w:r>
+        <w:t xml:space="preserve">評估採分層證據設計，分別檢查受控完整場重建、公開資料相容子任務與真實稀疏校正。8 組標準情境中，base model 的平均 field MAE 為溫度 0.0474、濕度 0.1765、照度 2.0835，低於 IDW baseline 的 0.1723、0.4633、75.0516；hybrid residual leave-one-scenario-out 平均進一步降至 0.0017、0.0055、0.1581。7 天 real-bedroom snapshot 中，pillow 參考點校正後 MAE 由 0.8967°C、4.1286% 與 358.6392 lux 降至 0.1676°C、0.3939% 與 21.3753 lux。公開資料集 SML2010 與 CU-BEMS 僅作 task-aligned benchmark，不宣稱 full 3D dense-field 驗證；SML2010 的 24 個任務中有 12 項取得最低 MAE，CU-BEMS 的 12 個任務中有 9 項優於 linear regression 但 0 項優於 persistence。結果顯示，稀疏角落感測在搭配變數專屬物理結構、校正與殘差學習時，可支援可解釋且可訓練的室內環境場估計；推薦動作目前仍屬模型反事實排序，實際因果改善需後續 before/after 介入驗證。</w:t>
       </w:r>
     </w:p>
     <w:p>
@@ -325,31 +309,15 @@
         <w:spacing w:before="0" w:after="0" w:line="360" w:lineRule="auto"/>
       </w:pPr>
       <w:r>
-        <w:t xml:space="preserve">Smart building and smart home systems require indoor environmental awareness to support comfort assessment, energy management, and device control. In ordinary rooms, however, influential appliances such as conventional air conditioners, manual windows, and ordinary lights often expose no telemetry, while only a small number of sensors can be installed. As a result, practical room-scale digital twins must work with both sparse observations and incomplete device-state information.</w:t>
-      </w:r>
-    </w:p>
-    <w:p>
-      <w:pPr>
-        <w:spacing w:before="0" w:after="0" w:line="360" w:lineRule="auto"/>
-      </w:pPr>
-      <w:r>
-        <w:t xml:space="preserve">This thesis proposes a sparse-sensing spatial digital twin for a single room. The final design uses variable-specific reduced-order nominal models with parameterized appliance influence functions, active-device power calibration, and trilinear residual correction from eight corner sensors: temperature is modeled through thermal exchange and heat-source terms, humidity through moisture exchange and dehumidification terms, and illuminance through source geometry, obstruction, and a lightweight one-bounce reflection approximation. The system further learns environmental impact coefficients of non-networked appliances from before-and-after sensor observations, ranks candidate control actions according to target-zone comfort improvement, and extends the base estimator with an optional hybrid residual neural correction layer instead of replacing the base model with an end-to-end black-box predictor.</w:t>
-      </w:r>
-    </w:p>
-    <w:p>
-      <w:pPr>
-        <w:spacing w:before="0" w:after="0" w:line="360" w:lineRule="auto"/>
-      </w:pPr>
-      <w:r>
-        <w:t xml:space="preserve">The prototype is implemented in Python and exposed through a local service layer, including a stateful MCP interface and a rotatable web demo. The MCP interface now focuses on practical runtime use: initializing the registered environment, sampling a target point after a specified elapsed time or steady-state interval, recording before/after observations for appliance-impact learning, running direct window-condition input, and ranking registered-device actions for a specified point target. A lightweight one-bounce diffuse reflection approximation is further added to the illuminance path so that floors, walls, ceilings, and active furniture surfaces can contribute indirect fill light without requiring full optical rendering. The evaluation separates controlled full-field evidence, public task-aligned comparisons, and real sparse-calibration checks. Across the canonical scenarios, the base model achieves average MAE of 0.0474 for temperature, 0.1765 for humidity, and 2.0835 for illuminance, compared with 0.1723, 0.4633, and 75.0516 for IDW. The hybrid residual layer with Fourier low-pass denoising on temperature and humidity residual traces further reduces default held-out field MAE to 0.0023, 0.0041, and 0.1675, while leave-one-scenario-out evaluation averages 0.0017, 0.0055, and 0.1581, respectively. A preliminary seven-day real-bedroom snapshot validation reduces pillow-point MAE from 0.8967, 4.1286, and 358.6392 to 0.1676, 0.3939, and 21.3753 for temperature, humidity, and illuminance. Action recommendations are treated as model-based counterfactual rankings; causal validation of recommendation efficacy requires a before/after intervention protocol. These results indicate that sparse corner sensing can still support an interpretable and trainable indoor twin when model structure, calibration, and learning are assigned to different layers.</w:t>
-      </w:r>
-    </w:p>
-    <w:p>
-      <w:pPr>
-        <w:spacing w:before="0" w:after="0" w:line="360" w:lineRule="auto"/>
-      </w:pPr>
-      <w:r>
-        <w:t xml:space="preserve">For public head-to-head comparison, SML2010 and CU-BEMS are used only as task-aligned external benchmarks rather than dense 3D field ground truth. Raw public data are normalized, baseline models are evaluated on the same chronological 70/30 split, and the proposed digital twin plus hybrid residual checkpoint is mapped into a structured prior with a small linear readout head. The SML2010 comparison shows the strongest advantage on facade event delta tasks, especially the 60-minute horizon where all six S3 targets achieve the best MAE. CU-BEMS shows a different pattern: the mapped model often improves over linear regression but does not outperform persistence, which clarifies the model's claim boundary. The web demo exposes this comparison through a Public Dataset Comparison panel and includes a Term Glossary for presentation use.</w:t>
+        <w:t xml:space="preserve">Smart building and smart home systems require indoor environmental awareness for comfort assessment, energy management, and device control. In ordinary rooms, however, air conditioners, manual windows, and lights often expose no telemetry, while only a small number of sensors can be installed. This thesis proposes a sparse-sensing spatial digital twin for a single rectangular room using eight corner sensors. The model uses variable-specific reduced-order nominal structures: temperature is represented by thermal exchange and heat-source terms, humidity by moisture exchange and dehumidification terms, and illuminance by source geometry, obstruction, and a lightweight single-bounce diffuse reflection approximation. Parameterized appliance influence functions, active-device power calibration, and trilinear residual correction are used to estimate the room field from sparse observations, and a hybrid residual neural network learns remaining systematic error without replacing the interpretable base model.</w:t>
+      </w:r>
+    </w:p>
+    <w:p>
+      <w:pPr>
+        <w:spacing w:before="0" w:after="0" w:line="360" w:lineRule="auto"/>
+      </w:pPr>
+      <w:r>
+        <w:t xml:space="preserve">The evaluation separates controlled full-field reconstruction, public task-aligned benchmarks, and real sparse-calibration checks. Across eight canonical scenarios, the base model achieves average field MAE of 0.0474/0.1765/2.0835 for temperature, humidity, and illuminance, compared with 0.1723/0.4633/75.0516 for IDW. Leave-one-scenario-out hybrid residual correction further reduces MAE to 0.0017/0.0055/0.1581. In a seven-day real-bedroom snapshot, pillow-point calibration error is reduced from 0.8967°C, 4.1286%, and 358.6392 lux to 0.1676°C, 0.3939%, and 21.3753 lux. SML2010 and CU-BEMS are used only as compatible task-aligned external benchmarks rather than dense 3-D spatial ground truth: the mapped model obtains the lowest MAE in 12 of 24 SML2010 tasks, and outperforms linear regression in 9 of 12 CU-BEMS tasks but never outperforms persistence on CU-BEMS. These results show that sparse corner sensing can support an interpretable and trainable indoor environmental field estimator when physical structure, calibration, and residual learning are assigned complementary roles. Action recommendations remain model-based counterfactual rankings and require future before/after intervention validation for causal claims.</w:t>
       </w:r>
     </w:p>
     <w:p>
@@ -2841,7 +2809,7 @@
         <w:drawing>
           <wp:inline distT="0" distB="0" distL="0" distR="0">
             <wp:extent cx="5943600" cy="5943600"/>
-            <wp:docPr id="2" name="圖 3-2 主要執行資料流。此圖對應一次 scenario 評估如何從輸入設定、場估計、校正、到 dashboard 與 MCP 輸出。"/>
+            <wp:docPr id="2" name="圖 3-2 主要執行資料流。此圖對應一次 runtime request 如何從輸入設定、場估計、校正，到 dashboard 或 MCP 輸出。"/>
             <wp:cNvGraphicFramePr>
               <a:graphicFrameLocks noChangeAspect="1"/>
             </wp:cNvGraphicFramePr>
@@ -2849,7 +2817,7 @@
               <a:graphicData uri="http://schemas.openxmlformats.org/drawingml/2006/picture">
                 <pic:pic>
                   <pic:nvPicPr>
-                    <pic:cNvPr id="2" name="圖 3-2 主要執行資料流。此圖對應一次 scenario 評估如何從輸入設定、場估計、校正、到 dashboard 與 MCP 輸出。"/>
+                    <pic:cNvPr id="2" name="圖 3-2 主要執行資料流。此圖對應一次 runtime request 如何從輸入設定、場估計、校正，到 dashboard 或 MCP 輸出。"/>
                     <pic:cNvPicPr/>
                   </pic:nvPicPr>
                   <pic:blipFill>
@@ -2881,7 +2849,7 @@
         <w:spacing w:before="0" w:after="0" w:line="360" w:lineRule="auto"/>
       </w:pPr>
       <w:r>
-        <w:t xml:space="preserve">圖 3-2 主要執行資料流。此圖對應一次 scenario 評估如何從輸入設定、場估計、校正、到 dashboard 與 MCP 輸出。</w:t>
+        <w:t xml:space="preserve">圖 3-2 主要執行資料流。此圖對應一次 runtime request 如何從輸入設定、場估計、校正，到 dashboard 或 MCP 輸出。</w:t>
       </w:r>
     </w:p>
     <w:p>

</xml_diff>

<commit_message>
feat: Enhance thesis presentation and public benchmark integration
- Added new slides for public benchmark task breakdowns (SML2010 and CU-BEMS) in the thesis presentation.
- Updated existing slides with refined bullet points and improved clarity.
- Introduced a new directory for public benchmark figures and modified the presentation script to include these figures.
- Enhanced the `run_all_thesis_experiments.py` script to check for public comparison outputs and generate figures accordingly.
- Updated tests in `test_gemma_bridge.py` and `test_mcp_server.py` to validate new target parameters for the rank actions tool.
- Ensured that the rank actions tool requires complete target information and added corresponding error handling in tests.
</commit_message>
<xml_diff>
--- a/docs/papers/thesis/thesis_draft_zh.docx
+++ b/docs/papers/thesis/thesis_draft_zh.docx
@@ -1229,7 +1229,7 @@
         <w:spacing w:before="0" w:after="0" w:line="360" w:lineRule="auto"/>
       </w:pPr>
       <w:r>
-        <w:t xml:space="preserve">• 學習裝置影響後，模型應能支援開冷氣、開窗或開燈等候選控制動作排序。</w:t>
+        <w:t xml:space="preserve">• 學習裝置影響後，模型應能在已指定 point/cluster sample 與三因子目標時，支援開冷氣、開窗或開燈等候選控制動作排序。</w:t>
       </w:r>
     </w:p>
     <w:p>
@@ -1277,7 +1277,7 @@
         <w:spacing w:before="0" w:after="0" w:line="360" w:lineRule="auto"/>
       </w:pPr>
       <w:r>
-        <w:t xml:space="preserve">• RQ3：學習後的裝置影響模型，是否能依三因子偏差輸出候選控制動作排序，例如選擇開冷氣、開窗或開燈，且推薦動作的實際可行性應如何透過介入式 before/after 實驗驗證？</w:t>
+        <w:t xml:space="preserve">• RQ3：學習後的裝置影響模型，是否能在明確 point/cluster sample 與溫度、濕度、照度目標下，依三因子偏差輸出候選控制動作排序，例如選擇開冷氣、開窗或開燈，且推薦動作的實際可行性應如何透過介入式 before/after 實驗驗證？</w:t>
       </w:r>
     </w:p>
     <w:p>
@@ -1562,7 +1562,7 @@
         <w:spacing w:before="0" w:after="0" w:line="360" w:lineRule="auto"/>
       </w:pPr>
       <w:r>
-        <w:t xml:space="preserve">Model Context Protocol（MCP）提供一種標準化工具介面，使外部模型或 AI client 能以一致方式呼叫系統能力。本研究將數位孿生原型封裝為本地 MCP server，但其角色不是執行論文驗證實驗，而是提供實際互動流程：先初始化 MCP session 的 runtime state，包含 base scenario、室內 baseline、外部邊界條件、註冊設備、家具/遮蔽物、預設時間與 estimator 選擇，再查詢指定座標於特定時間或準穩態下的三因子估計，並可建立 before/after 裝置影響學習紀錄、直接輸入窗戶外部資料，以及針對指定座標目標排序控制候選動作。需要強調的是，MCP 在本研究中的角色屬於系統整合與工具化封裝，用以驗證數位孿生模型可被外部 AI 系統操作，而非針對 MCP 通訊協定本身提出新方法。</w:t>
+        <w:t xml:space="preserve">Model Context Protocol（MCP）提供一種標準化工具介面，使外部模型或 AI client 能以一致方式呼叫系統能力。本研究將數位孿生原型封裝為本地 MCP server，但其角色不是執行論文驗證實驗，而是提供實際互動流程：先初始化 MCP session 的 runtime state，包含 base scenario、室內 baseline、外部邊界條件、註冊設備、家具/遮蔽物、預設時間與 estimator 選擇，再查詢指定座標於特定時間或準穩態下的三因子估計，並可建立 before/after 裝置影響學習紀錄、直接輸入窗戶外部資料，以及在指定座標 sample 與完整溫度、濕度、照度目標都存在時排序控制候選動作。需要強調的是，MCP 在本研究中的角色屬於系統整合與工具化封裝，用以驗證數位孿生模型可被外部 AI 系統操作，而非針對 MCP 通訊協定本身提出新方法。</w:t>
       </w:r>
     </w:p>
     <w:p>
@@ -2769,7 +2769,7 @@
         <w:spacing w:before="0" w:after="0" w:line="360" w:lineRule="auto"/>
       </w:pPr>
       <w:r>
-        <w:t xml:space="preserve">本研究系統由五個主要模組組成：房間與設備設定、三因子影響場模型、角落感測器校正、非連網裝置影響學習、以及控制動作排序與 MCP 工具介面。整體流程為：輸入房間幾何、設備位置與外部環境條件後，模型先建立背景場，再加入設備影響函數，接著使用 8 顆角落感測器觀測值校準 active device power scale 並建立 trilinear 校正場，最後輸出任意座標或目標區域的三因子估計與候選控制動作排序。</w:t>
+        <w:t xml:space="preserve">本研究系統由五個主要模組組成：房間與設備設定、三因子影響場模型、角落感測器校正、非連網裝置影響學習、以及控制動作排序與 MCP 工具介面。整體流程為：輸入房間幾何、設備位置與外部環境條件後，模型先建立背景場，再加入設備影響函數，接著使用 8 顆角落感測器觀測值校準 active device power scale 並建立 trilinear 校正場，最後輸出任意座標或目標區域的三因子估計；只有在已有 point/cluster sample 與完整三因子目標時，才進一步輸出候選控制動作排序。</w:t>
       </w:r>
     </w:p>
     <w:p>
@@ -2780,7 +2780,7 @@
       <w:r>
         <w:drawing>
           <wp:inline distT="0" distB="0" distL="0" distR="0">
-            <wp:extent cx="5303520" cy="5303520"/>
+            <wp:extent cx="5303520" cy="3077193"/>
             <wp:docPr id="1" name="圖 3-1 系統整體分層架構。此圖說明人機互動或 AI 工具呼叫如何經由服務編排層進入環境數位孿生核心、校正與影響學習層，以及 optional residual neural layer，最後輸出空間估測與控制建議。"/>
             <wp:cNvGraphicFramePr>
               <a:graphicFrameLocks noChangeAspect="1"/>
@@ -2801,7 +2801,7 @@
                   <pic:spPr>
                     <a:xfrm>
                       <a:off x="0" y="0"/>
-                      <a:ext cx="5303520" cy="5303520"/>
+                      <a:ext cx="5303520" cy="3077193"/>
                     </a:xfrm>
                     <a:prstGeom prst="rect">
                       <a:avLst/>
@@ -2832,7 +2832,7 @@
       <w:r>
         <w:drawing>
           <wp:inline distT="0" distB="0" distL="0" distR="0">
-            <wp:extent cx="5943600" cy="5943600"/>
+            <wp:extent cx="5943600" cy="3291681"/>
             <wp:docPr id="2" name="圖 3-2 主要執行資料流。此圖對應一次 runtime request 如何從輸入設定、場估計、校正，到 dashboard 或 MCP 輸出。"/>
             <wp:cNvGraphicFramePr>
               <a:graphicFrameLocks noChangeAspect="1"/>
@@ -2853,7 +2853,7 @@
                   <pic:spPr>
                     <a:xfrm>
                       <a:off x="0" y="0"/>
-                      <a:ext cx="5943600" cy="5943600"/>
+                      <a:ext cx="5943600" cy="3291681"/>
                     </a:xfrm>
                     <a:prstGeom prst="rect">
                       <a:avLst/>
@@ -3118,7 +3118,7 @@
       <w:r>
         <w:drawing>
           <wp:inline distT="0" distB="0" distL="0" distR="0">
-            <wp:extent cx="5943600" cy="5943600"/>
+            <wp:extent cx="5943600" cy="3396342"/>
             <wp:docPr id="3" name="圖 3-3 房間感測器與目標區域配置。8 顆角落感測器、3 個主要區域與 3 個核心裝置共同構成單房間數位孿生的標準拓樸。"/>
             <wp:cNvGraphicFramePr>
               <a:graphicFrameLocks noChangeAspect="1"/>
@@ -3139,7 +3139,7 @@
                   <pic:spPr>
                     <a:xfrm>
                       <a:off x="0" y="0"/>
-                      <a:ext cx="5943600" cy="5943600"/>
+                      <a:ext cx="5943600" cy="3396342"/>
                     </a:xfrm>
                     <a:prstGeom prst="rect">
                       <a:avLst/>
@@ -9029,7 +9029,7 @@
       <w:r>
         <w:drawing>
           <wp:inline distT="0" distB="0" distL="0" distR="0">
-            <wp:extent cx="5303520" cy="5303520"/>
+            <wp:extent cx="5303520" cy="2952538"/>
             <wp:docPr id="4" name="圖 3-4 感測器校正與影響學習流程。此圖說明真值模擬、角落觀測、設備 power calibration、trilinear residual correction，以及 least-squares impact learning 之間的關係。"/>
             <wp:cNvGraphicFramePr>
               <a:graphicFrameLocks noChangeAspect="1"/>
@@ -9050,7 +9050,7 @@
                   <pic:spPr>
                     <a:xfrm>
                       <a:off x="0" y="0"/>
-                      <a:ext cx="5303520" cy="5303520"/>
+                      <a:ext cx="5303520" cy="2952538"/>
                     </a:xfrm>
                     <a:prstGeom prst="rect">
                       <a:avLst/>
@@ -10166,7 +10166,7 @@
       <w:r>
         <w:drawing>
           <wp:inline distT="0" distB="0" distL="0" distR="0">
-            <wp:extent cx="5943600" cy="3301626"/>
+            <wp:extent cx="5943600" cy="3429517"/>
             <wp:docPr id="5" name="圖 3-5 模型學習、推論與推薦資料流。訓練端將原始感測、裝置事件、外部環境與情境資料轉為 scenario state，再分流為 impact learning 與 hybrid residual learning；推論端則使用同一個 scenario state 執行三因子估測，並以反事實模擬排序推薦動作。"/>
             <wp:cNvGraphicFramePr>
               <a:graphicFrameLocks noChangeAspect="1"/>
@@ -10187,7 +10187,7 @@
                   <pic:spPr>
                     <a:xfrm>
                       <a:off x="0" y="0"/>
-                      <a:ext cx="5943600" cy="3301626"/>
+                      <a:ext cx="5943600" cy="3429517"/>
                     </a:xfrm>
                     <a:prstGeom prst="rect">
                       <a:avLst/>
@@ -10765,7 +10765,7 @@
         <w:spacing w:before="0" w:after="0" w:line="360" w:lineRule="auto"/>
       </w:pPr>
       <w:r>
-        <w:t xml:space="preserve">模型訓練完成後，使用者或 MCP client 的輸入不會直接丟進神經網路得到答案，而是先被轉成與訓練階段一致的 scenario state，如圖 3-5 右側所示。接著系統先跑可解釋主模型，再視設定套用 sparse correction 與 hybrid residual，最後才輸出指定點或區域的三因子預測。若使用者要求推薦動作，系統會對每個候選動作建立反事實情境並重跑同一條推論流程，再依 comfort penalty 改善量排序。</w:t>
+        <w:t xml:space="preserve">模型訓練完成後，使用者或 MCP client 的輸入不會直接丟進神經網路得到答案，而是先被轉成與訓練階段一致的 scenario state，如圖 3-5 右側所示。接著系統先跑可解釋主模型，再視設定套用 sparse correction 與 hybrid residual，最後才輸出指定點或區域的三因子預測。推薦動作不是在只有房間狀態時自動產生；系統必須先取得一個決策採樣範圍，也就是單一指定座標的 point sample，或由多個採樣點、目標區域形成的 cluster sample。接著使用者必須給出 temperature、humidity 與 illuminance 三因子的要求與容許範圍。只有 sample scope 與完整三因子目標都存在時，系統才會對候選動作建立反事實情境並排序；若缺少任一項，流程應停在 point / zone prediction，或由工具回報缺少 sample / target，不產生推薦動作。</w:t>
       </w:r>
     </w:p>
     <w:p>
@@ -10774,7 +10774,7 @@
         <w:spacing w:before="0" w:after="0" w:line="360" w:lineRule="auto"/>
       </w:pPr>
       <w:r>
-        <w:t xml:space="preserve">runtime input: baseline + outdoor conditions + devices + furniture + point/target</w:t>
+        <w:t xml:space="preserve">runtime input: baseline + outdoor conditions + devices + furniture + time</w:t>
       </w:r>
     </w:p>
     <w:p>
@@ -10819,7 +10819,25 @@
         <w:spacing w:before="0" w:after="0" w:line="360" w:lineRule="auto"/>
       </w:pPr>
       <w:r>
-        <w:t xml:space="preserve">→ counterfactual actions</w:t>
+        <w:t xml:space="preserve">→ sample scope: point sample or cluster/zone sample</w:t>
+      </w:r>
+    </w:p>
+    <w:p>
+      <w:pPr>
+        <w:pStyle w:val="Code"/>
+        <w:spacing w:before="0" w:after="0" w:line="360" w:lineRule="auto"/>
+      </w:pPr>
+      <w:r>
+        <w:t xml:space="preserve">→ three-factor requirement: target + tolerances for T/H/L</w:t>
+      </w:r>
+    </w:p>
+    <w:p>
+      <w:pPr>
+        <w:pStyle w:val="Code"/>
+        <w:spacing w:before="0" w:after="0" w:line="360" w:lineRule="auto"/>
+      </w:pPr>
+      <w:r>
+        <w:t xml:space="preserve">→ if scope and target are complete: counterfactual actions</w:t>
       </w:r>
     </w:p>
     <w:p>
@@ -10931,7 +10949,7 @@
               <w:spacing w:before="0" w:after="0" w:line="360" w:lineRule="auto"/>
             </w:pPr>
             <w:r>
-              <w:t xml:space="preserve">MCP initialize、web demo、script 或 API 傳入 baseline、外部環境、設備狀態、家具、elapsed/steady-state、查詢座標與目標值。</w:t>
+              <w:t xml:space="preserve">MCP initialize、web demo、script 或 API 傳入 baseline、外部環境、設備狀態、家具與 elapsed/steady-state。</w:t>
             </w:r>
           </w:p>
         </w:tc>
@@ -11134,61 +11152,115 @@
               <w:spacing w:before="0" w:after="0" w:line="360" w:lineRule="auto"/>
             </w:pPr>
             <w:r>
-              <w:t xml:space="preserve">5. Point / zone prediction</w:t>
-            </w:r>
-          </w:p>
-        </w:tc>
-        <w:tc>
-          <w:tcPr>
-            <w:tcW w:w="2200" w:type="dxa"/>
-          </w:tcPr>
-          <w:p>
-            <w:pPr>
-              <w:spacing w:before="0" w:after="0" w:line="360" w:lineRule="auto"/>
-            </w:pPr>
-            <w:r>
-              <w:t xml:space="preserve">指定座標或目標區域。</w:t>
-            </w:r>
-          </w:p>
-        </w:tc>
-        <w:tc>
-          <w:tcPr>
-            <w:tcW w:w="2200" w:type="dxa"/>
-          </w:tcPr>
-          <w:p>
-            <w:pPr>
-              <w:spacing w:before="0" w:after="0" w:line="360" w:lineRule="auto"/>
-            </w:pPr>
-            <w:r>
-              <w:t xml:space="preserve">若是 `sample_point`，直接回傳該點 temperature、humidity、illuminance；若是 zone summary，對區域內採樣點做平均或統計。</w:t>
-            </w:r>
-          </w:p>
-        </w:tc>
-        <w:tc>
-          <w:tcPr>
-            <w:tcW w:w="2200" w:type="dxa"/>
-          </w:tcPr>
-          <w:p>
-            <w:pPr>
-              <w:spacing w:before="0" w:after="0" w:line="360" w:lineRule="auto"/>
-            </w:pPr>
-            <w:r>
-              <w:t xml:space="preserve">預測溫度、濕度、照度與 estimator 狀態。</w:t>
-            </w:r>
-          </w:p>
-        </w:tc>
-      </w:tr>
-      <w:tr>
-        <w:tc>
-          <w:tcPr>
-            <w:tcW w:w="2200" w:type="dxa"/>
-          </w:tcPr>
-          <w:p>
-            <w:pPr>
-              <w:spacing w:before="0" w:after="0" w:line="360" w:lineRule="auto"/>
-            </w:pPr>
-            <w:r>
-              <w:t xml:space="preserve">6. Candidate action simulation</w:t>
+              <w:t xml:space="preserve">5. Point / cluster sample</w:t>
+            </w:r>
+          </w:p>
+        </w:tc>
+        <w:tc>
+          <w:tcPr>
+            <w:tcW w:w="2200" w:type="dxa"/>
+          </w:tcPr>
+          <w:p>
+            <w:pPr>
+              <w:spacing w:before="0" w:after="0" w:line="360" w:lineRule="auto"/>
+            </w:pPr>
+            <w:r>
+              <w:t xml:space="preserve">指定座標、單點 sample，或由多點/目標區域形成的 cluster sample。</w:t>
+            </w:r>
+          </w:p>
+        </w:tc>
+        <w:tc>
+          <w:tcPr>
+            <w:tcW w:w="2200" w:type="dxa"/>
+          </w:tcPr>
+          <w:p>
+            <w:pPr>
+              <w:spacing w:before="0" w:after="0" w:line="360" w:lineRule="auto"/>
+            </w:pPr>
+            <w:r>
+              <w:t xml:space="preserve">若是 `sample_point`，直接回傳該點 temperature、humidity、illuminance；若是 zone / cluster summary，對範圍內採樣點做平均或統計。</w:t>
+            </w:r>
+          </w:p>
+        </w:tc>
+        <w:tc>
+          <w:tcPr>
+            <w:tcW w:w="2200" w:type="dxa"/>
+          </w:tcPr>
+          <w:p>
+            <w:pPr>
+              <w:spacing w:before="0" w:after="0" w:line="360" w:lineRule="auto"/>
+            </w:pPr>
+            <w:r>
+              <w:t xml:space="preserve">目前採樣範圍的 $\mathbf{q}_{\mathrm{base}}=(q_T,q_H,q_L)$ 與 estimator 狀態。</w:t>
+            </w:r>
+          </w:p>
+        </w:tc>
+      </w:tr>
+      <w:tr>
+        <w:tc>
+          <w:tcPr>
+            <w:tcW w:w="2200" w:type="dxa"/>
+          </w:tcPr>
+          <w:p>
+            <w:pPr>
+              <w:spacing w:before="0" w:after="0" w:line="360" w:lineRule="auto"/>
+            </w:pPr>
+            <w:r>
+              <w:t xml:space="preserve">6. Recommendation precondition</w:t>
+            </w:r>
+          </w:p>
+        </w:tc>
+        <w:tc>
+          <w:tcPr>
+            <w:tcW w:w="2200" w:type="dxa"/>
+          </w:tcPr>
+          <w:p>
+            <w:pPr>
+              <w:spacing w:before="0" w:after="0" w:line="360" w:lineRule="auto"/>
+            </w:pPr>
+            <w:r>
+              <w:t xml:space="preserve">sample scope、三因子目標 $g_T,g_H,g_L$、容許範圍 $\delta_T,\delta_H,\delta_L$ 與權重 $w_T,w_H,w_L$。</w:t>
+            </w:r>
+          </w:p>
+        </w:tc>
+        <w:tc>
+          <w:tcPr>
+            <w:tcW w:w="2200" w:type="dxa"/>
+          </w:tcPr>
+          <w:p>
+            <w:pPr>
+              <w:spacing w:before="0" w:after="0" w:line="360" w:lineRule="auto"/>
+            </w:pPr>
+            <w:r>
+              <w:t xml:space="preserve">檢查 sample scope 是否存在，且 temperature、humidity、illuminance 三個目標是否完整；缺少時只回傳估測，不輸出推薦。</w:t>
+            </w:r>
+          </w:p>
+        </w:tc>
+        <w:tc>
+          <w:tcPr>
+            <w:tcW w:w="2200" w:type="dxa"/>
+          </w:tcPr>
+          <w:p>
+            <w:pPr>
+              <w:spacing w:before="0" w:after="0" w:line="360" w:lineRule="auto"/>
+            </w:pPr>
+            <w:r>
+              <w:t xml:space="preserve">`READY_TO_RANK` 或明確缺項錯誤；缺項時沒有 recommendations 輸出。</w:t>
+            </w:r>
+          </w:p>
+        </w:tc>
+      </w:tr>
+      <w:tr>
+        <w:tc>
+          <w:tcPr>
+            <w:tcW w:w="2200" w:type="dxa"/>
+          </w:tcPr>
+          <w:p>
+            <w:pPr>
+              <w:spacing w:before="0" w:after="0" w:line="360" w:lineRule="auto"/>
+            </w:pPr>
+            <w:r>
+              <w:t xml:space="preserve">7. Candidate action simulation</w:t>
             </w:r>
           </w:p>
         </w:tc>
@@ -11214,7 +11286,7 @@
               <w:spacing w:before="0" w:after="0" w:line="360" w:lineRule="auto"/>
             </w:pPr>
             <w:r>
-              <w:t xml:space="preserve">對每個候選動作建立反事實 scenario，把裝置 activation 或 metadata 改成候選狀態，重新執行同一條推論流程。</w:t>
+              <w:t xml:space="preserve">只在 `READY_TO_RANK` 時，對每個候選動作建立反事實 scenario，把裝置 activation 或 metadata 改成候選狀態，重新執行同一條推論流程。</w:t>
             </w:r>
           </w:p>
         </w:tc>
@@ -11242,7 +11314,7 @@
               <w:spacing w:before="0" w:after="0" w:line="360" w:lineRule="auto"/>
             </w:pPr>
             <w:r>
-              <w:t xml:space="preserve">7. Recommendation ranking</w:t>
+              <w:t xml:space="preserve">8. Recommendation ranking</w:t>
             </w:r>
           </w:p>
         </w:tc>
@@ -11292,7 +11364,7 @@
         <w:spacing w:before="0" w:after="0" w:line="360" w:lineRule="auto"/>
       </w:pPr>
       <w:r>
-        <w:t xml:space="preserve">這條推論流程也說明本研究的推薦動作不是規則表，也不是 LLM 直接猜測，而是由同一套數位孿生模型對候選動作做反事實模擬。若排名第一的動作是開冷氣，代表模型預測在目前 baseline、外部環境、家具遮蔽與設備狀態下，開冷氣後目標點或目標區域的 comfort penalty 下降最多；但它仍需 5.8 節的 before/after 介入實驗才能證明真實因果改善。</w:t>
+        <w:t xml:space="preserve">這條推論流程也說明本研究的推薦動作不是規則表，也不是 LLM 直接猜測，而是由同一套數位孿生模型對候選動作做反事實模擬。若排名第一的動作是開冷氣，代表模型預測在目前 baseline、外部環境、家具遮蔽、設備狀態、指定 sample scope 與三因子目標下，開冷氣後該目標點或目標區域的 comfort penalty 下降最多；但它仍需 5.8 節的 before/after 介入實驗才能證明真實因果改善。</w:t>
       </w:r>
     </w:p>
     <w:p>
@@ -11858,23 +11930,23 @@
         <w:spacing w:before="0" w:after="0" w:line="360" w:lineRule="auto"/>
       </w:pPr>
       <w:r>
-        <w:t xml:space="preserve">本研究不做閉環控制，而是對候選控制動作進行排序。系統針對每個候選動作模擬目標區域的三因子值，並依舒適度目標計算改善分數。若房間偏熱，冷氣動作通常獲得較高排序；若照度不足，照明動作通常獲得較高排序。</w:t>
-      </w:r>
-    </w:p>
-    <w:p>
-      <w:pPr>
-        <w:spacing w:before="0" w:after="0" w:line="360" w:lineRule="auto"/>
-      </w:pPr>
-      <w:r>
-        <w:t xml:space="preserve">具體而言，系統先以目前感測資料校正模型，取得目標區域目前三因子估計值並計算 baseline comfort penalty。接著，對每一個候選動作建立反事實情境：例如將冷氣 activation 調至 0.85、開窗至 0.7，或將主要照明調至 0.8，再重新模擬目標區域的溫度、濕度與照度。候選動作分數定義為 baseline penalty 減去動作後預測 penalty，因此分數愈高代表模型預期改善愈大。</w:t>
-      </w:r>
-    </w:p>
-    <w:p>
-      <w:pPr>
-        <w:spacing w:before="0" w:after="0" w:line="360" w:lineRule="auto"/>
-      </w:pPr>
-      <w:r>
-        <w:t xml:space="preserve">comfort penalty 對每個因子使用目標值與容許範圍計算，可寫成：</w:t>
+        <w:t xml:space="preserve">本研究不做閉環控制，而是對候選控制動作進行排序。此排序不是無條件推薦，而是在明確的決策採樣範圍與三因子要求下才被定義。採樣範圍可是一個指定座標 point sample，也可是一組由目標區域或使用者選定點組成的 cluster sample；三因子要求則必須同時包含溫度、濕度與照度的目標值與容許範圍。若缺少採樣範圍或缺少任一環境因子的目標，系統只能回傳估測結果，不應輸出候選動作推薦。</w:t>
+      </w:r>
+    </w:p>
+    <w:p>
+      <w:pPr>
+        <w:spacing w:before="0" w:after="0" w:line="360" w:lineRule="auto"/>
+      </w:pPr>
+      <w:r>
+        <w:t xml:space="preserve">具體而言，系統先以目前感測資料校正模型，取得採樣範圍目前三因子估計值並計算 baseline comfort penalty。若採樣範圍是單點，$K=1$；若是 cluster 或 target zone，則以 $K$ 個空間採樣點的平均代表該範圍。接著，對每一個候選動作建立反事實情境：例如將冷氣 activation 調至 0.85、開窗至 0.7，或將主要照明調至 0.8，再重新模擬該採樣範圍的溫度、濕度與照度。候選動作分數定義為 baseline penalty 減去動作後預測 penalty，因此分數愈高代表模型預期改善愈大。</w:t>
+      </w:r>
+    </w:p>
+    <w:p>
+      <w:pPr>
+        <w:spacing w:before="0" w:after="0" w:line="360" w:lineRule="auto"/>
+      </w:pPr>
+      <w:r>
+        <w:t xml:space="preserve">令決策採樣範圍為：</w:t>
       </w:r>
     </w:p>
     <w:p>
@@ -11884,15 +11956,15 @@
         <w:spacing w:before="0" w:after="0" w:line="360" w:lineRule="auto"/>
       </w:pPr>
       <w:r>
-        <w:t xml:space="preserve">P(\mathbf{q})=\sum_{m\in\{T,H,L\}} w_m \max\left(0,\frac{|q_m-g_m|-\delta_m}{\delta_m}\right)</w:t>
-      </w:r>
-    </w:p>
-    <w:p>
-      <w:pPr>
-        <w:spacing w:before="0" w:after="0" w:line="360" w:lineRule="auto"/>
-      </w:pPr>
-      <w:r>
-        <w:t xml:space="preserve">候選動作 $a$ 的排序分數定義為：</w:t>
+        <w:t xml:space="preserve">S=\{\mathbf{p}_k\}_{k=1}^{K}</w:t>
+      </w:r>
+    </w:p>
+    <w:p>
+      <w:pPr>
+        <w:spacing w:before="0" w:after="0" w:line="360" w:lineRule="auto"/>
+      </w:pPr>
+      <w:r>
+        <w:t xml:space="preserve">在第 $m$ 個環境因素上，採樣範圍的估計值定義為：</w:t>
       </w:r>
     </w:p>
     <w:p>
@@ -11902,7 +11974,61 @@
         <w:spacing w:before="0" w:after="0" w:line="360" w:lineRule="auto"/>
       </w:pPr>
       <w:r>
-        <w:t xml:space="preserve">\mathrm{score}(a)=P(\mathbf{q}_{\mathrm{base}})-P(\mathbf{q}_{a})</w:t>
+        <w:t xml:space="preserve">q_m(S)=\frac{1}{K}\sum_{k=1}^{K}F_m(\mathbf{p}_k,t)</w:t>
+      </w:r>
+    </w:p>
+    <w:p>
+      <w:pPr>
+        <w:spacing w:before="0" w:after="0" w:line="360" w:lineRule="auto"/>
+      </w:pPr>
+      <w:r>
+        <w:t xml:space="preserve">其中 point sample 是 $K=1$ 的特殊情況；cluster sample 或 target zone 則是 $K&gt;1$ 的空間聚合。三因子目標向量與容許範圍分別寫成：</w:t>
+      </w:r>
+    </w:p>
+    <w:p>
+      <w:pPr>
+        <w:jc w:val="center"/>
+        <w:ind w:firstLine="0"/>
+        <w:spacing w:before="0" w:after="0" w:line="360" w:lineRule="auto"/>
+      </w:pPr>
+      <w:r>
+        <w:t xml:space="preserve">\mathbf{g}=(g_T,g_H,g_L),\qquad \boldsymbol{\delta}=(\delta_T,\delta_H,\delta_L)</w:t>
+      </w:r>
+    </w:p>
+    <w:p>
+      <w:pPr>
+        <w:spacing w:before="0" w:after="0" w:line="360" w:lineRule="auto"/>
+      </w:pPr>
+      <w:r>
+        <w:t xml:space="preserve">comfort penalty 對每個因子使用目標值與容許範圍計算，可寫成：</w:t>
+      </w:r>
+    </w:p>
+    <w:p>
+      <w:pPr>
+        <w:jc w:val="center"/>
+        <w:ind w:firstLine="0"/>
+        <w:spacing w:before="0" w:after="0" w:line="360" w:lineRule="auto"/>
+      </w:pPr>
+      <w:r>
+        <w:t xml:space="preserve">P(\mathbf{q}(S))=\sum_{m\in\{T,H,L\}} w_m \max\left(0,\frac{|q_m(S)-g_m|-\delta_m}{\delta_m}\right)</w:t>
+      </w:r>
+    </w:p>
+    <w:p>
+      <w:pPr>
+        <w:spacing w:before="0" w:after="0" w:line="360" w:lineRule="auto"/>
+      </w:pPr>
+      <w:r>
+        <w:t xml:space="preserve">候選動作 $a$ 的排序分數定義為：</w:t>
+      </w:r>
+    </w:p>
+    <w:p>
+      <w:pPr>
+        <w:jc w:val="center"/>
+        <w:ind w:firstLine="0"/>
+        <w:spacing w:before="0" w:after="0" w:line="360" w:lineRule="auto"/>
+      </w:pPr>
+      <w:r>
+        <w:t xml:space="preserve">\mathrm{score}(a)=P(\mathbf{q}_{\mathrm{base}}(S))-P(\mathbf{q}_{a}(S))</w:t>
       </w:r>
     </w:p>
     <w:tbl>
@@ -12017,74 +12143,197 @@
               <w:spacing w:before="0" w:after="0" w:line="360" w:lineRule="auto"/>
             </w:pPr>
             <w:r>
-              <w:t xml:space="preserve">$\mathbf{q}$</w:t>
-            </w:r>
-          </w:p>
-        </w:tc>
-        <w:tc>
-          <w:tcPr>
-            <w:tcW w:w="2200" w:type="dxa"/>
-          </w:tcPr>
-          <w:p>
-            <w:pPr>
-              <w:spacing w:before="0" w:after="0" w:line="360" w:lineRule="auto"/>
-            </w:pPr>
-            <w:r>
-              <w:t xml:space="preserve">目標區域或指定座標的三因子估計向量。</w:t>
-            </w:r>
-          </w:p>
-        </w:tc>
-        <w:tc>
-          <w:tcPr>
-            <w:tcW w:w="2200" w:type="dxa"/>
-          </w:tcPr>
-          <w:p>
-            <w:pPr>
-              <w:spacing w:before="0" w:after="0" w:line="360" w:lineRule="auto"/>
-            </w:pPr>
-            <w:r>
-              <w:t xml:space="preserve">可寫成 $(q_T,q_H,q_L)$。</w:t>
-            </w:r>
-          </w:p>
-        </w:tc>
-      </w:tr>
-      <w:tr>
-        <w:tc>
-          <w:tcPr>
-            <w:tcW w:w="2200" w:type="dxa"/>
-          </w:tcPr>
-          <w:p>
-            <w:pPr>
-              <w:spacing w:before="0" w:after="0" w:line="360" w:lineRule="auto"/>
-            </w:pPr>
-            <w:r>
-              <w:t xml:space="preserve">$q_m$</w:t>
-            </w:r>
-          </w:p>
-        </w:tc>
-        <w:tc>
-          <w:tcPr>
-            <w:tcW w:w="2200" w:type="dxa"/>
-          </w:tcPr>
-          <w:p>
-            <w:pPr>
-              <w:spacing w:before="0" w:after="0" w:line="360" w:lineRule="auto"/>
-            </w:pPr>
-            <w:r>
-              <w:t xml:space="preserve">目標點或目標區域中第 $m$ 個環境因素的估計值。</w:t>
-            </w:r>
-          </w:p>
-        </w:tc>
-        <w:tc>
-          <w:tcPr>
-            <w:tcW w:w="2200" w:type="dxa"/>
-          </w:tcPr>
-          <w:p>
-            <w:pPr>
-              <w:spacing w:before="0" w:after="0" w:line="360" w:lineRule="auto"/>
-            </w:pPr>
-            <w:r>
-              <w:t xml:space="preserve">由目前模型或反事實動作模擬得到。</w:t>
+              <w:t xml:space="preserve">$S$</w:t>
+            </w:r>
+          </w:p>
+        </w:tc>
+        <w:tc>
+          <w:tcPr>
+            <w:tcW w:w="2200" w:type="dxa"/>
+          </w:tcPr>
+          <w:p>
+            <w:pPr>
+              <w:spacing w:before="0" w:after="0" w:line="360" w:lineRule="auto"/>
+            </w:pPr>
+            <w:r>
+              <w:t xml:space="preserve">推薦排序使用的決策採樣範圍。</w:t>
+            </w:r>
+          </w:p>
+        </w:tc>
+        <w:tc>
+          <w:tcPr>
+            <w:tcW w:w="2200" w:type="dxa"/>
+          </w:tcPr>
+          <w:p>
+            <w:pPr>
+              <w:spacing w:before="0" w:after="0" w:line="360" w:lineRule="auto"/>
+            </w:pPr>
+            <w:r>
+              <w:t xml:space="preserve">可為單一 point sample，也可為 cluster sample 或 target zone。</w:t>
+            </w:r>
+          </w:p>
+        </w:tc>
+      </w:tr>
+      <w:tr>
+        <w:tc>
+          <w:tcPr>
+            <w:tcW w:w="2200" w:type="dxa"/>
+          </w:tcPr>
+          <w:p>
+            <w:pPr>
+              <w:spacing w:before="0" w:after="0" w:line="360" w:lineRule="auto"/>
+            </w:pPr>
+            <w:r>
+              <w:t xml:space="preserve">$K$</w:t>
+            </w:r>
+          </w:p>
+        </w:tc>
+        <w:tc>
+          <w:tcPr>
+            <w:tcW w:w="2200" w:type="dxa"/>
+          </w:tcPr>
+          <w:p>
+            <w:pPr>
+              <w:spacing w:before="0" w:after="0" w:line="360" w:lineRule="auto"/>
+            </w:pPr>
+            <w:r>
+              <w:t xml:space="preserve">採樣範圍中的點數。</w:t>
+            </w:r>
+          </w:p>
+        </w:tc>
+        <w:tc>
+          <w:tcPr>
+            <w:tcW w:w="2200" w:type="dxa"/>
+          </w:tcPr>
+          <w:p>
+            <w:pPr>
+              <w:spacing w:before="0" w:after="0" w:line="360" w:lineRule="auto"/>
+            </w:pPr>
+            <w:r>
+              <w:t xml:space="preserve">$K=1$ 代表單點；$K&gt;1$ 代表區域或群集平均。</w:t>
+            </w:r>
+          </w:p>
+        </w:tc>
+      </w:tr>
+      <w:tr>
+        <w:tc>
+          <w:tcPr>
+            <w:tcW w:w="2200" w:type="dxa"/>
+          </w:tcPr>
+          <w:p>
+            <w:pPr>
+              <w:spacing w:before="0" w:after="0" w:line="360" w:lineRule="auto"/>
+            </w:pPr>
+            <w:r>
+              <w:t xml:space="preserve">$\mathbf{p}_k$</w:t>
+            </w:r>
+          </w:p>
+        </w:tc>
+        <w:tc>
+          <w:tcPr>
+            <w:tcW w:w="2200" w:type="dxa"/>
+          </w:tcPr>
+          <w:p>
+            <w:pPr>
+              <w:spacing w:before="0" w:after="0" w:line="360" w:lineRule="auto"/>
+            </w:pPr>
+            <w:r>
+              <w:t xml:space="preserve">採樣範圍中的第 $k$ 個座標點。</w:t>
+            </w:r>
+          </w:p>
+        </w:tc>
+        <w:tc>
+          <w:tcPr>
+            <w:tcW w:w="2200" w:type="dxa"/>
+          </w:tcPr>
+          <w:p>
+            <w:pPr>
+              <w:spacing w:before="0" w:after="0" w:line="360" w:lineRule="auto"/>
+            </w:pPr>
+            <w:r>
+              <w:t xml:space="preserve">每個點都在同一個房間座標系中。</w:t>
+            </w:r>
+          </w:p>
+        </w:tc>
+      </w:tr>
+      <w:tr>
+        <w:tc>
+          <w:tcPr>
+            <w:tcW w:w="2200" w:type="dxa"/>
+          </w:tcPr>
+          <w:p>
+            <w:pPr>
+              <w:spacing w:before="0" w:after="0" w:line="360" w:lineRule="auto"/>
+            </w:pPr>
+            <w:r>
+              <w:t xml:space="preserve">$\mathbf{q}(S)$</w:t>
+            </w:r>
+          </w:p>
+        </w:tc>
+        <w:tc>
+          <w:tcPr>
+            <w:tcW w:w="2200" w:type="dxa"/>
+          </w:tcPr>
+          <w:p>
+            <w:pPr>
+              <w:spacing w:before="0" w:after="0" w:line="360" w:lineRule="auto"/>
+            </w:pPr>
+            <w:r>
+              <w:t xml:space="preserve">由採樣範圍 $S$ 聚合出的三因子估計向量。</w:t>
+            </w:r>
+          </w:p>
+        </w:tc>
+        <w:tc>
+          <w:tcPr>
+            <w:tcW w:w="2200" w:type="dxa"/>
+          </w:tcPr>
+          <w:p>
+            <w:pPr>
+              <w:spacing w:before="0" w:after="0" w:line="360" w:lineRule="auto"/>
+            </w:pPr>
+            <w:r>
+              <w:t xml:space="preserve">可寫成 $(q_T(S),q_H(S),q_L(S))$。</w:t>
+            </w:r>
+          </w:p>
+        </w:tc>
+      </w:tr>
+      <w:tr>
+        <w:tc>
+          <w:tcPr>
+            <w:tcW w:w="2200" w:type="dxa"/>
+          </w:tcPr>
+          <w:p>
+            <w:pPr>
+              <w:spacing w:before="0" w:after="0" w:line="360" w:lineRule="auto"/>
+            </w:pPr>
+            <w:r>
+              <w:t xml:space="preserve">$q_m(S)$</w:t>
+            </w:r>
+          </w:p>
+        </w:tc>
+        <w:tc>
+          <w:tcPr>
+            <w:tcW w:w="2200" w:type="dxa"/>
+          </w:tcPr>
+          <w:p>
+            <w:pPr>
+              <w:spacing w:before="0" w:after="0" w:line="360" w:lineRule="auto"/>
+            </w:pPr>
+            <w:r>
+              <w:t xml:space="preserve">採樣範圍中第 $m$ 個環境因素的估計值。</w:t>
+            </w:r>
+          </w:p>
+        </w:tc>
+        <w:tc>
+          <w:tcPr>
+            <w:tcW w:w="2200" w:type="dxa"/>
+          </w:tcPr>
+          <w:p>
+            <w:pPr>
+              <w:spacing w:before="0" w:after="0" w:line="360" w:lineRule="auto"/>
+            </w:pPr>
+            <w:r>
+              <w:t xml:space="preserve">由目前模型或反事實動作模擬後對 $S$ 聚合得到。</w:t>
             </w:r>
           </w:p>
         </w:tc>
@@ -12222,61 +12471,61 @@
               <w:spacing w:before="0" w:after="0" w:line="360" w:lineRule="auto"/>
             </w:pPr>
             <w:r>
-              <w:t xml:space="preserve">$P(\mathbf{q})$</w:t>
-            </w:r>
-          </w:p>
-        </w:tc>
-        <w:tc>
-          <w:tcPr>
-            <w:tcW w:w="2200" w:type="dxa"/>
-          </w:tcPr>
-          <w:p>
-            <w:pPr>
-              <w:spacing w:before="0" w:after="0" w:line="360" w:lineRule="auto"/>
-            </w:pPr>
-            <w:r>
-              <w:t xml:space="preserve">comfort penalty。</w:t>
-            </w:r>
-          </w:p>
-        </w:tc>
-        <w:tc>
-          <w:tcPr>
-            <w:tcW w:w="2200" w:type="dxa"/>
-          </w:tcPr>
-          <w:p>
-            <w:pPr>
-              <w:spacing w:before="0" w:after="0" w:line="360" w:lineRule="auto"/>
-            </w:pPr>
-            <w:r>
-              <w:t xml:space="preserve">值越小表示越接近舒適目標。</w:t>
-            </w:r>
-          </w:p>
-        </w:tc>
-      </w:tr>
-      <w:tr>
-        <w:tc>
-          <w:tcPr>
-            <w:tcW w:w="2200" w:type="dxa"/>
-          </w:tcPr>
-          <w:p>
-            <w:pPr>
-              <w:spacing w:before="0" w:after="0" w:line="360" w:lineRule="auto"/>
-            </w:pPr>
-            <w:r>
-              <w:t xml:space="preserve">$\mathbf{q}_{\mathrm{base}}$</w:t>
-            </w:r>
-          </w:p>
-        </w:tc>
-        <w:tc>
-          <w:tcPr>
-            <w:tcW w:w="2200" w:type="dxa"/>
-          </w:tcPr>
-          <w:p>
-            <w:pPr>
-              <w:spacing w:before="0" w:after="0" w:line="360" w:lineRule="auto"/>
-            </w:pPr>
-            <w:r>
-              <w:t xml:space="preserve">尚未套用候選動作時的目前狀態估計。</w:t>
+              <w:t xml:space="preserve">$P(\mathbf{q}(S))$</w:t>
+            </w:r>
+          </w:p>
+        </w:tc>
+        <w:tc>
+          <w:tcPr>
+            <w:tcW w:w="2200" w:type="dxa"/>
+          </w:tcPr>
+          <w:p>
+            <w:pPr>
+              <w:spacing w:before="0" w:after="0" w:line="360" w:lineRule="auto"/>
+            </w:pPr>
+            <w:r>
+              <w:t xml:space="preserve">採樣範圍 $S$ 的 comfort penalty。</w:t>
+            </w:r>
+          </w:p>
+        </w:tc>
+        <w:tc>
+          <w:tcPr>
+            <w:tcW w:w="2200" w:type="dxa"/>
+          </w:tcPr>
+          <w:p>
+            <w:pPr>
+              <w:spacing w:before="0" w:after="0" w:line="360" w:lineRule="auto"/>
+            </w:pPr>
+            <w:r>
+              <w:t xml:space="preserve">值越小表示該點或群集越接近舒適目標。</w:t>
+            </w:r>
+          </w:p>
+        </w:tc>
+      </w:tr>
+      <w:tr>
+        <w:tc>
+          <w:tcPr>
+            <w:tcW w:w="2200" w:type="dxa"/>
+          </w:tcPr>
+          <w:p>
+            <w:pPr>
+              <w:spacing w:before="0" w:after="0" w:line="360" w:lineRule="auto"/>
+            </w:pPr>
+            <w:r>
+              <w:t xml:space="preserve">$\mathbf{q}_{\mathrm{base}}(S)$</w:t>
+            </w:r>
+          </w:p>
+        </w:tc>
+        <w:tc>
+          <w:tcPr>
+            <w:tcW w:w="2200" w:type="dxa"/>
+          </w:tcPr>
+          <w:p>
+            <w:pPr>
+              <w:spacing w:before="0" w:after="0" w:line="360" w:lineRule="auto"/>
+            </w:pPr>
+            <w:r>
+              <w:t xml:space="preserve">尚未套用候選動作時，採樣範圍 $S$ 的目前狀態估計。</w:t>
             </w:r>
           </w:p>
         </w:tc>
@@ -12304,20 +12553,20 @@
               <w:spacing w:before="0" w:after="0" w:line="360" w:lineRule="auto"/>
             </w:pPr>
             <w:r>
-              <w:t xml:space="preserve">$\mathbf{q}_a$</w:t>
-            </w:r>
-          </w:p>
-        </w:tc>
-        <w:tc>
-          <w:tcPr>
-            <w:tcW w:w="2200" w:type="dxa"/>
-          </w:tcPr>
-          <w:p>
-            <w:pPr>
-              <w:spacing w:before="0" w:after="0" w:line="360" w:lineRule="auto"/>
-            </w:pPr>
-            <w:r>
-              <w:t xml:space="preserve">套用候選動作 $a$ 後的反事實估計。</w:t>
+              <w:t xml:space="preserve">$\mathbf{q}_a(S)$</w:t>
+            </w:r>
+          </w:p>
+        </w:tc>
+        <w:tc>
+          <w:tcPr>
+            <w:tcW w:w="2200" w:type="dxa"/>
+          </w:tcPr>
+          <w:p>
+            <w:pPr>
+              <w:spacing w:before="0" w:after="0" w:line="360" w:lineRule="auto"/>
+            </w:pPr>
+            <w:r>
+              <w:t xml:space="preserve">套用候選動作 $a$ 後，採樣範圍 $S$ 的反事實估計。</w:t>
             </w:r>
           </w:p>
         </w:tc>
@@ -12382,7 +12631,7 @@
         <w:spacing w:before="0" w:after="0" w:line="360" w:lineRule="auto"/>
       </w:pPr>
       <w:r>
-        <w:t xml:space="preserve">若預測值落在容許範圍內，該因子 penalty 為 0；若超出容許範圍，則以超出量除以容許範圍後乘上對應權重。此設計避免微小偏差被過度懲罰，也使不同量綱的溫度、濕度與照度可被加總。需要注意的是，這裡的推薦排序屬於 model-based counterfactual simulation，並不等同於已完成實際控制驗證。</w:t>
+        <w:t xml:space="preserve">若預測值落在容許範圍內，該因子 penalty 為 0；若超出容許範圍，則以超出量除以容許範圍後乘上對應權重。此設計避免微小偏差被過度懲罰，也使不同量綱的溫度、濕度與照度可被加總。需要注意的是，這裡的推薦排序屬於 model-based counterfactual simulation，並不等同於已完成實際控制驗證；而且在數學上只有當 $S$、$\mathbf{g}$ 與 $\boldsymbol{\delta}$ 都完整時才有定義。</w:t>
       </w:r>
     </w:p>
     <w:p>
@@ -13562,7 +13811,7 @@
         <w:spacing w:before="0" w:after="0" w:line="360" w:lineRule="auto"/>
       </w:pPr>
       <w:r>
-        <w:t xml:space="preserve">• rank_actions：輸入指定座標與目標三因子值，根據目前註冊設備產生候選操作並依 comfort penalty 改善量排序。</w:t>
+        <w:t xml:space="preserve">• rank_actions：輸入指定座標 sample 與完整目標三因子值，根據目前註冊設備產生候選操作並依 comfort penalty 改善量排序；缺少 sample 或任一三因子目標時不產生推薦。</w:t>
       </w:r>
     </w:p>
     <w:p>
@@ -15389,7 +15638,7 @@
       <w:r>
         <w:drawing>
           <wp:inline distT="0" distB="0" distL="0" distR="0">
-            <wp:extent cx="5303520" cy="5303520"/>
+            <wp:extent cx="5303520" cy="2900267"/>
             <wp:docPr id="6" name="圖 5-1 驗證與實驗流程。此圖說明標準情境如何經由 truth adjustment、合成觀測、校正估測、baseline 比較與輸出摘要，形成第五章的實驗結果。"/>
             <wp:cNvGraphicFramePr>
               <a:graphicFrameLocks noChangeAspect="1"/>
@@ -15410,7 +15659,7 @@
                   <pic:spPr>
                     <a:xfrm>
                       <a:off x="0" y="0"/>
-                      <a:ext cx="5303520" cy="5303520"/>
+                      <a:ext cx="5303520" cy="2900267"/>
                     </a:xfrm>
                     <a:prstGeom prst="rect">
                       <a:avLst/>
@@ -24145,7 +24394,7 @@
         <w:spacing w:before="0" w:after="0" w:line="360" w:lineRule="auto"/>
       </w:pPr>
       <w:r>
-        <w:t xml:space="preserve">此外，本研究將模型封裝為 MCP server，並提供 Gemma/Ollama bridge 與 web demo，使數位孿生不只是離線模擬程式，而是可被 AI client 或使用者互動查詢的工具化系統。整體成果符合研究目標：在有限感測器與非連網裝置條件下，學習裝置對空間環境的影響，並用於更可解釋的控制動作推薦排序。</w:t>
+        <w:t xml:space="preserve">此外，本研究將模型封裝為 MCP server，並提供 Gemma/Ollama bridge 與 web demo，使數位孿生不只是離線模擬程式，而是可被 AI client 或使用者互動查詢的工具化系統。整體成果符合研究目標：在有限感測器與非連網裝置條件下，學習裝置對空間環境的影響，並在 sample scope 與三因子目標明確時用於更可解釋的控制動作推薦排序。</w:t>
       </w:r>
     </w:p>
     <w:p>
@@ -24177,7 +24426,7 @@
         <w:spacing w:before="0" w:after="0" w:line="360" w:lineRule="auto"/>
       </w:pPr>
       <w:r>
-        <w:t xml:space="preserve">對推薦動作而言，本研究目前完成的是模型導向的反事實排序與驗證方法設計，而非真實閉環控制。實際因果驗證應以介入前後量測為準，檢查排名第一的動作是否帶來正的 actual improvement，並比較 predicted improvement 與 measured improvement 是否一致。</w:t>
+        <w:t xml:space="preserve">對推薦動作而言，本研究目前完成的是模型導向的反事實排序與驗證方法設計，而非真實閉環控制。推薦前必須先指定 point/cluster sample 與完整溫度、濕度、照度目標；實際因果驗證應以介入前後量測為準，檢查排名第一的動作是否帶來正的 actual improvement，並比較 predicted improvement 與 measured improvement 是否一致。</w:t>
       </w:r>
     </w:p>
     <w:p>
@@ -24261,7 +24510,7 @@
         <w:spacing w:before="0" w:after="0" w:line="360" w:lineRule="auto"/>
       </w:pPr>
       <w:r>
-        <w:t xml:space="preserve">• 控制功能目前為推薦排序，尚未完成真實介入式因果驗證，也尚未進入自動閉環控制。</w:t>
+        <w:t xml:space="preserve">• 控制功能目前為具前置條件的推薦排序：必須先有 point/cluster sample 與三因子目標，且尚未完成真實介入式因果驗證，也尚未進入自動閉環控制。</w:t>
       </w:r>
     </w:p>
     <w:p>
@@ -24327,7 +24576,7 @@
         <w:spacing w:before="0" w:after="0" w:line="360" w:lineRule="auto"/>
       </w:pPr>
       <w:r>
-        <w:t xml:space="preserve">• 依 before/after 介入驗證方法實測推薦動作，量化 actual improvement、success rate 與 top-1 regret。</w:t>
+        <w:t xml:space="preserve">• 依 before/after 介入驗證方法實測推薦動作，先固定 point/cluster sample 與三因子目標，再量化 actual improvement、success rate 與 top-1 regret。</w:t>
       </w:r>
     </w:p>
     <w:p>
@@ -25571,6 +25820,90 @@
             </w:pPr>
             <w:r>
               <w:t xml:space="preserve">不使用季節/天氣/時段 preset，而是直接輸入外部溫度、濕度、日照與開窗比例進行模擬。</w:t>
+            </w:r>
+          </w:p>
+        </w:tc>
+      </w:tr>
+      <w:tr>
+        <w:tc>
+          <w:tcPr>
+            <w:tcW w:w="2200" w:type="dxa"/>
+          </w:tcPr>
+          <w:p>
+            <w:pPr>
+              <w:spacing w:before="0" w:after="0" w:line="360" w:lineRule="auto"/>
+            </w:pPr>
+            <w:r>
+              <w:t xml:space="preserve">Point Sample</w:t>
+            </w:r>
+          </w:p>
+        </w:tc>
+        <w:tc>
+          <w:tcPr>
+            <w:tcW w:w="2200" w:type="dxa"/>
+          </w:tcPr>
+          <w:p>
+            <w:pPr>
+              <w:spacing w:before="0" w:after="0" w:line="360" w:lineRule="auto"/>
+            </w:pPr>
+            <w:r>
+              <w:t xml:space="preserve">推薦或查詢使用的單一指定座標樣本；若只查估測值，不需要目標；若要推薦動作，還必須提供完整三因子目標。</w:t>
+            </w:r>
+          </w:p>
+        </w:tc>
+      </w:tr>
+      <w:tr>
+        <w:tc>
+          <w:tcPr>
+            <w:tcW w:w="2200" w:type="dxa"/>
+          </w:tcPr>
+          <w:p>
+            <w:pPr>
+              <w:spacing w:before="0" w:after="0" w:line="360" w:lineRule="auto"/>
+            </w:pPr>
+            <w:r>
+              <w:t xml:space="preserve">Cluster Sample</w:t>
+            </w:r>
+          </w:p>
+        </w:tc>
+        <w:tc>
+          <w:tcPr>
+            <w:tcW w:w="2200" w:type="dxa"/>
+          </w:tcPr>
+          <w:p>
+            <w:pPr>
+              <w:spacing w:before="0" w:after="0" w:line="360" w:lineRule="auto"/>
+            </w:pPr>
+            <w:r>
+              <w:t xml:space="preserve">由多個座標點或 target zone 組成的採樣範圍；推薦排序會先聚合此範圍的溫度、濕度與照度，再計算 comfort penalty。</w:t>
+            </w:r>
+          </w:p>
+        </w:tc>
+      </w:tr>
+      <w:tr>
+        <w:tc>
+          <w:tcPr>
+            <w:tcW w:w="2200" w:type="dxa"/>
+          </w:tcPr>
+          <w:p>
+            <w:pPr>
+              <w:spacing w:before="0" w:after="0" w:line="360" w:lineRule="auto"/>
+            </w:pPr>
+            <w:r>
+              <w:t xml:space="preserve">Recommendation Preconditions</w:t>
+            </w:r>
+          </w:p>
+        </w:tc>
+        <w:tc>
+          <w:tcPr>
+            <w:tcW w:w="2200" w:type="dxa"/>
+          </w:tcPr>
+          <w:p>
+            <w:pPr>
+              <w:spacing w:before="0" w:after="0" w:line="360" w:lineRule="auto"/>
+            </w:pPr>
+            <w:r>
+              <w:t xml:space="preserve">推薦動作的必要前置條件：sample scope 必須存在，且 temperature、humidity、illuminance 三因子的目標與容許範圍必須可定義；缺少時不產生推薦。</w:t>
             </w:r>
           </w:p>
         </w:tc>

</xml_diff>